<commit_message>
Modo de prueba sin Docker (SQLite) para Windows, respaldo HTML sin WeasyPrint y guía de puesta en producción
- INICIAR/DETENER-SIN-DOCKER.bat: instalan Python y Node con winget, usan SQLite y abren el sistema
- Si WeasyPrint no encuentra pango, los documentos se guardan como HTML imprimible
- Soporte SQLite en archivo (crear tablas al iniciar y en seeds)
- docs/PUESTA_EN_PRODUCCION.md y secciones nuevas en la guía para principiantes

Co-Authored-By: Claude Sonnet 5.5 <noreply@anthropic.com>
Claude-Session: https://claude.ai/code/session_01MYLY6nn23NgZLc9y6Vzcaj
</commit_message>
<xml_diff>
--- a/sicom-muni/docs/GUIA_PRUEBA_PARA_PRINCIPIANTES.docx
+++ b/sicom-muni/docs/GUIA_PRUEBA_PARA_PRINCIPIANTES.docx
@@ -2495,6 +2495,1493 @@
         <w:rPr>
           <w:rFonts w:ascii="Calibri" w:cs="Calibri" w:eastAsia="Calibri" w:hAnsi="Calibri"/>
         </w:rPr>
+        <w:t xml:space="preserve">ALTERNATIVA — Probar sin Docker</w:t>
+      </w:r>
+    </w:p>
+    <w:p>
+      <w:pPr>
+        <w:spacing w:after="120"/>
+      </w:pPr>
+      <w:r>
+        <w:rPr>
+          <w:rFonts w:ascii="Calibri" w:cs="Calibri" w:eastAsia="Calibri" w:hAnsi="Calibri"/>
+        </w:rPr>
+        <w:t xml:space="preserve">Use esta opción </w:t>
+      </w:r>
+      <w:r>
+        <w:rPr>
+          <w:rFonts w:ascii="Calibri" w:cs="Calibri" w:eastAsia="Calibri" w:hAnsi="Calibri"/>
+          <w:b/>
+          <w:bCs/>
+        </w:rPr>
+        <w:t xml:space="preserve">si Docker no funciona en su computador</w:t>
+      </w:r>
+      <w:r>
+        <w:rPr>
+          <w:rFonts w:ascii="Calibri" w:cs="Calibri" w:eastAsia="Calibri" w:hAnsi="Calibri"/>
+        </w:rPr>
+        <w:t xml:space="preserve"> (por ejemplo el error «Virtual Machine Platform not enabled» o «No virtualization available»). Es </w:t>
+      </w:r>
+      <w:r>
+        <w:rPr>
+          <w:rFonts w:ascii="Calibri" w:cs="Calibri" w:eastAsia="Calibri" w:hAnsi="Calibri"/>
+          <w:b/>
+          <w:bCs/>
+        </w:rPr>
+        <w:t xml:space="preserve">solo para pruebas</w:t>
+      </w:r>
+      <w:r>
+        <w:rPr>
+          <w:rFonts w:ascii="Calibri" w:cs="Calibri" w:eastAsia="Calibri" w:hAnsi="Calibri"/>
+        </w:rPr>
+        <w:t xml:space="preserve">: los datos se guardan en un archivo dentro de la carpeta y no tiene toda la protección de un servidor oficial.</w:t>
+      </w:r>
+    </w:p>
+    <w:p>
+      <w:pPr>
+        <w:pStyle w:val="Heading2"/>
+      </w:pPr>
+      <w:r>
+        <w:rPr>
+          <w:rFonts w:ascii="Calibri" w:cs="Calibri" w:eastAsia="Calibri" w:hAnsi="Calibri"/>
+        </w:rPr>
+        <w:t xml:space="preserve">Qué hace por usted</w:t>
+      </w:r>
+    </w:p>
+    <w:p>
+      <w:pPr>
+        <w:pStyle w:val="ListParagraph"/>
+        <w:numPr>
+          <w:ilvl w:val="0"/>
+          <w:numId w:val="2"/>
+        </w:numPr>
+        <w:spacing w:after="60"/>
+      </w:pPr>
+      <w:r>
+        <w:rPr>
+          <w:rFonts w:ascii="Calibri" w:cs="Calibri" w:eastAsia="Calibri" w:hAnsi="Calibri"/>
+        </w:rPr>
+        <w:t xml:space="preserve">Instala </w:t>
+      </w:r>
+      <w:r>
+        <w:rPr>
+          <w:rFonts w:ascii="Calibri" w:cs="Calibri" w:eastAsia="Calibri" w:hAnsi="Calibri"/>
+          <w:b/>
+          <w:bCs/>
+        </w:rPr>
+        <w:t xml:space="preserve">Python</w:t>
+      </w:r>
+      <w:r>
+        <w:rPr>
+          <w:rFonts w:ascii="Calibri" w:cs="Calibri" w:eastAsia="Calibri" w:hAnsi="Calibri"/>
+        </w:rPr>
+        <w:t xml:space="preserve"> y </w:t>
+      </w:r>
+      <w:r>
+        <w:rPr>
+          <w:rFonts w:ascii="Calibri" w:cs="Calibri" w:eastAsia="Calibri" w:hAnsi="Calibri"/>
+          <w:b/>
+          <w:bCs/>
+        </w:rPr>
+        <w:t xml:space="preserve">Node.js</w:t>
+      </w:r>
+      <w:r>
+        <w:rPr>
+          <w:rFonts w:ascii="Calibri" w:cs="Calibri" w:eastAsia="Calibri" w:hAnsi="Calibri"/>
+        </w:rPr>
+        <w:t xml:space="preserve"> si no los tiene (los descarga con Windows, usando el programa «winget»).</w:t>
+      </w:r>
+    </w:p>
+    <w:p>
+      <w:pPr>
+        <w:pStyle w:val="ListParagraph"/>
+        <w:numPr>
+          <w:ilvl w:val="0"/>
+          <w:numId w:val="2"/>
+        </w:numPr>
+        <w:spacing w:after="60"/>
+      </w:pPr>
+      <w:r>
+        <w:rPr>
+          <w:rFonts w:ascii="Calibri" w:cs="Calibri" w:eastAsia="Calibri" w:hAnsi="Calibri"/>
+        </w:rPr>
+        <w:t xml:space="preserve">Prepara el sistema y crea una base de datos de prueba con los usuarios de demostración.</w:t>
+      </w:r>
+    </w:p>
+    <w:p>
+      <w:pPr>
+        <w:pStyle w:val="ListParagraph"/>
+        <w:numPr>
+          <w:ilvl w:val="0"/>
+          <w:numId w:val="2"/>
+        </w:numPr>
+        <w:spacing w:after="60"/>
+      </w:pPr>
+      <w:r>
+        <w:rPr>
+          <w:rFonts w:ascii="Calibri" w:cs="Calibri" w:eastAsia="Calibri" w:hAnsi="Calibri"/>
+        </w:rPr>
+        <w:t xml:space="preserve">Lo enciende y abre el navegador en </w:t>
+      </w:r>
+      <w:r>
+        <w:rPr>
+          <w:rFonts w:ascii="Consolas" w:cs="Consolas" w:eastAsia="Consolas" w:hAnsi="Consolas"/>
+          <w:color w:val="7A1F1F"/>
+          <w:sz w:val="20"/>
+          <w:szCs w:val="20"/>
+        </w:rPr>
+        <w:t xml:space="preserve">http://localhost:3000</w:t>
+      </w:r>
+      <w:r>
+        <w:rPr>
+          <w:rFonts w:ascii="Calibri" w:cs="Calibri" w:eastAsia="Calibri" w:hAnsi="Calibri"/>
+        </w:rPr>
+        <w:t xml:space="preserve">.</w:t>
+      </w:r>
+    </w:p>
+    <w:p>
+      <w:pPr>
+        <w:pStyle w:val="Heading2"/>
+      </w:pPr>
+      <w:r>
+        <w:rPr>
+          <w:rFonts w:ascii="Calibri" w:cs="Calibri" w:eastAsia="Calibri" w:hAnsi="Calibri"/>
+        </w:rPr>
+        <w:t xml:space="preserve">Paso a paso</w:t>
+      </w:r>
+    </w:p>
+    <w:p>
+      <w:pPr>
+        <w:pStyle w:val="ListParagraph"/>
+        <w:numPr>
+          <w:ilvl w:val="0"/>
+          <w:numId w:val="6"/>
+        </w:numPr>
+        <w:spacing w:after="80"/>
+      </w:pPr>
+      <w:r>
+        <w:rPr>
+          <w:rFonts w:ascii="Calibri" w:cs="Calibri" w:eastAsia="Calibri" w:hAnsi="Calibri"/>
+        </w:rPr>
+        <w:t xml:space="preserve">Descargue y extraiga el sistema como en el </w:t>
+      </w:r>
+      <w:r>
+        <w:rPr>
+          <w:rFonts w:ascii="Calibri" w:cs="Calibri" w:eastAsia="Calibri" w:hAnsi="Calibri"/>
+          <w:b/>
+          <w:bCs/>
+        </w:rPr>
+        <w:t xml:space="preserve">Paso 1.2</w:t>
+      </w:r>
+      <w:r>
+        <w:rPr>
+          <w:rFonts w:ascii="Calibri" w:cs="Calibri" w:eastAsia="Calibri" w:hAnsi="Calibri"/>
+        </w:rPr>
+        <w:t xml:space="preserve"> de esta guía (carpeta </w:t>
+      </w:r>
+      <w:r>
+        <w:rPr>
+          <w:rFonts w:ascii="Consolas" w:cs="Consolas" w:eastAsia="Consolas" w:hAnsi="Consolas"/>
+          <w:color w:val="7A1F1F"/>
+          <w:sz w:val="20"/>
+          <w:szCs w:val="20"/>
+        </w:rPr>
+        <w:t xml:space="preserve">C:\SICOM</w:t>
+      </w:r>
+      <w:r>
+        <w:rPr>
+          <w:rFonts w:ascii="Calibri" w:cs="Calibri" w:eastAsia="Calibri" w:hAnsi="Calibri"/>
+        </w:rPr>
+        <w:t xml:space="preserve">, luego </w:t>
+      </w:r>
+      <w:r>
+        <w:rPr>
+          <w:rFonts w:ascii="Consolas" w:cs="Consolas" w:eastAsia="Consolas" w:hAnsi="Consolas"/>
+          <w:color w:val="7A1F1F"/>
+          <w:sz w:val="20"/>
+          <w:szCs w:val="20"/>
+        </w:rPr>
+        <w:t xml:space="preserve">sicom-muni</w:t>
+      </w:r>
+      <w:r>
+        <w:rPr>
+          <w:rFonts w:ascii="Calibri" w:cs="Calibri" w:eastAsia="Calibri" w:hAnsi="Calibri"/>
+        </w:rPr>
+        <w:t xml:space="preserve">). (No necesita Docker.)</w:t>
+      </w:r>
+    </w:p>
+    <w:p>
+      <w:pPr>
+        <w:pStyle w:val="ListParagraph"/>
+        <w:numPr>
+          <w:ilvl w:val="0"/>
+          <w:numId w:val="6"/>
+        </w:numPr>
+        <w:spacing w:after="80"/>
+      </w:pPr>
+      <w:r>
+        <w:rPr>
+          <w:rFonts w:ascii="Calibri" w:cs="Calibri" w:eastAsia="Calibri" w:hAnsi="Calibri"/>
+        </w:rPr>
+        <w:t xml:space="preserve">En la carpeta </w:t>
+      </w:r>
+      <w:r>
+        <w:rPr>
+          <w:rFonts w:ascii="Consolas" w:cs="Consolas" w:eastAsia="Consolas" w:hAnsi="Consolas"/>
+          <w:color w:val="7A1F1F"/>
+          <w:sz w:val="20"/>
+          <w:szCs w:val="20"/>
+        </w:rPr>
+        <w:t xml:space="preserve">sicom-muni</w:t>
+      </w:r>
+      <w:r>
+        <w:rPr>
+          <w:rFonts w:ascii="Calibri" w:cs="Calibri" w:eastAsia="Calibri" w:hAnsi="Calibri"/>
+        </w:rPr>
+        <w:t xml:space="preserve"> haga </w:t>
+      </w:r>
+      <w:r>
+        <w:rPr>
+          <w:rFonts w:ascii="Calibri" w:cs="Calibri" w:eastAsia="Calibri" w:hAnsi="Calibri"/>
+          <w:b/>
+          <w:bCs/>
+        </w:rPr>
+        <w:t xml:space="preserve">doble clic</w:t>
+      </w:r>
+      <w:r>
+        <w:rPr>
+          <w:rFonts w:ascii="Calibri" w:cs="Calibri" w:eastAsia="Calibri" w:hAnsi="Calibri"/>
+        </w:rPr>
+        <w:t xml:space="preserve"> en </w:t>
+      </w:r>
+      <w:r>
+        <w:rPr>
+          <w:rFonts w:ascii="Calibri" w:cs="Calibri" w:eastAsia="Calibri" w:hAnsi="Calibri"/>
+          <w:b/>
+          <w:bCs/>
+        </w:rPr>
+        <w:t xml:space="preserve">INICIAR-SIN-DOCKER.bat</w:t>
+      </w:r>
+      <w:r>
+        <w:rPr>
+          <w:rFonts w:ascii="Calibri" w:cs="Calibri" w:eastAsia="Calibri" w:hAnsi="Calibri"/>
+        </w:rPr>
+        <w:t xml:space="preserve">. Si aparece «Windows protegió su PC», pulse </w:t>
+      </w:r>
+      <w:r>
+        <w:rPr>
+          <w:rFonts w:ascii="Calibri" w:cs="Calibri" w:eastAsia="Calibri" w:hAnsi="Calibri"/>
+          <w:b/>
+          <w:bCs/>
+        </w:rPr>
+        <w:t xml:space="preserve">Más información → Ejecutar de todas formas</w:t>
+      </w:r>
+      <w:r>
+        <w:rPr>
+          <w:rFonts w:ascii="Calibri" w:cs="Calibri" w:eastAsia="Calibri" w:hAnsi="Calibri"/>
+        </w:rPr>
+        <w:t xml:space="preserve">.</w:t>
+      </w:r>
+    </w:p>
+    <w:p>
+      <w:pPr>
+        <w:pStyle w:val="ListParagraph"/>
+        <w:numPr>
+          <w:ilvl w:val="0"/>
+          <w:numId w:val="6"/>
+        </w:numPr>
+        <w:spacing w:after="80"/>
+      </w:pPr>
+      <w:r>
+        <w:rPr>
+          <w:rFonts w:ascii="Calibri" w:cs="Calibri" w:eastAsia="Calibri" w:hAnsi="Calibri"/>
+        </w:rPr>
+        <w:t xml:space="preserve">Se abre una ventana azul con 6 etapas: </w:t>
+      </w:r>
+      <w:r>
+        <w:rPr>
+          <w:rFonts w:ascii="Consolas" w:cs="Consolas" w:eastAsia="Consolas" w:hAnsi="Consolas"/>
+          <w:color w:val="7A1F1F"/>
+          <w:sz w:val="20"/>
+          <w:szCs w:val="20"/>
+        </w:rPr>
+        <w:t xml:space="preserve">1/6</w:t>
+      </w:r>
+      <w:r>
+        <w:rPr>
+          <w:rFonts w:ascii="Calibri" w:cs="Calibri" w:eastAsia="Calibri" w:hAnsi="Calibri"/>
+        </w:rPr>
+        <w:t xml:space="preserve"> Python, </w:t>
+      </w:r>
+      <w:r>
+        <w:rPr>
+          <w:rFonts w:ascii="Consolas" w:cs="Consolas" w:eastAsia="Consolas" w:hAnsi="Consolas"/>
+          <w:color w:val="7A1F1F"/>
+          <w:sz w:val="20"/>
+          <w:szCs w:val="20"/>
+        </w:rPr>
+        <w:t xml:space="preserve">2/6</w:t>
+      </w:r>
+      <w:r>
+        <w:rPr>
+          <w:rFonts w:ascii="Calibri" w:cs="Calibri" w:eastAsia="Calibri" w:hAnsi="Calibri"/>
+        </w:rPr>
+        <w:t xml:space="preserve"> Node, </w:t>
+      </w:r>
+      <w:r>
+        <w:rPr>
+          <w:rFonts w:ascii="Consolas" w:cs="Consolas" w:eastAsia="Consolas" w:hAnsi="Consolas"/>
+          <w:color w:val="7A1F1F"/>
+          <w:sz w:val="20"/>
+          <w:szCs w:val="20"/>
+        </w:rPr>
+        <w:t xml:space="preserve">3/6</w:t>
+      </w:r>
+      <w:r>
+        <w:rPr>
+          <w:rFonts w:ascii="Calibri" w:cs="Calibri" w:eastAsia="Calibri" w:hAnsi="Calibri"/>
+        </w:rPr>
+        <w:t xml:space="preserve"> servidor, </w:t>
+      </w:r>
+      <w:r>
+        <w:rPr>
+          <w:rFonts w:ascii="Consolas" w:cs="Consolas" w:eastAsia="Consolas" w:hAnsi="Consolas"/>
+          <w:color w:val="7A1F1F"/>
+          <w:sz w:val="20"/>
+          <w:szCs w:val="20"/>
+        </w:rPr>
+        <w:t xml:space="preserve">4/6</w:t>
+      </w:r>
+      <w:r>
+        <w:rPr>
+          <w:rFonts w:ascii="Calibri" w:cs="Calibri" w:eastAsia="Calibri" w:hAnsi="Calibri"/>
+        </w:rPr>
+        <w:t xml:space="preserve"> pantalla web, </w:t>
+      </w:r>
+      <w:r>
+        <w:rPr>
+          <w:rFonts w:ascii="Consolas" w:cs="Consolas" w:eastAsia="Consolas" w:hAnsi="Consolas"/>
+          <w:color w:val="7A1F1F"/>
+          <w:sz w:val="20"/>
+          <w:szCs w:val="20"/>
+        </w:rPr>
+        <w:t xml:space="preserve">5/6</w:t>
+      </w:r>
+      <w:r>
+        <w:rPr>
+          <w:rFonts w:ascii="Calibri" w:cs="Calibri" w:eastAsia="Calibri" w:hAnsi="Calibri"/>
+        </w:rPr>
+        <w:t xml:space="preserve"> encendido, </w:t>
+      </w:r>
+      <w:r>
+        <w:rPr>
+          <w:rFonts w:ascii="Consolas" w:cs="Consolas" w:eastAsia="Consolas" w:hAnsi="Consolas"/>
+          <w:color w:val="7A1F1F"/>
+          <w:sz w:val="20"/>
+          <w:szCs w:val="20"/>
+        </w:rPr>
+        <w:t xml:space="preserve">6/6</w:t>
+      </w:r>
+      <w:r>
+        <w:rPr>
+          <w:rFonts w:ascii="Calibri" w:cs="Calibri" w:eastAsia="Calibri" w:hAnsi="Calibri"/>
+        </w:rPr>
+        <w:t xml:space="preserve"> espera. </w:t>
+      </w:r>
+      <w:r>
+        <w:rPr>
+          <w:rFonts w:ascii="Calibri" w:cs="Calibri" w:eastAsia="Calibri" w:hAnsi="Calibri"/>
+          <w:b/>
+          <w:bCs/>
+        </w:rPr>
+        <w:t xml:space="preserve">No la cierre.</w:t>
+      </w:r>
+    </w:p>
+    <w:p>
+      <w:pPr>
+        <w:pStyle w:val="ListParagraph"/>
+        <w:numPr>
+          <w:ilvl w:val="0"/>
+          <w:numId w:val="6"/>
+        </w:numPr>
+        <w:spacing w:after="80"/>
+      </w:pPr>
+      <w:r>
+        <w:rPr>
+          <w:rFonts w:ascii="Calibri" w:cs="Calibri" w:eastAsia="Calibri" w:hAnsi="Calibri"/>
+        </w:rPr>
+        <w:t xml:space="preserve">Si Windows pide </w:t>
+      </w:r>
+      <w:r>
+        <w:rPr>
+          <w:rFonts w:ascii="Calibri" w:cs="Calibri" w:eastAsia="Calibri" w:hAnsi="Calibri"/>
+          <w:b/>
+          <w:bCs/>
+        </w:rPr>
+        <w:t xml:space="preserve">permiso de administrador</w:t>
+      </w:r>
+      <w:r>
+        <w:rPr>
+          <w:rFonts w:ascii="Calibri" w:cs="Calibri" w:eastAsia="Calibri" w:hAnsi="Calibri"/>
+        </w:rPr>
+        <w:t xml:space="preserve"> para instalar Python o Node, pulse </w:t>
+      </w:r>
+      <w:r>
+        <w:rPr>
+          <w:rFonts w:ascii="Calibri" w:cs="Calibri" w:eastAsia="Calibri" w:hAnsi="Calibri"/>
+          <w:b/>
+          <w:bCs/>
+        </w:rPr>
+        <w:t xml:space="preserve">Sí</w:t>
+      </w:r>
+      <w:r>
+        <w:rPr>
+          <w:rFonts w:ascii="Calibri" w:cs="Calibri" w:eastAsia="Calibri" w:hAnsi="Calibri"/>
+        </w:rPr>
+        <w:t xml:space="preserve">. Después de instalarlos, el programa continúa solo; si la ventana se cierra, vuelva a hacer doble clic en el mismo archivo.</w:t>
+      </w:r>
+    </w:p>
+    <w:p>
+      <w:pPr>
+        <w:pStyle w:val="ListParagraph"/>
+        <w:numPr>
+          <w:ilvl w:val="0"/>
+          <w:numId w:val="6"/>
+        </w:numPr>
+        <w:spacing w:after="80"/>
+      </w:pPr>
+      <w:r>
+        <w:rPr>
+          <w:rFonts w:ascii="Calibri" w:cs="Calibri" w:eastAsia="Calibri" w:hAnsi="Calibri"/>
+        </w:rPr>
+        <w:t xml:space="preserve">La </w:t>
+      </w:r>
+      <w:r>
+        <w:rPr>
+          <w:rFonts w:ascii="Calibri" w:cs="Calibri" w:eastAsia="Calibri" w:hAnsi="Calibri"/>
+          <w:b/>
+          <w:bCs/>
+        </w:rPr>
+        <w:t xml:space="preserve">primera vez tarda entre 10 y 25 minutos</w:t>
+      </w:r>
+      <w:r>
+        <w:rPr>
+          <w:rFonts w:ascii="Calibri" w:cs="Calibri" w:eastAsia="Calibri" w:hAnsi="Calibri"/>
+        </w:rPr>
+        <w:t xml:space="preserve"> (descargas y compilación). Las siguientes veces tarda menos de 1 minuto.</w:t>
+      </w:r>
+    </w:p>
+    <w:p>
+      <w:pPr>
+        <w:pStyle w:val="ListParagraph"/>
+        <w:numPr>
+          <w:ilvl w:val="0"/>
+          <w:numId w:val="6"/>
+        </w:numPr>
+        <w:spacing w:after="80"/>
+      </w:pPr>
+      <w:r>
+        <w:rPr>
+          <w:rFonts w:ascii="Calibri" w:cs="Calibri" w:eastAsia="Calibri" w:hAnsi="Calibri"/>
+        </w:rPr>
+        <w:t xml:space="preserve">Cuando aparezca el cuadro verde </w:t>
+      </w:r>
+      <w:r>
+        <w:rPr>
+          <w:rFonts w:ascii="Calibri" w:cs="Calibri" w:eastAsia="Calibri" w:hAnsi="Calibri"/>
+          <w:b/>
+          <w:bCs/>
+        </w:rPr>
+        <w:t xml:space="preserve">LISTO</w:t>
+      </w:r>
+      <w:r>
+        <w:rPr>
+          <w:rFonts w:ascii="Calibri" w:cs="Calibri" w:eastAsia="Calibri" w:hAnsi="Calibri"/>
+        </w:rPr>
+        <w:t xml:space="preserve">, se abre el navegador. Entre con </w:t>
+      </w:r>
+      <w:r>
+        <w:rPr>
+          <w:rFonts w:ascii="Consolas" w:cs="Consolas" w:eastAsia="Consolas" w:hAnsi="Consolas"/>
+          <w:color w:val="7A1F1F"/>
+          <w:sz w:val="20"/>
+          <w:szCs w:val="20"/>
+        </w:rPr>
+        <w:t xml:space="preserve">solicitante</w:t>
+      </w:r>
+      <w:r>
+        <w:rPr>
+          <w:rFonts w:ascii="Calibri" w:cs="Calibri" w:eastAsia="Calibri" w:hAnsi="Calibri"/>
+        </w:rPr>
+        <w:t xml:space="preserve"> y </w:t>
+      </w:r>
+      <w:r>
+        <w:rPr>
+          <w:rFonts w:ascii="Consolas" w:cs="Consolas" w:eastAsia="Consolas" w:hAnsi="Consolas"/>
+          <w:color w:val="7A1F1F"/>
+          <w:sz w:val="20"/>
+          <w:szCs w:val="20"/>
+        </w:rPr>
+        <w:t xml:space="preserve">Sicom#2026Demo</w:t>
+      </w:r>
+      <w:r>
+        <w:rPr>
+          <w:rFonts w:ascii="Calibri" w:cs="Calibri" w:eastAsia="Calibri" w:hAnsi="Calibri"/>
+        </w:rPr>
+        <w:t xml:space="preserve"> y continúe en la </w:t>
+      </w:r>
+      <w:r>
+        <w:rPr>
+          <w:rFonts w:ascii="Calibri" w:cs="Calibri" w:eastAsia="Calibri" w:hAnsi="Calibri"/>
+          <w:b/>
+          <w:bCs/>
+        </w:rPr>
+        <w:t xml:space="preserve">PARTE 2</w:t>
+      </w:r>
+      <w:r>
+        <w:rPr>
+          <w:rFonts w:ascii="Calibri" w:cs="Calibri" w:eastAsia="Calibri" w:hAnsi="Calibri"/>
+        </w:rPr>
+        <w:t xml:space="preserve"> de esta guía.</w:t>
+      </w:r>
+    </w:p>
+    <w:p>
+      <w:pPr>
+        <w:keepNext/>
+        <w:spacing w:after="40" w:before="80"/>
+        <w:jc w:val="center"/>
+      </w:pPr>
+      <w:r>
+        <w:drawing>
+          <wp:inline distT="0" distB="0" distL="0" distR="0">
+            <wp:extent cx="4210050" cy="2962275"/>
+            <wp:effectExtent t="0" r="0" b="0" l="0"/>
+            <wp:docPr id="1" name="01-login.png" descr="Si ve esta pantalla, el sistema está funcionando" title="Si ve esta pantalla, el sistema está funcionando"/>
+            <wp:cNvGraphicFramePr>
+              <a:graphicFrameLocks xmlns:a="http://schemas.openxmlformats.org/drawingml/2006/main" noChangeAspect="1"/>
+            </wp:cNvGraphicFramePr>
+            <a:graphic xmlns:a="http://schemas.openxmlformats.org/drawingml/2006/main">
+              <a:graphicData uri="http://schemas.openxmlformats.org/drawingml/2006/picture">
+                <pic:pic xmlns:pic="http://schemas.openxmlformats.org/drawingml/2006/picture">
+                  <pic:nvPicPr>
+                    <pic:cNvPr id="0" name="" descr=""/>
+                    <pic:cNvPicPr>
+                      <a:picLocks noChangeAspect="1" noChangeArrowheads="1"/>
+                    </pic:cNvPicPr>
+                  </pic:nvPicPr>
+                  <pic:blipFill>
+                    <a:blip r:embed="rId9" cstate="none"/>
+                    <a:srcRect/>
+                    <a:stretch>
+                      <a:fillRect/>
+                    </a:stretch>
+                  </pic:blipFill>
+                  <pic:spPr bwMode="auto">
+                    <a:xfrm>
+                      <a:off x="0" y="0"/>
+                      <a:ext cx="4210050" cy="2962275"/>
+                    </a:xfrm>
+                    <a:prstGeom prst="rect">
+                      <a:avLst/>
+                    </a:prstGeom>
+                  </pic:spPr>
+                </pic:pic>
+              </a:graphicData>
+            </a:graphic>
+          </wp:inline>
+        </w:drawing>
+      </w:r>
+    </w:p>
+    <w:p>
+      <w:pPr>
+        <w:spacing w:after="200"/>
+        <w:jc w:val="center"/>
+      </w:pPr>
+      <w:r>
+        <w:rPr>
+          <w:rFonts w:ascii="Calibri" w:cs="Calibri" w:eastAsia="Calibri" w:hAnsi="Calibri"/>
+          <w:i/>
+          <w:iCs/>
+          <w:color w:val="555555"/>
+          <w:sz w:val="18"/>
+          <w:szCs w:val="18"/>
+        </w:rPr>
+        <w:t xml:space="preserve">Figura: Si ve esta pantalla, el sistema está funcionando</w:t>
+      </w:r>
+    </w:p>
+    <w:p>
+      <w:pPr>
+        <w:pStyle w:val="Heading2"/>
+      </w:pPr>
+      <w:r>
+        <w:rPr>
+          <w:rFonts w:ascii="Calibri" w:cs="Calibri" w:eastAsia="Calibri" w:hAnsi="Calibri"/>
+        </w:rPr>
+        <w:t xml:space="preserve">Apagar y volver a encender</w:t>
+      </w:r>
+    </w:p>
+    <w:p>
+      <w:pPr>
+        <w:pStyle w:val="ListParagraph"/>
+        <w:numPr>
+          <w:ilvl w:val="0"/>
+          <w:numId w:val="2"/>
+        </w:numPr>
+        <w:spacing w:after="60"/>
+      </w:pPr>
+      <w:r>
+        <w:rPr>
+          <w:rFonts w:ascii="Calibri" w:cs="Calibri" w:eastAsia="Calibri" w:hAnsi="Calibri"/>
+          <w:b/>
+          <w:bCs/>
+        </w:rPr>
+        <w:t xml:space="preserve">Apagar:</w:t>
+      </w:r>
+      <w:r>
+        <w:rPr>
+          <w:rFonts w:ascii="Calibri" w:cs="Calibri" w:eastAsia="Calibri" w:hAnsi="Calibri"/>
+        </w:rPr>
+        <w:t xml:space="preserve"> doble clic en </w:t>
+      </w:r>
+      <w:r>
+        <w:rPr>
+          <w:rFonts w:ascii="Calibri" w:cs="Calibri" w:eastAsia="Calibri" w:hAnsi="Calibri"/>
+          <w:b/>
+          <w:bCs/>
+        </w:rPr>
+        <w:t xml:space="preserve">DETENER-SIN-DOCKER.bat</w:t>
+      </w:r>
+      <w:r>
+        <w:rPr>
+          <w:rFonts w:ascii="Calibri" w:cs="Calibri" w:eastAsia="Calibri" w:hAnsi="Calibri"/>
+        </w:rPr>
+        <w:t xml:space="preserve">.</w:t>
+      </w:r>
+    </w:p>
+    <w:p>
+      <w:pPr>
+        <w:pStyle w:val="ListParagraph"/>
+        <w:numPr>
+          <w:ilvl w:val="0"/>
+          <w:numId w:val="2"/>
+        </w:numPr>
+        <w:spacing w:after="60"/>
+      </w:pPr>
+      <w:r>
+        <w:rPr>
+          <w:rFonts w:ascii="Calibri" w:cs="Calibri" w:eastAsia="Calibri" w:hAnsi="Calibri"/>
+          <w:b/>
+          <w:bCs/>
+        </w:rPr>
+        <w:t xml:space="preserve">Encender:</w:t>
+      </w:r>
+      <w:r>
+        <w:rPr>
+          <w:rFonts w:ascii="Calibri" w:cs="Calibri" w:eastAsia="Calibri" w:hAnsi="Calibri"/>
+        </w:rPr>
+        <w:t xml:space="preserve"> doble clic en </w:t>
+      </w:r>
+      <w:r>
+        <w:rPr>
+          <w:rFonts w:ascii="Calibri" w:cs="Calibri" w:eastAsia="Calibri" w:hAnsi="Calibri"/>
+          <w:b/>
+          <w:bCs/>
+        </w:rPr>
+        <w:t xml:space="preserve">INICIAR-SIN-DOCKER.bat</w:t>
+      </w:r>
+      <w:r>
+        <w:rPr>
+          <w:rFonts w:ascii="Calibri" w:cs="Calibri" w:eastAsia="Calibri" w:hAnsi="Calibri"/>
+        </w:rPr>
+        <w:t xml:space="preserve"> (los datos de prueba se conservan en la carpeta </w:t>
+      </w:r>
+      <w:r>
+        <w:rPr>
+          <w:rFonts w:ascii="Consolas" w:cs="Consolas" w:eastAsia="Consolas" w:hAnsi="Consolas"/>
+          <w:color w:val="7A1F1F"/>
+          <w:sz w:val="20"/>
+          <w:szCs w:val="20"/>
+        </w:rPr>
+        <w:t xml:space="preserve">.local</w:t>
+      </w:r>
+      <w:r>
+        <w:rPr>
+          <w:rFonts w:ascii="Calibri" w:cs="Calibri" w:eastAsia="Calibri" w:hAnsi="Calibri"/>
+        </w:rPr>
+        <w:t xml:space="preserve">).</w:t>
+      </w:r>
+    </w:p>
+    <w:p>
+      <w:pPr>
+        <w:pStyle w:val="Heading2"/>
+      </w:pPr>
+      <w:r>
+        <w:rPr>
+          <w:rFonts w:ascii="Calibri" w:cs="Calibri" w:eastAsia="Calibri" w:hAnsi="Calibri"/>
+        </w:rPr>
+        <w:t xml:space="preserve">Diferencias con la versión Docker</w:t>
+      </w:r>
+    </w:p>
+    <w:tbl>
+      <w:tblPr>
+        <w:tblW w:type="dxa" w:w="9360"/>
+        <w:tblBorders>
+          <w:top w:val="single" w:color="auto" w:sz="4"/>
+          <w:left w:val="single" w:color="auto" w:sz="4"/>
+          <w:bottom w:val="single" w:color="auto" w:sz="4"/>
+          <w:right w:val="single" w:color="auto" w:sz="4"/>
+          <w:insideH w:val="single" w:color="auto" w:sz="4"/>
+          <w:insideV w:val="single" w:color="auto" w:sz="4"/>
+        </w:tblBorders>
+      </w:tblPr>
+      <w:tblGrid>
+        <w:gridCol w:w="2400"/>
+        <w:gridCol w:w="6960"/>
+      </w:tblGrid>
+      <w:tr>
+        <w:trPr>
+          <w:tblHeader/>
+        </w:trPr>
+        <w:tc>
+          <w:tcPr>
+            <w:tcW w:type="dxa" w:w="2400"/>
+            <w:tcBorders>
+              <w:top w:val="single" w:color="BFC8D4" w:sz="4"/>
+              <w:left w:val="single" w:color="BFC8D4" w:sz="4"/>
+              <w:bottom w:val="single" w:color="BFC8D4" w:sz="4"/>
+              <w:right w:val="single" w:color="BFC8D4" w:sz="4"/>
+            </w:tcBorders>
+            <w:shd w:fill="1F4E79" w:color="auto" w:val="clear"/>
+            <w:tcMar>
+              <w:top w:type="dxa" w:w="60"/>
+              <w:left w:type="dxa" w:w="100"/>
+              <w:bottom w:type="dxa" w:w="60"/>
+              <w:right w:type="dxa" w:w="100"/>
+            </w:tcMar>
+          </w:tcPr>
+          <w:p>
+            <w:r>
+              <w:rPr>
+                <w:rFonts w:ascii="Calibri" w:cs="Calibri" w:eastAsia="Calibri" w:hAnsi="Calibri"/>
+                <w:b/>
+                <w:bCs/>
+                <w:color w:val="FFFFFF"/>
+                <w:sz w:val="19"/>
+                <w:szCs w:val="19"/>
+              </w:rPr>
+              <w:t xml:space="preserve">Tema</w:t>
+            </w:r>
+          </w:p>
+        </w:tc>
+        <w:tc>
+          <w:tcPr>
+            <w:tcW w:type="dxa" w:w="6960"/>
+            <w:tcBorders>
+              <w:top w:val="single" w:color="BFC8D4" w:sz="4"/>
+              <w:left w:val="single" w:color="BFC8D4" w:sz="4"/>
+              <w:bottom w:val="single" w:color="BFC8D4" w:sz="4"/>
+              <w:right w:val="single" w:color="BFC8D4" w:sz="4"/>
+            </w:tcBorders>
+            <w:shd w:fill="1F4E79" w:color="auto" w:val="clear"/>
+            <w:tcMar>
+              <w:top w:type="dxa" w:w="60"/>
+              <w:left w:type="dxa" w:w="100"/>
+              <w:bottom w:type="dxa" w:w="60"/>
+              <w:right w:type="dxa" w:w="100"/>
+            </w:tcMar>
+          </w:tcPr>
+          <w:p>
+            <w:r>
+              <w:rPr>
+                <w:rFonts w:ascii="Calibri" w:cs="Calibri" w:eastAsia="Calibri" w:hAnsi="Calibri"/>
+                <w:b/>
+                <w:bCs/>
+                <w:color w:val="FFFFFF"/>
+                <w:sz w:val="19"/>
+                <w:szCs w:val="19"/>
+              </w:rPr>
+              <w:t xml:space="preserve">Modo sin Docker</w:t>
+            </w:r>
+          </w:p>
+        </w:tc>
+      </w:tr>
+      <w:tr>
+        <w:trPr>
+          <w:cantSplit/>
+        </w:trPr>
+        <w:tc>
+          <w:tcPr>
+            <w:tcW w:type="dxa" w:w="2400"/>
+            <w:tcBorders>
+              <w:top w:val="single" w:color="BFC8D4" w:sz="4"/>
+              <w:left w:val="single" w:color="BFC8D4" w:sz="4"/>
+              <w:bottom w:val="single" w:color="BFC8D4" w:sz="4"/>
+              <w:right w:val="single" w:color="BFC8D4" w:sz="4"/>
+            </w:tcBorders>
+            <w:tcMar>
+              <w:top w:type="dxa" w:w="60"/>
+              <w:left w:type="dxa" w:w="100"/>
+              <w:bottom w:type="dxa" w:w="60"/>
+              <w:right w:type="dxa" w:w="100"/>
+            </w:tcMar>
+          </w:tcPr>
+          <w:p>
+            <w:r>
+              <w:rPr>
+                <w:rFonts w:ascii="Calibri" w:cs="Calibri" w:eastAsia="Calibri" w:hAnsi="Calibri"/>
+              </w:rPr>
+              <w:t xml:space="preserve">Base de datos</w:t>
+            </w:r>
+          </w:p>
+        </w:tc>
+        <w:tc>
+          <w:tcPr>
+            <w:tcW w:type="dxa" w:w="6960"/>
+            <w:tcBorders>
+              <w:top w:val="single" w:color="BFC8D4" w:sz="4"/>
+              <w:left w:val="single" w:color="BFC8D4" w:sz="4"/>
+              <w:bottom w:val="single" w:color="BFC8D4" w:sz="4"/>
+              <w:right w:val="single" w:color="BFC8D4" w:sz="4"/>
+            </w:tcBorders>
+            <w:tcMar>
+              <w:top w:type="dxa" w:w="60"/>
+              <w:left w:type="dxa" w:w="100"/>
+              <w:bottom w:type="dxa" w:w="60"/>
+              <w:right w:type="dxa" w:w="100"/>
+            </w:tcMar>
+          </w:tcPr>
+          <w:p>
+            <w:r>
+              <w:rPr>
+                <w:rFonts w:ascii="Calibri" w:cs="Calibri" w:eastAsia="Calibri" w:hAnsi="Calibri"/>
+              </w:rPr>
+              <w:t xml:space="preserve">Archivo SQLite local (no PostgreSQL). Suficiente para probar.</w:t>
+            </w:r>
+          </w:p>
+        </w:tc>
+      </w:tr>
+      <w:tr>
+        <w:trPr>
+          <w:cantSplit/>
+        </w:trPr>
+        <w:tc>
+          <w:tcPr>
+            <w:tcW w:type="dxa" w:w="2400"/>
+            <w:tcBorders>
+              <w:top w:val="single" w:color="BFC8D4" w:sz="4"/>
+              <w:left w:val="single" w:color="BFC8D4" w:sz="4"/>
+              <w:bottom w:val="single" w:color="BFC8D4" w:sz="4"/>
+              <w:right w:val="single" w:color="BFC8D4" w:sz="4"/>
+            </w:tcBorders>
+            <w:tcMar>
+              <w:top w:type="dxa" w:w="60"/>
+              <w:left w:type="dxa" w:w="100"/>
+              <w:bottom w:type="dxa" w:w="60"/>
+              <w:right w:type="dxa" w:w="100"/>
+            </w:tcMar>
+          </w:tcPr>
+          <w:p>
+            <w:r>
+              <w:rPr>
+                <w:rFonts w:ascii="Calibri" w:cs="Calibri" w:eastAsia="Calibri" w:hAnsi="Calibri"/>
+              </w:rPr>
+              <w:t xml:space="preserve">Documentos PDF</w:t>
+            </w:r>
+          </w:p>
+        </w:tc>
+        <w:tc>
+          <w:tcPr>
+            <w:tcW w:type="dxa" w:w="6960"/>
+            <w:tcBorders>
+              <w:top w:val="single" w:color="BFC8D4" w:sz="4"/>
+              <w:left w:val="single" w:color="BFC8D4" w:sz="4"/>
+              <w:bottom w:val="single" w:color="BFC8D4" w:sz="4"/>
+              <w:right w:val="single" w:color="BFC8D4" w:sz="4"/>
+            </w:tcBorders>
+            <w:tcMar>
+              <w:top w:type="dxa" w:w="60"/>
+              <w:left w:type="dxa" w:w="100"/>
+              <w:bottom w:type="dxa" w:w="60"/>
+              <w:right w:type="dxa" w:w="100"/>
+            </w:tcMar>
+          </w:tcPr>
+          <w:p>
+            <w:r>
+              <w:rPr>
+                <w:rFonts w:ascii="Calibri" w:cs="Calibri" w:eastAsia="Calibri" w:hAnsi="Calibri"/>
+              </w:rPr>
+              <w:t xml:space="preserve">Si el equipo no tiene las librerías gráficas, los documentos se muestran como </w:t>
+            </w:r>
+            <w:r>
+              <w:rPr>
+                <w:rFonts w:ascii="Calibri" w:cs="Calibri" w:eastAsia="Calibri" w:hAnsi="Calibri"/>
+                <w:b/>
+                <w:bCs/>
+              </w:rPr>
+              <w:t xml:space="preserve">página HTML imprimible</w:t>
+            </w:r>
+            <w:r>
+              <w:rPr>
+                <w:rFonts w:ascii="Calibri" w:cs="Calibri" w:eastAsia="Calibri" w:hAnsi="Calibri"/>
+              </w:rPr>
+              <w:t xml:space="preserve">: se abre en el navegador y con </w:t>
+            </w:r>
+            <w:r>
+              <w:rPr>
+                <w:rFonts w:ascii="Calibri" w:cs="Calibri" w:eastAsia="Calibri" w:hAnsi="Calibri"/>
+                <w:b/>
+                <w:bCs/>
+              </w:rPr>
+              <w:t xml:space="preserve">Ctrl + P → Guardar como PDF</w:t>
+            </w:r>
+            <w:r>
+              <w:rPr>
+                <w:rFonts w:ascii="Calibri" w:cs="Calibri" w:eastAsia="Calibri" w:hAnsi="Calibri"/>
+              </w:rPr>
+              <w:t xml:space="preserve"> se obtiene el PDF. Opcional: ejecute </w:t>
+            </w:r>
+            <w:r>
+              <w:rPr>
+                <w:rFonts w:ascii="Calibri" w:cs="Calibri" w:eastAsia="Calibri" w:hAnsi="Calibri"/>
+                <w:b/>
+                <w:bCs/>
+              </w:rPr>
+              <w:t xml:space="preserve">INSTALAR-SOPORTE-PDF.bat</w:t>
+            </w:r>
+            <w:r>
+              <w:rPr>
+                <w:rFonts w:ascii="Calibri" w:cs="Calibri" w:eastAsia="Calibri" w:hAnsi="Calibri"/>
+              </w:rPr>
+              <w:t xml:space="preserve"> para generar PDF reales (puede tardar 10 minutos).</w:t>
+            </w:r>
+          </w:p>
+        </w:tc>
+      </w:tr>
+      <w:tr>
+        <w:trPr>
+          <w:cantSplit/>
+        </w:trPr>
+        <w:tc>
+          <w:tcPr>
+            <w:tcW w:type="dxa" w:w="2400"/>
+            <w:tcBorders>
+              <w:top w:val="single" w:color="BFC8D4" w:sz="4"/>
+              <w:left w:val="single" w:color="BFC8D4" w:sz="4"/>
+              <w:bottom w:val="single" w:color="BFC8D4" w:sz="4"/>
+              <w:right w:val="single" w:color="BFC8D4" w:sz="4"/>
+            </w:tcBorders>
+            <w:tcMar>
+              <w:top w:type="dxa" w:w="60"/>
+              <w:left w:type="dxa" w:w="100"/>
+              <w:bottom w:type="dxa" w:w="60"/>
+              <w:right w:type="dxa" w:w="100"/>
+            </w:tcMar>
+          </w:tcPr>
+          <w:p>
+            <w:r>
+              <w:rPr>
+                <w:rFonts w:ascii="Calibri" w:cs="Calibri" w:eastAsia="Calibri" w:hAnsi="Calibri"/>
+              </w:rPr>
+              <w:t xml:space="preserve">Auditoría inalterable</w:t>
+            </w:r>
+          </w:p>
+        </w:tc>
+        <w:tc>
+          <w:tcPr>
+            <w:tcW w:type="dxa" w:w="6960"/>
+            <w:tcBorders>
+              <w:top w:val="single" w:color="BFC8D4" w:sz="4"/>
+              <w:left w:val="single" w:color="BFC8D4" w:sz="4"/>
+              <w:bottom w:val="single" w:color="BFC8D4" w:sz="4"/>
+              <w:right w:val="single" w:color="BFC8D4" w:sz="4"/>
+            </w:tcBorders>
+            <w:tcMar>
+              <w:top w:type="dxa" w:w="60"/>
+              <w:left w:type="dxa" w:w="100"/>
+              <w:bottom w:type="dxa" w:w="60"/>
+              <w:right w:type="dxa" w:w="100"/>
+            </w:tcMar>
+          </w:tcPr>
+          <w:p>
+            <w:r>
+              <w:rPr>
+                <w:rFonts w:ascii="Calibri" w:cs="Calibri" w:eastAsia="Calibri" w:hAnsi="Calibri"/>
+              </w:rPr>
+              <w:t xml:space="preserve">Se registra y se verifica la cadena de huellas, pero </w:t>
+            </w:r>
+            <w:r>
+              <w:rPr>
+                <w:rFonts w:ascii="Calibri" w:cs="Calibri" w:eastAsia="Calibri" w:hAnsi="Calibri"/>
+                <w:b/>
+                <w:bCs/>
+              </w:rPr>
+              <w:t xml:space="preserve">sin</w:t>
+            </w:r>
+            <w:r>
+              <w:rPr>
+                <w:rFonts w:ascii="Calibri" w:cs="Calibri" w:eastAsia="Calibri" w:hAnsi="Calibri"/>
+              </w:rPr>
+              <w:t xml:space="preserve"> el bloqueo a nivel de base de datos que ofrece PostgreSQL.</w:t>
+            </w:r>
+          </w:p>
+        </w:tc>
+      </w:tr>
+      <w:tr>
+        <w:trPr>
+          <w:cantSplit/>
+        </w:trPr>
+        <w:tc>
+          <w:tcPr>
+            <w:tcW w:type="dxa" w:w="2400"/>
+            <w:tcBorders>
+              <w:top w:val="single" w:color="BFC8D4" w:sz="4"/>
+              <w:left w:val="single" w:color="BFC8D4" w:sz="4"/>
+              <w:bottom w:val="single" w:color="BFC8D4" w:sz="4"/>
+              <w:right w:val="single" w:color="BFC8D4" w:sz="4"/>
+            </w:tcBorders>
+            <w:tcMar>
+              <w:top w:type="dxa" w:w="60"/>
+              <w:left w:type="dxa" w:w="100"/>
+              <w:bottom w:type="dxa" w:w="60"/>
+              <w:right w:type="dxa" w:w="100"/>
+            </w:tcMar>
+          </w:tcPr>
+          <w:p>
+            <w:r>
+              <w:rPr>
+                <w:rFonts w:ascii="Calibri" w:cs="Calibri" w:eastAsia="Calibri" w:hAnsi="Calibri"/>
+              </w:rPr>
+              <w:t xml:space="preserve">Uso oficial</w:t>
+            </w:r>
+          </w:p>
+        </w:tc>
+        <w:tc>
+          <w:tcPr>
+            <w:tcW w:type="dxa" w:w="6960"/>
+            <w:tcBorders>
+              <w:top w:val="single" w:color="BFC8D4" w:sz="4"/>
+              <w:left w:val="single" w:color="BFC8D4" w:sz="4"/>
+              <w:bottom w:val="single" w:color="BFC8D4" w:sz="4"/>
+              <w:right w:val="single" w:color="BFC8D4" w:sz="4"/>
+            </w:tcBorders>
+            <w:tcMar>
+              <w:top w:type="dxa" w:w="60"/>
+              <w:left w:type="dxa" w:w="100"/>
+              <w:bottom w:type="dxa" w:w="60"/>
+              <w:right w:type="dxa" w:w="100"/>
+            </w:tcMar>
+          </w:tcPr>
+          <w:p>
+            <w:r>
+              <w:rPr>
+                <w:rFonts w:ascii="Calibri" w:cs="Calibri" w:eastAsia="Calibri" w:hAnsi="Calibri"/>
+                <w:b/>
+                <w:bCs/>
+              </w:rPr>
+              <w:t xml:space="preserve">No</w:t>
+            </w:r>
+            <w:r>
+              <w:rPr>
+                <w:rFonts w:ascii="Calibri" w:cs="Calibri" w:eastAsia="Calibri" w:hAnsi="Calibri"/>
+              </w:rPr>
+              <w:t xml:space="preserve"> se recomienda: ver la sección «Cómo se trabajará de forma oficial».</w:t>
+            </w:r>
+          </w:p>
+        </w:tc>
+      </w:tr>
+    </w:tbl>
+    <w:p>
+      <w:pPr>
+        <w:spacing w:after="160"/>
+      </w:pPr>
+    </w:p>
+    <w:p>
+      <w:pPr>
+        <w:pStyle w:val="Heading2"/>
+      </w:pPr>
+      <w:r>
+        <w:rPr>
+          <w:rFonts w:ascii="Calibri" w:cs="Calibri" w:eastAsia="Calibri" w:hAnsi="Calibri"/>
+        </w:rPr>
+        <w:t xml:space="preserve">Si algo falla</w:t>
+      </w:r>
+    </w:p>
+    <w:tbl>
+      <w:tblPr>
+        <w:tblW w:type="dxa" w:w="9360"/>
+        <w:tblBorders>
+          <w:top w:val="single" w:color="auto" w:sz="4"/>
+          <w:left w:val="single" w:color="auto" w:sz="4"/>
+          <w:bottom w:val="single" w:color="auto" w:sz="4"/>
+          <w:right w:val="single" w:color="auto" w:sz="4"/>
+          <w:insideH w:val="single" w:color="auto" w:sz="4"/>
+          <w:insideV w:val="single" w:color="auto" w:sz="4"/>
+        </w:tblBorders>
+      </w:tblPr>
+      <w:tblGrid>
+        <w:gridCol w:w="3400"/>
+        <w:gridCol w:w="5960"/>
+      </w:tblGrid>
+      <w:tr>
+        <w:trPr>
+          <w:tblHeader/>
+        </w:trPr>
+        <w:tc>
+          <w:tcPr>
+            <w:tcW w:type="dxa" w:w="3400"/>
+            <w:tcBorders>
+              <w:top w:val="single" w:color="BFC8D4" w:sz="4"/>
+              <w:left w:val="single" w:color="BFC8D4" w:sz="4"/>
+              <w:bottom w:val="single" w:color="BFC8D4" w:sz="4"/>
+              <w:right w:val="single" w:color="BFC8D4" w:sz="4"/>
+            </w:tcBorders>
+            <w:shd w:fill="1F4E79" w:color="auto" w:val="clear"/>
+            <w:tcMar>
+              <w:top w:type="dxa" w:w="60"/>
+              <w:left w:type="dxa" w:w="100"/>
+              <w:bottom w:type="dxa" w:w="60"/>
+              <w:right w:type="dxa" w:w="100"/>
+            </w:tcMar>
+          </w:tcPr>
+          <w:p>
+            <w:r>
+              <w:rPr>
+                <w:rFonts w:ascii="Calibri" w:cs="Calibri" w:eastAsia="Calibri" w:hAnsi="Calibri"/>
+                <w:b/>
+                <w:bCs/>
+                <w:color w:val="FFFFFF"/>
+                <w:sz w:val="19"/>
+                <w:szCs w:val="19"/>
+              </w:rPr>
+              <w:t xml:space="preserve">Qué ve</w:t>
+            </w:r>
+          </w:p>
+        </w:tc>
+        <w:tc>
+          <w:tcPr>
+            <w:tcW w:type="dxa" w:w="5960"/>
+            <w:tcBorders>
+              <w:top w:val="single" w:color="BFC8D4" w:sz="4"/>
+              <w:left w:val="single" w:color="BFC8D4" w:sz="4"/>
+              <w:bottom w:val="single" w:color="BFC8D4" w:sz="4"/>
+              <w:right w:val="single" w:color="BFC8D4" w:sz="4"/>
+            </w:tcBorders>
+            <w:shd w:fill="1F4E79" w:color="auto" w:val="clear"/>
+            <w:tcMar>
+              <w:top w:type="dxa" w:w="60"/>
+              <w:left w:type="dxa" w:w="100"/>
+              <w:bottom w:type="dxa" w:w="60"/>
+              <w:right w:type="dxa" w:w="100"/>
+            </w:tcMar>
+          </w:tcPr>
+          <w:p>
+            <w:r>
+              <w:rPr>
+                <w:rFonts w:ascii="Calibri" w:cs="Calibri" w:eastAsia="Calibri" w:hAnsi="Calibri"/>
+                <w:b/>
+                <w:bCs/>
+                <w:color w:val="FFFFFF"/>
+                <w:sz w:val="19"/>
+                <w:szCs w:val="19"/>
+              </w:rPr>
+              <w:t xml:space="preserve">Qué hacer</w:t>
+            </w:r>
+          </w:p>
+        </w:tc>
+      </w:tr>
+      <w:tr>
+        <w:trPr>
+          <w:cantSplit/>
+        </w:trPr>
+        <w:tc>
+          <w:tcPr>
+            <w:tcW w:type="dxa" w:w="3400"/>
+            <w:tcBorders>
+              <w:top w:val="single" w:color="BFC8D4" w:sz="4"/>
+              <w:left w:val="single" w:color="BFC8D4" w:sz="4"/>
+              <w:bottom w:val="single" w:color="BFC8D4" w:sz="4"/>
+              <w:right w:val="single" w:color="BFC8D4" w:sz="4"/>
+            </w:tcBorders>
+            <w:tcMar>
+              <w:top w:type="dxa" w:w="60"/>
+              <w:left w:type="dxa" w:w="100"/>
+              <w:bottom w:type="dxa" w:w="60"/>
+              <w:right w:type="dxa" w:w="100"/>
+            </w:tcMar>
+          </w:tcPr>
+          <w:p>
+            <w:r>
+              <w:rPr>
+                <w:rFonts w:ascii="Calibri" w:cs="Calibri" w:eastAsia="Calibri" w:hAnsi="Calibri"/>
+              </w:rPr>
+              <w:t xml:space="preserve">«Su Windows no tiene winget»</w:t>
+            </w:r>
+          </w:p>
+        </w:tc>
+        <w:tc>
+          <w:tcPr>
+            <w:tcW w:type="dxa" w:w="5960"/>
+            <w:tcBorders>
+              <w:top w:val="single" w:color="BFC8D4" w:sz="4"/>
+              <w:left w:val="single" w:color="BFC8D4" w:sz="4"/>
+              <w:bottom w:val="single" w:color="BFC8D4" w:sz="4"/>
+              <w:right w:val="single" w:color="BFC8D4" w:sz="4"/>
+            </w:tcBorders>
+            <w:tcMar>
+              <w:top w:type="dxa" w:w="60"/>
+              <w:left w:type="dxa" w:w="100"/>
+              <w:bottom w:type="dxa" w:w="60"/>
+              <w:right w:type="dxa" w:w="100"/>
+            </w:tcMar>
+          </w:tcPr>
+          <w:p>
+            <w:r>
+              <w:rPr>
+                <w:rFonts w:ascii="Calibri" w:cs="Calibri" w:eastAsia="Calibri" w:hAnsi="Calibri"/>
+              </w:rPr>
+              <w:t xml:space="preserve">Instale a mano </w:t>
+            </w:r>
+            <w:r>
+              <w:rPr>
+                <w:rFonts w:ascii="Calibri" w:cs="Calibri" w:eastAsia="Calibri" w:hAnsi="Calibri"/>
+                <w:b/>
+                <w:bCs/>
+              </w:rPr>
+              <w:t xml:space="preserve">Python 3.12</w:t>
+            </w:r>
+            <w:r>
+              <w:rPr>
+                <w:rFonts w:ascii="Calibri" w:cs="Calibri" w:eastAsia="Calibri" w:hAnsi="Calibri"/>
+              </w:rPr>
+              <w:t xml:space="preserve"> (python.org, marcando «Add python.exe to PATH») y </w:t>
+            </w:r>
+            <w:r>
+              <w:rPr>
+                <w:rFonts w:ascii="Calibri" w:cs="Calibri" w:eastAsia="Calibri" w:hAnsi="Calibri"/>
+                <w:b/>
+                <w:bCs/>
+              </w:rPr>
+              <w:t xml:space="preserve">Node.js LTS</w:t>
+            </w:r>
+            <w:r>
+              <w:rPr>
+                <w:rFonts w:ascii="Calibri" w:cs="Calibri" w:eastAsia="Calibri" w:hAnsi="Calibri"/>
+              </w:rPr>
+              <w:t xml:space="preserve"> (nodejs.org) y repita el doble clic.</w:t>
+            </w:r>
+          </w:p>
+        </w:tc>
+      </w:tr>
+      <w:tr>
+        <w:trPr>
+          <w:cantSplit/>
+        </w:trPr>
+        <w:tc>
+          <w:tcPr>
+            <w:tcW w:type="dxa" w:w="3400"/>
+            <w:tcBorders>
+              <w:top w:val="single" w:color="BFC8D4" w:sz="4"/>
+              <w:left w:val="single" w:color="BFC8D4" w:sz="4"/>
+              <w:bottom w:val="single" w:color="BFC8D4" w:sz="4"/>
+              <w:right w:val="single" w:color="BFC8D4" w:sz="4"/>
+            </w:tcBorders>
+            <w:tcMar>
+              <w:top w:type="dxa" w:w="60"/>
+              <w:left w:type="dxa" w:w="100"/>
+              <w:bottom w:type="dxa" w:w="60"/>
+              <w:right w:type="dxa" w:w="100"/>
+            </w:tcMar>
+          </w:tcPr>
+          <w:p>
+            <w:r>
+              <w:rPr>
+                <w:rFonts w:ascii="Calibri" w:cs="Calibri" w:eastAsia="Calibri" w:hAnsi="Calibri"/>
+              </w:rPr>
+              <w:t xml:space="preserve">Error rojo durante la instalación</w:t>
+            </w:r>
+          </w:p>
+        </w:tc>
+        <w:tc>
+          <w:tcPr>
+            <w:tcW w:type="dxa" w:w="5960"/>
+            <w:tcBorders>
+              <w:top w:val="single" w:color="BFC8D4" w:sz="4"/>
+              <w:left w:val="single" w:color="BFC8D4" w:sz="4"/>
+              <w:bottom w:val="single" w:color="BFC8D4" w:sz="4"/>
+              <w:right w:val="single" w:color="BFC8D4" w:sz="4"/>
+            </w:tcBorders>
+            <w:tcMar>
+              <w:top w:type="dxa" w:w="60"/>
+              <w:left w:type="dxa" w:w="100"/>
+              <w:bottom w:type="dxa" w:w="60"/>
+              <w:right w:type="dxa" w:w="100"/>
+            </w:tcMar>
+          </w:tcPr>
+          <w:p>
+            <w:r>
+              <w:rPr>
+                <w:rFonts w:ascii="Calibri" w:cs="Calibri" w:eastAsia="Calibri" w:hAnsi="Calibri"/>
+              </w:rPr>
+              <w:t xml:space="preserve">Revise su conexión a internet y repita el doble clic; el programa continúa donde se quedó.</w:t>
+            </w:r>
+          </w:p>
+        </w:tc>
+      </w:tr>
+      <w:tr>
+        <w:trPr>
+          <w:cantSplit/>
+        </w:trPr>
+        <w:tc>
+          <w:tcPr>
+            <w:tcW w:type="dxa" w:w="3400"/>
+            <w:tcBorders>
+              <w:top w:val="single" w:color="BFC8D4" w:sz="4"/>
+              <w:left w:val="single" w:color="BFC8D4" w:sz="4"/>
+              <w:bottom w:val="single" w:color="BFC8D4" w:sz="4"/>
+              <w:right w:val="single" w:color="BFC8D4" w:sz="4"/>
+            </w:tcBorders>
+            <w:tcMar>
+              <w:top w:type="dxa" w:w="60"/>
+              <w:left w:type="dxa" w:w="100"/>
+              <w:bottom w:type="dxa" w:w="60"/>
+              <w:right w:type="dxa" w:w="100"/>
+            </w:tcMar>
+          </w:tcPr>
+          <w:p>
+            <w:r>
+              <w:rPr>
+                <w:rFonts w:ascii="Calibri" w:cs="Calibri" w:eastAsia="Calibri" w:hAnsi="Calibri"/>
+              </w:rPr>
+              <w:t xml:space="preserve">El navegador no abre</w:t>
+            </w:r>
+          </w:p>
+        </w:tc>
+        <w:tc>
+          <w:tcPr>
+            <w:tcW w:type="dxa" w:w="5960"/>
+            <w:tcBorders>
+              <w:top w:val="single" w:color="BFC8D4" w:sz="4"/>
+              <w:left w:val="single" w:color="BFC8D4" w:sz="4"/>
+              <w:bottom w:val="single" w:color="BFC8D4" w:sz="4"/>
+              <w:right w:val="single" w:color="BFC8D4" w:sz="4"/>
+            </w:tcBorders>
+            <w:tcMar>
+              <w:top w:type="dxa" w:w="60"/>
+              <w:left w:type="dxa" w:w="100"/>
+              <w:bottom w:type="dxa" w:w="60"/>
+              <w:right w:type="dxa" w:w="100"/>
+            </w:tcMar>
+          </w:tcPr>
+          <w:p>
+            <w:r>
+              <w:rPr>
+                <w:rFonts w:ascii="Calibri" w:cs="Calibri" w:eastAsia="Calibri" w:hAnsi="Calibri"/>
+              </w:rPr>
+              <w:t xml:space="preserve">Escriba </w:t>
+            </w:r>
+            <w:r>
+              <w:rPr>
+                <w:rFonts w:ascii="Consolas" w:cs="Consolas" w:eastAsia="Consolas" w:hAnsi="Consolas"/>
+                <w:color w:val="7A1F1F"/>
+                <w:sz w:val="20"/>
+                <w:szCs w:val="20"/>
+              </w:rPr>
+              <w:t xml:space="preserve">http://localhost:3000</w:t>
+            </w:r>
+            <w:r>
+              <w:rPr>
+                <w:rFonts w:ascii="Calibri" w:cs="Calibri" w:eastAsia="Calibri" w:hAnsi="Calibri"/>
+              </w:rPr>
+              <w:t xml:space="preserve"> en la barra de direcciones.</w:t>
+            </w:r>
+          </w:p>
+        </w:tc>
+      </w:tr>
+      <w:tr>
+        <w:trPr>
+          <w:cantSplit/>
+        </w:trPr>
+        <w:tc>
+          <w:tcPr>
+            <w:tcW w:type="dxa" w:w="3400"/>
+            <w:tcBorders>
+              <w:top w:val="single" w:color="BFC8D4" w:sz="4"/>
+              <w:left w:val="single" w:color="BFC8D4" w:sz="4"/>
+              <w:bottom w:val="single" w:color="BFC8D4" w:sz="4"/>
+              <w:right w:val="single" w:color="BFC8D4" w:sz="4"/>
+            </w:tcBorders>
+            <w:tcMar>
+              <w:top w:type="dxa" w:w="60"/>
+              <w:left w:type="dxa" w:w="100"/>
+              <w:bottom w:type="dxa" w:w="60"/>
+              <w:right w:type="dxa" w:w="100"/>
+            </w:tcMar>
+          </w:tcPr>
+          <w:p>
+            <w:r>
+              <w:rPr>
+                <w:rFonts w:ascii="Calibri" w:cs="Calibri" w:eastAsia="Calibri" w:hAnsi="Calibri"/>
+              </w:rPr>
+              <w:t xml:space="preserve">Sigue sin funcionar</w:t>
+            </w:r>
+          </w:p>
+        </w:tc>
+        <w:tc>
+          <w:tcPr>
+            <w:tcW w:type="dxa" w:w="5960"/>
+            <w:tcBorders>
+              <w:top w:val="single" w:color="BFC8D4" w:sz="4"/>
+              <w:left w:val="single" w:color="BFC8D4" w:sz="4"/>
+              <w:bottom w:val="single" w:color="BFC8D4" w:sz="4"/>
+              <w:right w:val="single" w:color="BFC8D4" w:sz="4"/>
+            </w:tcBorders>
+            <w:tcMar>
+              <w:top w:type="dxa" w:w="60"/>
+              <w:left w:type="dxa" w:w="100"/>
+              <w:bottom w:type="dxa" w:w="60"/>
+              <w:right w:type="dxa" w:w="100"/>
+            </w:tcMar>
+          </w:tcPr>
+          <w:p>
+            <w:r>
+              <w:rPr>
+                <w:rFonts w:ascii="Calibri" w:cs="Calibri" w:eastAsia="Calibri" w:hAnsi="Calibri"/>
+              </w:rPr>
+              <w:t xml:space="preserve">Envíe una captura de la ventana azul y los archivos de la carpeta </w:t>
+            </w:r>
+            <w:r>
+              <w:rPr>
+                <w:rFonts w:ascii="Consolas" w:cs="Consolas" w:eastAsia="Consolas" w:hAnsi="Consolas"/>
+                <w:color w:val="7A1F1F"/>
+                <w:sz w:val="20"/>
+                <w:szCs w:val="20"/>
+              </w:rPr>
+              <w:t xml:space="preserve">sicom-muni\.local\logs</w:t>
+            </w:r>
+            <w:r>
+              <w:rPr>
+                <w:rFonts w:ascii="Calibri" w:cs="Calibri" w:eastAsia="Calibri" w:hAnsi="Calibri"/>
+              </w:rPr>
+              <w:t xml:space="preserve">.</w:t>
+            </w:r>
+          </w:p>
+        </w:tc>
+      </w:tr>
+    </w:tbl>
+    <w:p>
+      <w:pPr>
+        <w:spacing w:after="160"/>
+      </w:pPr>
+    </w:p>
+    <w:p>
+      <w:pPr>
+        <w:pStyle w:val="Heading1"/>
+        <w:pageBreakBefore/>
+      </w:pPr>
+      <w:r>
+        <w:rPr>
+          <w:rFonts w:ascii="Calibri" w:cs="Calibri" w:eastAsia="Calibri" w:hAnsi="Calibri"/>
+        </w:rPr>
         <w:t xml:space="preserve">PARTE 2 — Probar el sistema paso a paso</w:t>
       </w:r>
     </w:p>
@@ -13339,6 +14826,1288 @@
         <w:rPr>
           <w:rFonts w:ascii="Calibri" w:cs="Calibri" w:eastAsia="Calibri" w:hAnsi="Calibri"/>
         </w:rPr>
+        <w:t xml:space="preserve">Cómo se trabajará de forma oficial</w:t>
+      </w:r>
+    </w:p>
+    <w:p>
+      <w:pPr>
+        <w:spacing w:after="120"/>
+      </w:pPr>
+      <w:r>
+        <w:rPr>
+          <w:rFonts w:ascii="Calibri" w:cs="Calibri" w:eastAsia="Calibri" w:hAnsi="Calibri"/>
+        </w:rPr>
+        <w:t xml:space="preserve">Las dos formas de prueba (Docker en su PC y «sin Docker») son para </w:t>
+      </w:r>
+      <w:r>
+        <w:rPr>
+          <w:rFonts w:ascii="Calibri" w:cs="Calibri" w:eastAsia="Calibri" w:hAnsi="Calibri"/>
+          <w:b/>
+          <w:bCs/>
+        </w:rPr>
+        <w:t xml:space="preserve">conocer</w:t>
+      </w:r>
+      <w:r>
+        <w:rPr>
+          <w:rFonts w:ascii="Calibri" w:cs="Calibri" w:eastAsia="Calibri" w:hAnsi="Calibri"/>
+        </w:rPr>
+        <w:t xml:space="preserve"> el sistema. En el uso real </w:t>
+      </w:r>
+      <w:r>
+        <w:rPr>
+          <w:rFonts w:ascii="Calibri" w:cs="Calibri" w:eastAsia="Calibri" w:hAnsi="Calibri"/>
+          <w:b/>
+          <w:bCs/>
+        </w:rPr>
+        <w:t xml:space="preserve">no se instala en cada computador</w:t>
+      </w:r>
+      <w:r>
+        <w:rPr>
+          <w:rFonts w:ascii="Calibri" w:cs="Calibri" w:eastAsia="Calibri" w:hAnsi="Calibri"/>
+        </w:rPr>
+        <w:t xml:space="preserve">: se instala </w:t>
+      </w:r>
+      <w:r>
+        <w:rPr>
+          <w:rFonts w:ascii="Calibri" w:cs="Calibri" w:eastAsia="Calibri" w:hAnsi="Calibri"/>
+          <w:b/>
+          <w:bCs/>
+        </w:rPr>
+        <w:t xml:space="preserve">una sola vez en un servidor</w:t>
+      </w:r>
+      <w:r>
+        <w:rPr>
+          <w:rFonts w:ascii="Calibri" w:cs="Calibri" w:eastAsia="Calibri" w:hAnsi="Calibri"/>
+        </w:rPr>
+        <w:t xml:space="preserve"> de la entidad y todos los funcionarios entran con su navegador a una dirección propia, por ejemplo </w:t>
+      </w:r>
+      <w:r>
+        <w:rPr>
+          <w:rFonts w:ascii="Consolas" w:cs="Consolas" w:eastAsia="Consolas" w:hAnsi="Consolas"/>
+          <w:color w:val="7A1F1F"/>
+          <w:sz w:val="20"/>
+          <w:szCs w:val="20"/>
+        </w:rPr>
+        <w:t xml:space="preserve">https://sicom.micomuna.gob.bo</w:t>
+      </w:r>
+      <w:r>
+        <w:rPr>
+          <w:rFonts w:ascii="Calibri" w:cs="Calibri" w:eastAsia="Calibri" w:hAnsi="Calibri"/>
+        </w:rPr>
+        <w:t xml:space="preserve">.</w:t>
+      </w:r>
+    </w:p>
+    <w:p>
+      <w:pPr>
+        <w:shd w:fill="1E1E1E" w:color="auto" w:val="clear"/>
+        <w:spacing w:after="0"/>
+        <w:ind w:left="120" w:right="120"/>
+      </w:pPr>
+      <w:r>
+        <w:rPr>
+          <w:rFonts w:ascii="Consolas" w:cs="Consolas" w:eastAsia="Consolas" w:hAnsi="Consolas"/>
+          <w:color w:val="D4D4D4"/>
+          <w:sz w:val="18"/>
+          <w:szCs w:val="18"/>
+        </w:rPr>
+        <w:t xml:space="preserve">PC de funcionarios (solo navegador) --HTTPS--&gt; Servidor SICOM-MUNI --&gt; Base de datos PostgreSQL + archivos</w:t>
+      </w:r>
+    </w:p>
+    <w:p>
+      <w:pPr>
+        <w:shd w:fill="1E1E1E" w:color="auto" w:val="clear"/>
+        <w:spacing w:after="160"/>
+        <w:ind w:left="120" w:right="120"/>
+      </w:pPr>
+      <w:r>
+        <w:rPr>
+          <w:rFonts w:ascii="Consolas" w:cs="Consolas" w:eastAsia="Consolas" w:hAnsi="Consolas"/>
+          <w:color w:val="D4D4D4"/>
+          <w:sz w:val="18"/>
+          <w:szCs w:val="18"/>
+        </w:rPr>
+        <w:t xml:space="preserve">  solicitante, presupuesto, rpa ...               (a cargo del área de Sistemas)        (con respaldo diario)</w:t>
+      </w:r>
+    </w:p>
+    <w:p>
+      <w:pPr>
+        <w:pStyle w:val="Heading2"/>
+      </w:pPr>
+      <w:r>
+        <w:rPr>
+          <w:rFonts w:ascii="Calibri" w:cs="Calibri" w:eastAsia="Calibri" w:hAnsi="Calibri"/>
+        </w:rPr>
+        <w:t xml:space="preserve">Qué debe hacer la entidad</w:t>
+      </w:r>
+    </w:p>
+    <w:tbl>
+      <w:tblPr>
+        <w:tblW w:type="dxa" w:w="9360"/>
+        <w:tblBorders>
+          <w:top w:val="single" w:color="auto" w:sz="4"/>
+          <w:left w:val="single" w:color="auto" w:sz="4"/>
+          <w:bottom w:val="single" w:color="auto" w:sz="4"/>
+          <w:right w:val="single" w:color="auto" w:sz="4"/>
+          <w:insideH w:val="single" w:color="auto" w:sz="4"/>
+          <w:insideV w:val="single" w:color="auto" w:sz="4"/>
+        </w:tblBorders>
+      </w:tblPr>
+      <w:tblGrid>
+        <w:gridCol w:w="500"/>
+        <w:gridCol w:w="6760"/>
+        <w:gridCol w:w="2100"/>
+      </w:tblGrid>
+      <w:tr>
+        <w:trPr>
+          <w:tblHeader/>
+        </w:trPr>
+        <w:tc>
+          <w:tcPr>
+            <w:tcW w:type="dxa" w:w="500"/>
+            <w:tcBorders>
+              <w:top w:val="single" w:color="BFC8D4" w:sz="4"/>
+              <w:left w:val="single" w:color="BFC8D4" w:sz="4"/>
+              <w:bottom w:val="single" w:color="BFC8D4" w:sz="4"/>
+              <w:right w:val="single" w:color="BFC8D4" w:sz="4"/>
+            </w:tcBorders>
+            <w:shd w:fill="1F4E79" w:color="auto" w:val="clear"/>
+            <w:tcMar>
+              <w:top w:type="dxa" w:w="60"/>
+              <w:left w:type="dxa" w:w="100"/>
+              <w:bottom w:type="dxa" w:w="60"/>
+              <w:right w:type="dxa" w:w="100"/>
+            </w:tcMar>
+          </w:tcPr>
+          <w:p>
+            <w:r>
+              <w:rPr>
+                <w:rFonts w:ascii="Calibri" w:cs="Calibri" w:eastAsia="Calibri" w:hAnsi="Calibri"/>
+                <w:b/>
+                <w:bCs/>
+                <w:color w:val="FFFFFF"/>
+                <w:sz w:val="19"/>
+                <w:szCs w:val="19"/>
+              </w:rPr>
+              <w:t xml:space="preserve">#</w:t>
+            </w:r>
+          </w:p>
+        </w:tc>
+        <w:tc>
+          <w:tcPr>
+            <w:tcW w:type="dxa" w:w="6760"/>
+            <w:tcBorders>
+              <w:top w:val="single" w:color="BFC8D4" w:sz="4"/>
+              <w:left w:val="single" w:color="BFC8D4" w:sz="4"/>
+              <w:bottom w:val="single" w:color="BFC8D4" w:sz="4"/>
+              <w:right w:val="single" w:color="BFC8D4" w:sz="4"/>
+            </w:tcBorders>
+            <w:shd w:fill="1F4E79" w:color="auto" w:val="clear"/>
+            <w:tcMar>
+              <w:top w:type="dxa" w:w="60"/>
+              <w:left w:type="dxa" w:w="100"/>
+              <w:bottom w:type="dxa" w:w="60"/>
+              <w:right w:type="dxa" w:w="100"/>
+            </w:tcMar>
+          </w:tcPr>
+          <w:p>
+            <w:r>
+              <w:rPr>
+                <w:rFonts w:ascii="Calibri" w:cs="Calibri" w:eastAsia="Calibri" w:hAnsi="Calibri"/>
+                <w:b/>
+                <w:bCs/>
+                <w:color w:val="FFFFFF"/>
+                <w:sz w:val="19"/>
+                <w:szCs w:val="19"/>
+              </w:rPr>
+              <w:t xml:space="preserve">Qué</w:t>
+            </w:r>
+          </w:p>
+        </w:tc>
+        <w:tc>
+          <w:tcPr>
+            <w:tcW w:type="dxa" w:w="2100"/>
+            <w:tcBorders>
+              <w:top w:val="single" w:color="BFC8D4" w:sz="4"/>
+              <w:left w:val="single" w:color="BFC8D4" w:sz="4"/>
+              <w:bottom w:val="single" w:color="BFC8D4" w:sz="4"/>
+              <w:right w:val="single" w:color="BFC8D4" w:sz="4"/>
+            </w:tcBorders>
+            <w:shd w:fill="1F4E79" w:color="auto" w:val="clear"/>
+            <w:tcMar>
+              <w:top w:type="dxa" w:w="60"/>
+              <w:left w:type="dxa" w:w="100"/>
+              <w:bottom w:type="dxa" w:w="60"/>
+              <w:right w:type="dxa" w:w="100"/>
+            </w:tcMar>
+          </w:tcPr>
+          <w:p>
+            <w:r>
+              <w:rPr>
+                <w:rFonts w:ascii="Calibri" w:cs="Calibri" w:eastAsia="Calibri" w:hAnsi="Calibri"/>
+                <w:b/>
+                <w:bCs/>
+                <w:color w:val="FFFFFF"/>
+                <w:sz w:val="19"/>
+                <w:szCs w:val="19"/>
+              </w:rPr>
+              <w:t xml:space="preserve">Quién</w:t>
+            </w:r>
+          </w:p>
+        </w:tc>
+      </w:tr>
+      <w:tr>
+        <w:trPr>
+          <w:cantSplit/>
+        </w:trPr>
+        <w:tc>
+          <w:tcPr>
+            <w:tcW w:type="dxa" w:w="500"/>
+            <w:tcBorders>
+              <w:top w:val="single" w:color="BFC8D4" w:sz="4"/>
+              <w:left w:val="single" w:color="BFC8D4" w:sz="4"/>
+              <w:bottom w:val="single" w:color="BFC8D4" w:sz="4"/>
+              <w:right w:val="single" w:color="BFC8D4" w:sz="4"/>
+            </w:tcBorders>
+            <w:tcMar>
+              <w:top w:type="dxa" w:w="60"/>
+              <w:left w:type="dxa" w:w="100"/>
+              <w:bottom w:type="dxa" w:w="60"/>
+              <w:right w:type="dxa" w:w="100"/>
+            </w:tcMar>
+          </w:tcPr>
+          <w:p>
+            <w:r>
+              <w:rPr>
+                <w:rFonts w:ascii="Calibri" w:cs="Calibri" w:eastAsia="Calibri" w:hAnsi="Calibri"/>
+              </w:rPr>
+              <w:t xml:space="preserve">1</w:t>
+            </w:r>
+          </w:p>
+        </w:tc>
+        <w:tc>
+          <w:tcPr>
+            <w:tcW w:type="dxa" w:w="6760"/>
+            <w:tcBorders>
+              <w:top w:val="single" w:color="BFC8D4" w:sz="4"/>
+              <w:left w:val="single" w:color="BFC8D4" w:sz="4"/>
+              <w:bottom w:val="single" w:color="BFC8D4" w:sz="4"/>
+              <w:right w:val="single" w:color="BFC8D4" w:sz="4"/>
+            </w:tcBorders>
+            <w:tcMar>
+              <w:top w:type="dxa" w:w="60"/>
+              <w:left w:type="dxa" w:w="100"/>
+              <w:bottom w:type="dxa" w:w="60"/>
+              <w:right w:type="dxa" w:w="100"/>
+            </w:tcMar>
+          </w:tcPr>
+          <w:p>
+            <w:r>
+              <w:rPr>
+                <w:rFonts w:ascii="Calibri" w:cs="Calibri" w:eastAsia="Calibri" w:hAnsi="Calibri"/>
+              </w:rPr>
+              <w:t xml:space="preserve">Conseguir un servidor o máquina virtual (Ubuntu Server, 2 CPU, 4 GB RAM, 50 GB de disco como mínimo). Alternativa: servidor en la nube, previa aprobación legal.</w:t>
+            </w:r>
+          </w:p>
+        </w:tc>
+        <w:tc>
+          <w:tcPr>
+            <w:tcW w:type="dxa" w:w="2100"/>
+            <w:tcBorders>
+              <w:top w:val="single" w:color="BFC8D4" w:sz="4"/>
+              <w:left w:val="single" w:color="BFC8D4" w:sz="4"/>
+              <w:bottom w:val="single" w:color="BFC8D4" w:sz="4"/>
+              <w:right w:val="single" w:color="BFC8D4" w:sz="4"/>
+            </w:tcBorders>
+            <w:tcMar>
+              <w:top w:type="dxa" w:w="60"/>
+              <w:left w:type="dxa" w:w="100"/>
+              <w:bottom w:type="dxa" w:w="60"/>
+              <w:right w:type="dxa" w:w="100"/>
+            </w:tcMar>
+          </w:tcPr>
+          <w:p>
+            <w:r>
+              <w:rPr>
+                <w:rFonts w:ascii="Calibri" w:cs="Calibri" w:eastAsia="Calibri" w:hAnsi="Calibri"/>
+              </w:rPr>
+              <w:t xml:space="preserve">Sistemas</w:t>
+            </w:r>
+          </w:p>
+        </w:tc>
+      </w:tr>
+      <w:tr>
+        <w:trPr>
+          <w:cantSplit/>
+        </w:trPr>
+        <w:tc>
+          <w:tcPr>
+            <w:tcW w:type="dxa" w:w="500"/>
+            <w:tcBorders>
+              <w:top w:val="single" w:color="BFC8D4" w:sz="4"/>
+              <w:left w:val="single" w:color="BFC8D4" w:sz="4"/>
+              <w:bottom w:val="single" w:color="BFC8D4" w:sz="4"/>
+              <w:right w:val="single" w:color="BFC8D4" w:sz="4"/>
+            </w:tcBorders>
+            <w:tcMar>
+              <w:top w:type="dxa" w:w="60"/>
+              <w:left w:type="dxa" w:w="100"/>
+              <w:bottom w:type="dxa" w:w="60"/>
+              <w:right w:type="dxa" w:w="100"/>
+            </w:tcMar>
+          </w:tcPr>
+          <w:p>
+            <w:r>
+              <w:rPr>
+                <w:rFonts w:ascii="Calibri" w:cs="Calibri" w:eastAsia="Calibri" w:hAnsi="Calibri"/>
+              </w:rPr>
+              <w:t xml:space="preserve">2</w:t>
+            </w:r>
+          </w:p>
+        </w:tc>
+        <w:tc>
+          <w:tcPr>
+            <w:tcW w:type="dxa" w:w="6760"/>
+            <w:tcBorders>
+              <w:top w:val="single" w:color="BFC8D4" w:sz="4"/>
+              <w:left w:val="single" w:color="BFC8D4" w:sz="4"/>
+              <w:bottom w:val="single" w:color="BFC8D4" w:sz="4"/>
+              <w:right w:val="single" w:color="BFC8D4" w:sz="4"/>
+            </w:tcBorders>
+            <w:tcMar>
+              <w:top w:type="dxa" w:w="60"/>
+              <w:left w:type="dxa" w:w="100"/>
+              <w:bottom w:type="dxa" w:w="60"/>
+              <w:right w:type="dxa" w:w="100"/>
+            </w:tcMar>
+          </w:tcPr>
+          <w:p>
+            <w:r>
+              <w:rPr>
+                <w:rFonts w:ascii="Calibri" w:cs="Calibri" w:eastAsia="Calibri" w:hAnsi="Calibri"/>
+              </w:rPr>
+              <w:t xml:space="preserve">Instalar Docker en ese servidor (allí no hay el problema de virtualización de las PC con Windows) y poner el sistema con </w:t>
+            </w:r>
+            <w:r>
+              <w:rPr>
+                <w:rFonts w:ascii="Consolas" w:cs="Consolas" w:eastAsia="Consolas" w:hAnsi="Consolas"/>
+                <w:color w:val="7A1F1F"/>
+                <w:sz w:val="20"/>
+                <w:szCs w:val="20"/>
+              </w:rPr>
+              <w:t xml:space="preserve">docker compose</w:t>
+            </w:r>
+            <w:r>
+              <w:rPr>
+                <w:rFonts w:ascii="Calibri" w:cs="Calibri" w:eastAsia="Calibri" w:hAnsi="Calibri"/>
+              </w:rPr>
+              <w:t xml:space="preserve">.</w:t>
+            </w:r>
+          </w:p>
+        </w:tc>
+        <w:tc>
+          <w:tcPr>
+            <w:tcW w:type="dxa" w:w="2100"/>
+            <w:tcBorders>
+              <w:top w:val="single" w:color="BFC8D4" w:sz="4"/>
+              <w:left w:val="single" w:color="BFC8D4" w:sz="4"/>
+              <w:bottom w:val="single" w:color="BFC8D4" w:sz="4"/>
+              <w:right w:val="single" w:color="BFC8D4" w:sz="4"/>
+            </w:tcBorders>
+            <w:tcMar>
+              <w:top w:type="dxa" w:w="60"/>
+              <w:left w:type="dxa" w:w="100"/>
+              <w:bottom w:type="dxa" w:w="60"/>
+              <w:right w:type="dxa" w:w="100"/>
+            </w:tcMar>
+          </w:tcPr>
+          <w:p>
+            <w:r>
+              <w:rPr>
+                <w:rFonts w:ascii="Calibri" w:cs="Calibri" w:eastAsia="Calibri" w:hAnsi="Calibri"/>
+              </w:rPr>
+              <w:t xml:space="preserve">Sistemas</w:t>
+            </w:r>
+          </w:p>
+        </w:tc>
+      </w:tr>
+      <w:tr>
+        <w:trPr>
+          <w:cantSplit/>
+        </w:trPr>
+        <w:tc>
+          <w:tcPr>
+            <w:tcW w:type="dxa" w:w="500"/>
+            <w:tcBorders>
+              <w:top w:val="single" w:color="BFC8D4" w:sz="4"/>
+              <w:left w:val="single" w:color="BFC8D4" w:sz="4"/>
+              <w:bottom w:val="single" w:color="BFC8D4" w:sz="4"/>
+              <w:right w:val="single" w:color="BFC8D4" w:sz="4"/>
+            </w:tcBorders>
+            <w:tcMar>
+              <w:top w:type="dxa" w:w="60"/>
+              <w:left w:type="dxa" w:w="100"/>
+              <w:bottom w:type="dxa" w:w="60"/>
+              <w:right w:type="dxa" w:w="100"/>
+            </w:tcMar>
+          </w:tcPr>
+          <w:p>
+            <w:r>
+              <w:rPr>
+                <w:rFonts w:ascii="Calibri" w:cs="Calibri" w:eastAsia="Calibri" w:hAnsi="Calibri"/>
+              </w:rPr>
+              <w:t xml:space="preserve">3</w:t>
+            </w:r>
+          </w:p>
+        </w:tc>
+        <w:tc>
+          <w:tcPr>
+            <w:tcW w:type="dxa" w:w="6760"/>
+            <w:tcBorders>
+              <w:top w:val="single" w:color="BFC8D4" w:sz="4"/>
+              <w:left w:val="single" w:color="BFC8D4" w:sz="4"/>
+              <w:bottom w:val="single" w:color="BFC8D4" w:sz="4"/>
+              <w:right w:val="single" w:color="BFC8D4" w:sz="4"/>
+            </w:tcBorders>
+            <w:tcMar>
+              <w:top w:type="dxa" w:w="60"/>
+              <w:left w:type="dxa" w:w="100"/>
+              <w:bottom w:type="dxa" w:w="60"/>
+              <w:right w:type="dxa" w:w="100"/>
+            </w:tcMar>
+          </w:tcPr>
+          <w:p>
+            <w:r>
+              <w:rPr>
+                <w:rFonts w:ascii="Calibri" w:cs="Calibri" w:eastAsia="Calibri" w:hAnsi="Calibri"/>
+              </w:rPr>
+              <w:t xml:space="preserve">Configurar </w:t>
+            </w:r>
+            <w:r>
+              <w:rPr>
+                <w:rFonts w:ascii="Calibri" w:cs="Calibri" w:eastAsia="Calibri" w:hAnsi="Calibri"/>
+                <w:b/>
+                <w:bCs/>
+              </w:rPr>
+              <w:t xml:space="preserve">HTTPS</w:t>
+            </w:r>
+            <w:r>
+              <w:rPr>
+                <w:rFonts w:ascii="Calibri" w:cs="Calibri" w:eastAsia="Calibri" w:hAnsi="Calibri"/>
+              </w:rPr>
+              <w:t xml:space="preserve"> con un certificado, un nombre de dirección oficial y claves nuevas y largas. Cerrar el acceso directo a la base de datos.</w:t>
+            </w:r>
+          </w:p>
+        </w:tc>
+        <w:tc>
+          <w:tcPr>
+            <w:tcW w:type="dxa" w:w="2100"/>
+            <w:tcBorders>
+              <w:top w:val="single" w:color="BFC8D4" w:sz="4"/>
+              <w:left w:val="single" w:color="BFC8D4" w:sz="4"/>
+              <w:bottom w:val="single" w:color="BFC8D4" w:sz="4"/>
+              <w:right w:val="single" w:color="BFC8D4" w:sz="4"/>
+            </w:tcBorders>
+            <w:tcMar>
+              <w:top w:type="dxa" w:w="60"/>
+              <w:left w:type="dxa" w:w="100"/>
+              <w:bottom w:type="dxa" w:w="60"/>
+              <w:right w:type="dxa" w:w="100"/>
+            </w:tcMar>
+          </w:tcPr>
+          <w:p>
+            <w:r>
+              <w:rPr>
+                <w:rFonts w:ascii="Calibri" w:cs="Calibri" w:eastAsia="Calibri" w:hAnsi="Calibri"/>
+              </w:rPr>
+              <w:t xml:space="preserve">Sistemas</w:t>
+            </w:r>
+          </w:p>
+        </w:tc>
+      </w:tr>
+      <w:tr>
+        <w:trPr>
+          <w:cantSplit/>
+        </w:trPr>
+        <w:tc>
+          <w:tcPr>
+            <w:tcW w:type="dxa" w:w="500"/>
+            <w:tcBorders>
+              <w:top w:val="single" w:color="BFC8D4" w:sz="4"/>
+              <w:left w:val="single" w:color="BFC8D4" w:sz="4"/>
+              <w:bottom w:val="single" w:color="BFC8D4" w:sz="4"/>
+              <w:right w:val="single" w:color="BFC8D4" w:sz="4"/>
+            </w:tcBorders>
+            <w:tcMar>
+              <w:top w:type="dxa" w:w="60"/>
+              <w:left w:type="dxa" w:w="100"/>
+              <w:bottom w:type="dxa" w:w="60"/>
+              <w:right w:type="dxa" w:w="100"/>
+            </w:tcMar>
+          </w:tcPr>
+          <w:p>
+            <w:r>
+              <w:rPr>
+                <w:rFonts w:ascii="Calibri" w:cs="Calibri" w:eastAsia="Calibri" w:hAnsi="Calibri"/>
+              </w:rPr>
+              <w:t xml:space="preserve">4</w:t>
+            </w:r>
+          </w:p>
+        </w:tc>
+        <w:tc>
+          <w:tcPr>
+            <w:tcW w:type="dxa" w:w="6760"/>
+            <w:tcBorders>
+              <w:top w:val="single" w:color="BFC8D4" w:sz="4"/>
+              <w:left w:val="single" w:color="BFC8D4" w:sz="4"/>
+              <w:bottom w:val="single" w:color="BFC8D4" w:sz="4"/>
+              <w:right w:val="single" w:color="BFC8D4" w:sz="4"/>
+            </w:tcBorders>
+            <w:tcMar>
+              <w:top w:type="dxa" w:w="60"/>
+              <w:left w:type="dxa" w:w="100"/>
+              <w:bottom w:type="dxa" w:w="60"/>
+              <w:right w:type="dxa" w:w="100"/>
+            </w:tcMar>
+          </w:tcPr>
+          <w:p>
+            <w:r>
+              <w:rPr>
+                <w:rFonts w:ascii="Calibri" w:cs="Calibri" w:eastAsia="Calibri" w:hAnsi="Calibri"/>
+              </w:rPr>
+              <w:t xml:space="preserve">Cargar los datos reales: parámetros del GAM y logotipo, partidas presupuestarias de la gestión, catálogo CHB oficial y usuarios reales (y desactivar los usuarios de demostración).</w:t>
+            </w:r>
+          </w:p>
+        </w:tc>
+        <w:tc>
+          <w:tcPr>
+            <w:tcW w:type="dxa" w:w="2100"/>
+            <w:tcBorders>
+              <w:top w:val="single" w:color="BFC8D4" w:sz="4"/>
+              <w:left w:val="single" w:color="BFC8D4" w:sz="4"/>
+              <w:bottom w:val="single" w:color="BFC8D4" w:sz="4"/>
+              <w:right w:val="single" w:color="BFC8D4" w:sz="4"/>
+            </w:tcBorders>
+            <w:tcMar>
+              <w:top w:type="dxa" w:w="60"/>
+              <w:left w:type="dxa" w:w="100"/>
+              <w:bottom w:type="dxa" w:w="60"/>
+              <w:right w:type="dxa" w:w="100"/>
+            </w:tcMar>
+          </w:tcPr>
+          <w:p>
+            <w:r>
+              <w:rPr>
+                <w:rFonts w:ascii="Calibri" w:cs="Calibri" w:eastAsia="Calibri" w:hAnsi="Calibri"/>
+              </w:rPr>
+              <w:t xml:space="preserve">Administrador del sistema</w:t>
+            </w:r>
+          </w:p>
+        </w:tc>
+      </w:tr>
+      <w:tr>
+        <w:trPr>
+          <w:cantSplit/>
+        </w:trPr>
+        <w:tc>
+          <w:tcPr>
+            <w:tcW w:type="dxa" w:w="500"/>
+            <w:tcBorders>
+              <w:top w:val="single" w:color="BFC8D4" w:sz="4"/>
+              <w:left w:val="single" w:color="BFC8D4" w:sz="4"/>
+              <w:bottom w:val="single" w:color="BFC8D4" w:sz="4"/>
+              <w:right w:val="single" w:color="BFC8D4" w:sz="4"/>
+            </w:tcBorders>
+            <w:tcMar>
+              <w:top w:type="dxa" w:w="60"/>
+              <w:left w:type="dxa" w:w="100"/>
+              <w:bottom w:type="dxa" w:w="60"/>
+              <w:right w:type="dxa" w:w="100"/>
+            </w:tcMar>
+          </w:tcPr>
+          <w:p>
+            <w:r>
+              <w:rPr>
+                <w:rFonts w:ascii="Calibri" w:cs="Calibri" w:eastAsia="Calibri" w:hAnsi="Calibri"/>
+              </w:rPr>
+              <w:t xml:space="preserve">5</w:t>
+            </w:r>
+          </w:p>
+        </w:tc>
+        <w:tc>
+          <w:tcPr>
+            <w:tcW w:type="dxa" w:w="6760"/>
+            <w:tcBorders>
+              <w:top w:val="single" w:color="BFC8D4" w:sz="4"/>
+              <w:left w:val="single" w:color="BFC8D4" w:sz="4"/>
+              <w:bottom w:val="single" w:color="BFC8D4" w:sz="4"/>
+              <w:right w:val="single" w:color="BFC8D4" w:sz="4"/>
+            </w:tcBorders>
+            <w:tcMar>
+              <w:top w:type="dxa" w:w="60"/>
+              <w:left w:type="dxa" w:w="100"/>
+              <w:bottom w:type="dxa" w:w="60"/>
+              <w:right w:type="dxa" w:w="100"/>
+            </w:tcMar>
+          </w:tcPr>
+          <w:p>
+            <w:r>
+              <w:rPr>
+                <w:rFonts w:ascii="Calibri" w:cs="Calibri" w:eastAsia="Calibri" w:hAnsi="Calibri"/>
+              </w:rPr>
+              <w:t xml:space="preserve">Programar </w:t>
+            </w:r>
+            <w:r>
+              <w:rPr>
+                <w:rFonts w:ascii="Calibri" w:cs="Calibri" w:eastAsia="Calibri" w:hAnsi="Calibri"/>
+                <w:b/>
+                <w:bCs/>
+              </w:rPr>
+              <w:t xml:space="preserve">respaldos diarios</w:t>
+            </w:r>
+            <w:r>
+              <w:rPr>
+                <w:rFonts w:ascii="Calibri" w:cs="Calibri" w:eastAsia="Calibri" w:hAnsi="Calibri"/>
+              </w:rPr>
+              <w:t xml:space="preserve"> de la base y de los PDF, guardarlos fuera del servidor y probar una restauración cada trimestre.</w:t>
+            </w:r>
+          </w:p>
+        </w:tc>
+        <w:tc>
+          <w:tcPr>
+            <w:tcW w:type="dxa" w:w="2100"/>
+            <w:tcBorders>
+              <w:top w:val="single" w:color="BFC8D4" w:sz="4"/>
+              <w:left w:val="single" w:color="BFC8D4" w:sz="4"/>
+              <w:bottom w:val="single" w:color="BFC8D4" w:sz="4"/>
+              <w:right w:val="single" w:color="BFC8D4" w:sz="4"/>
+            </w:tcBorders>
+            <w:tcMar>
+              <w:top w:type="dxa" w:w="60"/>
+              <w:left w:type="dxa" w:w="100"/>
+              <w:bottom w:type="dxa" w:w="60"/>
+              <w:right w:type="dxa" w:w="100"/>
+            </w:tcMar>
+          </w:tcPr>
+          <w:p>
+            <w:r>
+              <w:rPr>
+                <w:rFonts w:ascii="Calibri" w:cs="Calibri" w:eastAsia="Calibri" w:hAnsi="Calibri"/>
+              </w:rPr>
+              <w:t xml:space="preserve">Sistemas</w:t>
+            </w:r>
+          </w:p>
+        </w:tc>
+      </w:tr>
+      <w:tr>
+        <w:trPr>
+          <w:cantSplit/>
+        </w:trPr>
+        <w:tc>
+          <w:tcPr>
+            <w:tcW w:type="dxa" w:w="500"/>
+            <w:tcBorders>
+              <w:top w:val="single" w:color="BFC8D4" w:sz="4"/>
+              <w:left w:val="single" w:color="BFC8D4" w:sz="4"/>
+              <w:bottom w:val="single" w:color="BFC8D4" w:sz="4"/>
+              <w:right w:val="single" w:color="BFC8D4" w:sz="4"/>
+            </w:tcBorders>
+            <w:tcMar>
+              <w:top w:type="dxa" w:w="60"/>
+              <w:left w:type="dxa" w:w="100"/>
+              <w:bottom w:type="dxa" w:w="60"/>
+              <w:right w:type="dxa" w:w="100"/>
+            </w:tcMar>
+          </w:tcPr>
+          <w:p>
+            <w:r>
+              <w:rPr>
+                <w:rFonts w:ascii="Calibri" w:cs="Calibri" w:eastAsia="Calibri" w:hAnsi="Calibri"/>
+              </w:rPr>
+              <w:t xml:space="preserve">6</w:t>
+            </w:r>
+          </w:p>
+        </w:tc>
+        <w:tc>
+          <w:tcPr>
+            <w:tcW w:type="dxa" w:w="6760"/>
+            <w:tcBorders>
+              <w:top w:val="single" w:color="BFC8D4" w:sz="4"/>
+              <w:left w:val="single" w:color="BFC8D4" w:sz="4"/>
+              <w:bottom w:val="single" w:color="BFC8D4" w:sz="4"/>
+              <w:right w:val="single" w:color="BFC8D4" w:sz="4"/>
+            </w:tcBorders>
+            <w:tcMar>
+              <w:top w:type="dxa" w:w="60"/>
+              <w:left w:type="dxa" w:w="100"/>
+              <w:bottom w:type="dxa" w:w="60"/>
+              <w:right w:type="dxa" w:w="100"/>
+            </w:tcMar>
+          </w:tcPr>
+          <w:p>
+            <w:r>
+              <w:rPr>
+                <w:rFonts w:ascii="Calibri" w:cs="Calibri" w:eastAsia="Calibri" w:hAnsi="Calibri"/>
+                <w:b/>
+                <w:bCs/>
+              </w:rPr>
+              <w:t xml:space="preserve">Validar con la asesoría legal</w:t>
+            </w:r>
+            <w:r>
+              <w:rPr>
+                <w:rFonts w:ascii="Calibri" w:cs="Calibri" w:eastAsia="Calibri" w:hAnsi="Calibri"/>
+              </w:rPr>
+              <w:t xml:space="preserve"> los topes, plazos, mínimo de cotizaciones, formularios y márgenes de preferencia (se ajustan en el menú «Parámetros del GAM»). Confirmar también si los PDF con QR tienen validez por sí solos o si requieren firma.</w:t>
+            </w:r>
+          </w:p>
+        </w:tc>
+        <w:tc>
+          <w:tcPr>
+            <w:tcW w:type="dxa" w:w="2100"/>
+            <w:tcBorders>
+              <w:top w:val="single" w:color="BFC8D4" w:sz="4"/>
+              <w:left w:val="single" w:color="BFC8D4" w:sz="4"/>
+              <w:bottom w:val="single" w:color="BFC8D4" w:sz="4"/>
+              <w:right w:val="single" w:color="BFC8D4" w:sz="4"/>
+            </w:tcBorders>
+            <w:tcMar>
+              <w:top w:type="dxa" w:w="60"/>
+              <w:left w:type="dxa" w:w="100"/>
+              <w:bottom w:type="dxa" w:w="60"/>
+              <w:right w:type="dxa" w:w="100"/>
+            </w:tcMar>
+          </w:tcPr>
+          <w:p>
+            <w:r>
+              <w:rPr>
+                <w:rFonts w:ascii="Calibri" w:cs="Calibri" w:eastAsia="Calibri" w:hAnsi="Calibri"/>
+              </w:rPr>
+              <w:t xml:space="preserve">Asesoría legal</w:t>
+            </w:r>
+          </w:p>
+        </w:tc>
+      </w:tr>
+      <w:tr>
+        <w:trPr>
+          <w:cantSplit/>
+        </w:trPr>
+        <w:tc>
+          <w:tcPr>
+            <w:tcW w:type="dxa" w:w="500"/>
+            <w:tcBorders>
+              <w:top w:val="single" w:color="BFC8D4" w:sz="4"/>
+              <w:left w:val="single" w:color="BFC8D4" w:sz="4"/>
+              <w:bottom w:val="single" w:color="BFC8D4" w:sz="4"/>
+              <w:right w:val="single" w:color="BFC8D4" w:sz="4"/>
+            </w:tcBorders>
+            <w:tcMar>
+              <w:top w:type="dxa" w:w="60"/>
+              <w:left w:type="dxa" w:w="100"/>
+              <w:bottom w:type="dxa" w:w="60"/>
+              <w:right w:type="dxa" w:w="100"/>
+            </w:tcMar>
+          </w:tcPr>
+          <w:p>
+            <w:r>
+              <w:rPr>
+                <w:rFonts w:ascii="Calibri" w:cs="Calibri" w:eastAsia="Calibri" w:hAnsi="Calibri"/>
+              </w:rPr>
+              <w:t xml:space="preserve">7</w:t>
+            </w:r>
+          </w:p>
+        </w:tc>
+        <w:tc>
+          <w:tcPr>
+            <w:tcW w:type="dxa" w:w="6760"/>
+            <w:tcBorders>
+              <w:top w:val="single" w:color="BFC8D4" w:sz="4"/>
+              <w:left w:val="single" w:color="BFC8D4" w:sz="4"/>
+              <w:bottom w:val="single" w:color="BFC8D4" w:sz="4"/>
+              <w:right w:val="single" w:color="BFC8D4" w:sz="4"/>
+            </w:tcBorders>
+            <w:tcMar>
+              <w:top w:type="dxa" w:w="60"/>
+              <w:left w:type="dxa" w:w="100"/>
+              <w:bottom w:type="dxa" w:w="60"/>
+              <w:right w:type="dxa" w:w="100"/>
+            </w:tcMar>
+          </w:tcPr>
+          <w:p>
+            <w:r>
+              <w:rPr>
+                <w:rFonts w:ascii="Calibri" w:cs="Calibri" w:eastAsia="Calibri" w:hAnsi="Calibri"/>
+              </w:rPr>
+              <w:t xml:space="preserve">Aprobar el uso con una </w:t>
+            </w:r>
+            <w:r>
+              <w:rPr>
+                <w:rFonts w:ascii="Calibri" w:cs="Calibri" w:eastAsia="Calibri" w:hAnsi="Calibri"/>
+                <w:b/>
+                <w:bCs/>
+              </w:rPr>
+              <w:t xml:space="preserve">resolución o instructivo interno</w:t>
+            </w:r>
+            <w:r>
+              <w:rPr>
+                <w:rFonts w:ascii="Calibri" w:cs="Calibri" w:eastAsia="Calibri" w:hAnsi="Calibri"/>
+              </w:rPr>
+              <w:t xml:space="preserve"> y designar responsable técnico y plan de soporte.</w:t>
+            </w:r>
+          </w:p>
+        </w:tc>
+        <w:tc>
+          <w:tcPr>
+            <w:tcW w:type="dxa" w:w="2100"/>
+            <w:tcBorders>
+              <w:top w:val="single" w:color="BFC8D4" w:sz="4"/>
+              <w:left w:val="single" w:color="BFC8D4" w:sz="4"/>
+              <w:bottom w:val="single" w:color="BFC8D4" w:sz="4"/>
+              <w:right w:val="single" w:color="BFC8D4" w:sz="4"/>
+            </w:tcBorders>
+            <w:tcMar>
+              <w:top w:type="dxa" w:w="60"/>
+              <w:left w:type="dxa" w:w="100"/>
+              <w:bottom w:type="dxa" w:w="60"/>
+              <w:right w:type="dxa" w:w="100"/>
+            </w:tcMar>
+          </w:tcPr>
+          <w:p>
+            <w:r>
+              <w:rPr>
+                <w:rFonts w:ascii="Calibri" w:cs="Calibri" w:eastAsia="Calibri" w:hAnsi="Calibri"/>
+              </w:rPr>
+              <w:t xml:space="preserve">Autoridad / RPA</w:t>
+            </w:r>
+          </w:p>
+        </w:tc>
+      </w:tr>
+      <w:tr>
+        <w:trPr>
+          <w:cantSplit/>
+        </w:trPr>
+        <w:tc>
+          <w:tcPr>
+            <w:tcW w:type="dxa" w:w="500"/>
+            <w:tcBorders>
+              <w:top w:val="single" w:color="BFC8D4" w:sz="4"/>
+              <w:left w:val="single" w:color="BFC8D4" w:sz="4"/>
+              <w:bottom w:val="single" w:color="BFC8D4" w:sz="4"/>
+              <w:right w:val="single" w:color="BFC8D4" w:sz="4"/>
+            </w:tcBorders>
+            <w:tcMar>
+              <w:top w:type="dxa" w:w="60"/>
+              <w:left w:type="dxa" w:w="100"/>
+              <w:bottom w:type="dxa" w:w="60"/>
+              <w:right w:type="dxa" w:w="100"/>
+            </w:tcMar>
+          </w:tcPr>
+          <w:p>
+            <w:r>
+              <w:rPr>
+                <w:rFonts w:ascii="Calibri" w:cs="Calibri" w:eastAsia="Calibri" w:hAnsi="Calibri"/>
+              </w:rPr>
+              <w:t xml:space="preserve">8</w:t>
+            </w:r>
+          </w:p>
+        </w:tc>
+        <w:tc>
+          <w:tcPr>
+            <w:tcW w:type="dxa" w:w="6760"/>
+            <w:tcBorders>
+              <w:top w:val="single" w:color="BFC8D4" w:sz="4"/>
+              <w:left w:val="single" w:color="BFC8D4" w:sz="4"/>
+              <w:bottom w:val="single" w:color="BFC8D4" w:sz="4"/>
+              <w:right w:val="single" w:color="BFC8D4" w:sz="4"/>
+            </w:tcBorders>
+            <w:tcMar>
+              <w:top w:type="dxa" w:w="60"/>
+              <w:left w:type="dxa" w:w="100"/>
+              <w:bottom w:type="dxa" w:w="60"/>
+              <w:right w:type="dxa" w:w="100"/>
+            </w:tcMar>
+          </w:tcPr>
+          <w:p>
+            <w:r>
+              <w:rPr>
+                <w:rFonts w:ascii="Calibri" w:cs="Calibri" w:eastAsia="Calibri" w:hAnsi="Calibri"/>
+                <w:b/>
+                <w:bCs/>
+              </w:rPr>
+              <w:t xml:space="preserve">Piloto en paralelo</w:t>
+            </w:r>
+            <w:r>
+              <w:rPr>
+                <w:rFonts w:ascii="Calibri" w:cs="Calibri" w:eastAsia="Calibri" w:hAnsi="Calibri"/>
+              </w:rPr>
+              <w:t xml:space="preserve"> de 1 a 2 meses (sistema y procedimiento actual) y </w:t>
+            </w:r>
+            <w:r>
+              <w:rPr>
+                <w:rFonts w:ascii="Calibri" w:cs="Calibri" w:eastAsia="Calibri" w:hAnsi="Calibri"/>
+                <w:b/>
+                <w:bCs/>
+              </w:rPr>
+              <w:t xml:space="preserve">capacitación</w:t>
+            </w:r>
+            <w:r>
+              <w:rPr>
+                <w:rFonts w:ascii="Calibri" w:cs="Calibri" w:eastAsia="Calibri" w:hAnsi="Calibri"/>
+              </w:rPr>
+              <w:t xml:space="preserve"> de cada rol.</w:t>
+            </w:r>
+          </w:p>
+        </w:tc>
+        <w:tc>
+          <w:tcPr>
+            <w:tcW w:type="dxa" w:w="2100"/>
+            <w:tcBorders>
+              <w:top w:val="single" w:color="BFC8D4" w:sz="4"/>
+              <w:left w:val="single" w:color="BFC8D4" w:sz="4"/>
+              <w:bottom w:val="single" w:color="BFC8D4" w:sz="4"/>
+              <w:right w:val="single" w:color="BFC8D4" w:sz="4"/>
+            </w:tcBorders>
+            <w:tcMar>
+              <w:top w:type="dxa" w:w="60"/>
+              <w:left w:type="dxa" w:w="100"/>
+              <w:bottom w:type="dxa" w:w="60"/>
+              <w:right w:type="dxa" w:w="100"/>
+            </w:tcMar>
+          </w:tcPr>
+          <w:p>
+            <w:r>
+              <w:rPr>
+                <w:rFonts w:ascii="Calibri" w:cs="Calibri" w:eastAsia="Calibri" w:hAnsi="Calibri"/>
+              </w:rPr>
+              <w:t xml:space="preserve">Contrataciones y Sistemas</w:t>
+            </w:r>
+          </w:p>
+        </w:tc>
+      </w:tr>
+      <w:tr>
+        <w:trPr>
+          <w:cantSplit/>
+        </w:trPr>
+        <w:tc>
+          <w:tcPr>
+            <w:tcW w:type="dxa" w:w="500"/>
+            <w:tcBorders>
+              <w:top w:val="single" w:color="BFC8D4" w:sz="4"/>
+              <w:left w:val="single" w:color="BFC8D4" w:sz="4"/>
+              <w:bottom w:val="single" w:color="BFC8D4" w:sz="4"/>
+              <w:right w:val="single" w:color="BFC8D4" w:sz="4"/>
+            </w:tcBorders>
+            <w:tcMar>
+              <w:top w:type="dxa" w:w="60"/>
+              <w:left w:type="dxa" w:w="100"/>
+              <w:bottom w:type="dxa" w:w="60"/>
+              <w:right w:type="dxa" w:w="100"/>
+            </w:tcMar>
+          </w:tcPr>
+          <w:p>
+            <w:r>
+              <w:rPr>
+                <w:rFonts w:ascii="Calibri" w:cs="Calibri" w:eastAsia="Calibri" w:hAnsi="Calibri"/>
+              </w:rPr>
+              <w:t xml:space="preserve">9</w:t>
+            </w:r>
+          </w:p>
+        </w:tc>
+        <w:tc>
+          <w:tcPr>
+            <w:tcW w:type="dxa" w:w="6760"/>
+            <w:tcBorders>
+              <w:top w:val="single" w:color="BFC8D4" w:sz="4"/>
+              <w:left w:val="single" w:color="BFC8D4" w:sz="4"/>
+              <w:bottom w:val="single" w:color="BFC8D4" w:sz="4"/>
+              <w:right w:val="single" w:color="BFC8D4" w:sz="4"/>
+            </w:tcBorders>
+            <w:tcMar>
+              <w:top w:type="dxa" w:w="60"/>
+              <w:left w:type="dxa" w:w="100"/>
+              <w:bottom w:type="dxa" w:w="60"/>
+              <w:right w:type="dxa" w:w="100"/>
+            </w:tcMar>
+          </w:tcPr>
+          <w:p>
+            <w:r>
+              <w:rPr>
+                <w:rFonts w:ascii="Calibri" w:cs="Calibri" w:eastAsia="Calibri" w:hAnsi="Calibri"/>
+              </w:rPr>
+              <w:t xml:space="preserve">Revisión de seguridad independiente antes de operar con información real.</w:t>
+            </w:r>
+          </w:p>
+        </w:tc>
+        <w:tc>
+          <w:tcPr>
+            <w:tcW w:type="dxa" w:w="2100"/>
+            <w:tcBorders>
+              <w:top w:val="single" w:color="BFC8D4" w:sz="4"/>
+              <w:left w:val="single" w:color="BFC8D4" w:sz="4"/>
+              <w:bottom w:val="single" w:color="BFC8D4" w:sz="4"/>
+              <w:right w:val="single" w:color="BFC8D4" w:sz="4"/>
+            </w:tcBorders>
+            <w:tcMar>
+              <w:top w:type="dxa" w:w="60"/>
+              <w:left w:type="dxa" w:w="100"/>
+              <w:bottom w:type="dxa" w:w="60"/>
+              <w:right w:type="dxa" w:w="100"/>
+            </w:tcMar>
+          </w:tcPr>
+          <w:p>
+            <w:r>
+              <w:rPr>
+                <w:rFonts w:ascii="Calibri" w:cs="Calibri" w:eastAsia="Calibri" w:hAnsi="Calibri"/>
+              </w:rPr>
+              <w:t xml:space="preserve">Sistemas / auditoría</w:t>
+            </w:r>
+          </w:p>
+        </w:tc>
+      </w:tr>
+    </w:tbl>
+    <w:p>
+      <w:pPr>
+        <w:spacing w:after="160"/>
+      </w:pPr>
+    </w:p>
+    <w:tbl>
+      <w:tblPr>
+        <w:tblW w:type="dxa" w:w="9360"/>
+        <w:tblBorders>
+          <w:top w:val="single" w:color="auto" w:sz="4"/>
+          <w:left w:val="single" w:color="auto" w:sz="4"/>
+          <w:bottom w:val="single" w:color="auto" w:sz="4"/>
+          <w:right w:val="single" w:color="auto" w:sz="4"/>
+          <w:insideH w:val="single" w:color="auto" w:sz="4"/>
+          <w:insideV w:val="single" w:color="auto" w:sz="4"/>
+        </w:tblBorders>
+      </w:tblPr>
+      <w:tblGrid>
+        <w:gridCol w:w="9360"/>
+      </w:tblGrid>
+      <w:tr>
+        <w:tc>
+          <w:tcPr>
+            <w:tcW w:type="dxa" w:w="9360"/>
+            <w:tcBorders>
+              <w:top w:val="single" w:color="BFC8D4" w:sz="4"/>
+              <w:left w:val="single" w:color="BFC8D4" w:sz="4"/>
+              <w:bottom w:val="single" w:color="BFC8D4" w:sz="4"/>
+              <w:right w:val="single" w:color="BFC8D4" w:sz="4"/>
+            </w:tcBorders>
+            <w:shd w:fill="E8F1FB" w:color="auto" w:val="clear"/>
+            <w:tcMar>
+              <w:top w:type="dxa" w:w="100"/>
+              <w:left w:type="dxa" w:w="160"/>
+              <w:bottom w:type="dxa" w:w="100"/>
+              <w:right w:type="dxa" w:w="160"/>
+            </w:tcMar>
+          </w:tcPr>
+          <w:p>
+            <w:r>
+              <w:rPr>
+                <w:rFonts w:ascii="Calibri" w:cs="Calibri" w:eastAsia="Calibri" w:hAnsi="Calibri"/>
+                <w:b/>
+                <w:bCs/>
+              </w:rPr>
+              <w:t xml:space="preserve">Documento técnico: </w:t>
+            </w:r>
+            <w:r>
+              <w:rPr>
+                <w:rFonts w:ascii="Calibri" w:cs="Calibri" w:eastAsia="Calibri" w:hAnsi="Calibri"/>
+              </w:rPr>
+              <w:t xml:space="preserve">Todos los pasos técnicos (comandos, ejemplo de HTTPS, respaldos y lista de control) están en el archivo </w:t>
+            </w:r>
+            <w:r>
+              <w:rPr>
+                <w:rFonts w:ascii="Consolas" w:cs="Consolas" w:eastAsia="Consolas" w:hAnsi="Consolas"/>
+                <w:color w:val="7A1F1F"/>
+                <w:sz w:val="20"/>
+                <w:szCs w:val="20"/>
+              </w:rPr>
+              <w:t xml:space="preserve">docs/PUESTA_EN_PRODUCCION.md</w:t>
+            </w:r>
+            <w:r>
+              <w:rPr>
+                <w:rFonts w:ascii="Calibri" w:cs="Calibri" w:eastAsia="Calibri" w:hAnsi="Calibri"/>
+              </w:rPr>
+              <w:t xml:space="preserve"> del proyecto; entrégueselo a la persona de Sistemas.</w:t>
+            </w:r>
+          </w:p>
+        </w:tc>
+      </w:tr>
+    </w:tbl>
+    <w:p>
+      <w:pPr>
+        <w:spacing w:after="160"/>
+      </w:pPr>
+    </w:p>
+    <w:p>
+      <w:pPr>
+        <w:pStyle w:val="Heading2"/>
+      </w:pPr>
+      <w:r>
+        <w:rPr>
+          <w:rFonts w:ascii="Calibri" w:cs="Calibri" w:eastAsia="Calibri" w:hAnsi="Calibri"/>
+        </w:rPr>
+        <w:t xml:space="preserve">Lo que el sistema todavía no hace</w:t>
+      </w:r>
+    </w:p>
+    <w:p>
+      <w:pPr>
+        <w:pStyle w:val="ListParagraph"/>
+        <w:numPr>
+          <w:ilvl w:val="0"/>
+          <w:numId w:val="2"/>
+        </w:numPr>
+        <w:spacing w:after="60"/>
+      </w:pPr>
+      <w:r>
+        <w:rPr>
+          <w:rFonts w:ascii="Calibri" w:cs="Calibri" w:eastAsia="Calibri" w:hAnsi="Calibri"/>
+        </w:rPr>
+        <w:t xml:space="preserve">No se conecta al </w:t>
+      </w:r>
+      <w:r>
+        <w:rPr>
+          <w:rFonts w:ascii="Calibri" w:cs="Calibri" w:eastAsia="Calibri" w:hAnsi="Calibri"/>
+          <w:b/>
+          <w:bCs/>
+        </w:rPr>
+        <w:t xml:space="preserve">SIGEP</w:t>
+      </w:r>
+      <w:r>
+        <w:rPr>
+          <w:rFonts w:ascii="Calibri" w:cs="Calibri" w:eastAsia="Calibri" w:hAnsi="Calibri"/>
+        </w:rPr>
+        <w:t xml:space="preserve"> ni al </w:t>
+      </w:r>
+      <w:r>
+        <w:rPr>
+          <w:rFonts w:ascii="Calibri" w:cs="Calibri" w:eastAsia="Calibri" w:hAnsi="Calibri"/>
+          <w:b/>
+          <w:bCs/>
+        </w:rPr>
+        <w:t xml:space="preserve">SICOES</w:t>
+      </w:r>
+      <w:r>
+        <w:rPr>
+          <w:rFonts w:ascii="Calibri" w:cs="Calibri" w:eastAsia="Calibri" w:hAnsi="Calibri"/>
+        </w:rPr>
+        <w:t xml:space="preserve">: el operador copia el bloque de captura y registra allí los números (C-31, F110, CUCE).</w:t>
+      </w:r>
+    </w:p>
+    <w:p>
+      <w:pPr>
+        <w:pStyle w:val="ListParagraph"/>
+        <w:numPr>
+          <w:ilvl w:val="0"/>
+          <w:numId w:val="2"/>
+        </w:numPr>
+        <w:spacing w:after="60"/>
+      </w:pPr>
+      <w:r>
+        <w:rPr>
+          <w:rFonts w:ascii="Calibri" w:cs="Calibri" w:eastAsia="Calibri" w:hAnsi="Calibri"/>
+        </w:rPr>
+        <w:t xml:space="preserve">No incluye </w:t>
+      </w:r>
+      <w:r>
+        <w:rPr>
+          <w:rFonts w:ascii="Calibri" w:cs="Calibri" w:eastAsia="Calibri" w:hAnsi="Calibri"/>
+          <w:b/>
+          <w:bCs/>
+        </w:rPr>
+        <w:t xml:space="preserve">firma digital</w:t>
+      </w:r>
+      <w:r>
+        <w:rPr>
+          <w:rFonts w:ascii="Calibri" w:cs="Calibri" w:eastAsia="Calibri" w:hAnsi="Calibri"/>
+        </w:rPr>
+        <w:t xml:space="preserve">, doble verificación al ingresar ni recuperación de contraseña por correo (el administrador restablece las claves).</w:t>
+      </w:r>
+    </w:p>
+    <w:p>
+      <w:pPr>
+        <w:pStyle w:val="ListParagraph"/>
+        <w:numPr>
+          <w:ilvl w:val="0"/>
+          <w:numId w:val="2"/>
+        </w:numPr>
+        <w:spacing w:after="60"/>
+      </w:pPr>
+      <w:r>
+        <w:rPr>
+          <w:rFonts w:ascii="Calibri" w:cs="Calibri" w:eastAsia="Calibri" w:hAnsi="Calibri"/>
+        </w:rPr>
+        <w:t xml:space="preserve">No ha pasado una </w:t>
+      </w:r>
+      <w:r>
+        <w:rPr>
+          <w:rFonts w:ascii="Calibri" w:cs="Calibri" w:eastAsia="Calibri" w:hAnsi="Calibri"/>
+          <w:b/>
+          <w:bCs/>
+        </w:rPr>
+        <w:t xml:space="preserve">prueba de penetración</w:t>
+      </w:r>
+      <w:r>
+        <w:rPr>
+          <w:rFonts w:ascii="Calibri" w:cs="Calibri" w:eastAsia="Calibri" w:hAnsi="Calibri"/>
+        </w:rPr>
+        <w:t xml:space="preserve"> ni de </w:t>
+      </w:r>
+      <w:r>
+        <w:rPr>
+          <w:rFonts w:ascii="Calibri" w:cs="Calibri" w:eastAsia="Calibri" w:hAnsi="Calibri"/>
+          <w:b/>
+          <w:bCs/>
+        </w:rPr>
+        <w:t xml:space="preserve">carga</w:t>
+      </w:r>
+      <w:r>
+        <w:rPr>
+          <w:rFonts w:ascii="Calibri" w:cs="Calibri" w:eastAsia="Calibri" w:hAnsi="Calibri"/>
+        </w:rPr>
+        <w:t xml:space="preserve"> realizada por terceros.</w:t>
+      </w:r>
+    </w:p>
+    <w:p>
+      <w:pPr>
+        <w:pStyle w:val="ListParagraph"/>
+        <w:numPr>
+          <w:ilvl w:val="0"/>
+          <w:numId w:val="2"/>
+        </w:numPr>
+        <w:spacing w:after="60"/>
+      </w:pPr>
+      <w:r>
+        <w:rPr>
+          <w:rFonts w:ascii="Calibri" w:cs="Calibri" w:eastAsia="Calibri" w:hAnsi="Calibri"/>
+        </w:rPr>
+        <w:t xml:space="preserve">Las reglas legales </w:t>
+      </w:r>
+      <w:r>
+        <w:rPr>
+          <w:rFonts w:ascii="Calibri" w:cs="Calibri" w:eastAsia="Calibri" w:hAnsi="Calibri"/>
+          <w:b/>
+          <w:bCs/>
+        </w:rPr>
+        <w:t xml:space="preserve">no fueron verificadas</w:t>
+      </w:r>
+      <w:r>
+        <w:rPr>
+          <w:rFonts w:ascii="Calibri" w:cs="Calibri" w:eastAsia="Calibri" w:hAnsi="Calibri"/>
+        </w:rPr>
+        <w:t xml:space="preserve"> contra la normativa vigente.</w:t>
+      </w:r>
+    </w:p>
+    <w:p>
+      <w:pPr>
+        <w:pStyle w:val="Heading1"/>
+        <w:pageBreakBefore/>
+      </w:pPr>
+      <w:r>
+        <w:rPr>
+          <w:rFonts w:ascii="Calibri" w:cs="Calibri" w:eastAsia="Calibri" w:hAnsi="Calibri"/>
+        </w:rPr>
         <w:t xml:space="preserve">Aviso importante</w:t>
       </w:r>
     </w:p>
@@ -13750,6 +16519,18 @@
       </w:pPr>
     </w:lvl>
   </w:abstractNum>
+  <w:abstractNum w:abstractNumId="6" w15:restartNumberingAfterBreak="0">
+    <w:multiLevelType w:val="hybridMultilevel"/>
+    <w:lvl w:ilvl="0" w15:tentative="1">
+      <w:start w:val="1"/>
+      <w:numFmt w:val="decimal"/>
+      <w:lvlText w:val="%1."/>
+      <w:lvlJc w:val="left"/>
+      <w:pPr>
+        <w:ind w:left="540" w:hanging="360"/>
+      </w:pPr>
+    </w:lvl>
+  </w:abstractNum>
   <w:num w:numId="1">
     <w:abstractNumId w:val="1"/>
     <w:lvlOverride w:ilvl="0">
@@ -13776,6 +16557,12 @@
   </w:num>
   <w:num w:numId="5">
     <w:abstractNumId w:val="5"/>
+    <w:lvlOverride w:ilvl="0">
+      <w:startOverride w:val="1"/>
+    </w:lvlOverride>
+  </w:num>
+  <w:num w:numId="6">
+    <w:abstractNumId w:val="6"/>
     <w:lvlOverride w:ilvl="0">
       <w:startOverride w:val="1"/>
     </w:lvlOverride>

</xml_diff>

<commit_message>
Manuales actualizados: importación Excel, Certificación POA, nota PAC (ejemplo 3) y archivos de ejemplo
Co-Authored-By: Claude Sonnet 5.5 <noreply@anthropic.com>
Claude-Session: https://claude.ai/code/session_01MYLY6nn23NgZLc9y6Vzcaj
</commit_message>
<xml_diff>
--- a/sicom-muni/docs/GUIA_PRUEBA_PARA_PRINCIPIANTES.docx
+++ b/sicom-muni/docs/GUIA_PRUEBA_PARA_PRINCIPIANTES.docx
@@ -6978,7 +6978,7 @@
       <w:r>
         <w:drawing>
           <wp:inline distT="0" distB="0" distL="0" distR="0">
-            <wp:extent cx="3609975" cy="7772400"/>
+            <wp:extent cx="3419475" cy="7772400"/>
             <wp:effectExtent t="0" r="0" b="0" l="0"/>
             <wp:docPr id="1" name="03-formulador-chb.png" descr="Así debe verse la hoja de la solicitud con los 4 ítems" title="Así debe verse la hoja de la solicitud con los 4 ítems"/>
             <wp:cNvGraphicFramePr>
@@ -7003,7 +7003,7 @@
                   <pic:spPr bwMode="auto">
                     <a:xfrm>
                       <a:off x="0" y="0"/>
-                      <a:ext cx="3609975" cy="7772400"/>
+                      <a:ext cx="3419475" cy="7772400"/>
                     </a:xfrm>
                     <a:prstGeom prst="rect">
                       <a:avLst/>
@@ -7307,7 +7307,21 @@
         <w:rPr>
           <w:rFonts w:ascii="Calibri" w:cs="Calibri" w:eastAsia="Calibri" w:hAnsi="Calibri"/>
         </w:rPr>
-        <w:t xml:space="preserve">. Pulse </w:t>
+        <w:t xml:space="preserve">. En el campo </w:t>
+      </w:r>
+      <w:r>
+        <w:rPr>
+          <w:rFonts w:ascii="Calibri" w:cs="Calibri" w:eastAsia="Calibri" w:hAnsi="Calibri"/>
+          <w:b/>
+          <w:bCs/>
+        </w:rPr>
+        <w:t xml:space="preserve">«¿Cómo apoya la compra al logro del objetivo del POA?»</w:t>
+      </w:r>
+      <w:r>
+        <w:rPr>
+          <w:rFonts w:ascii="Calibri" w:cs="Calibri" w:eastAsia="Calibri" w:hAnsi="Calibri"/>
+        </w:rPr>
+        <w:t xml:space="preserve"> escriba: «La compra de materiales permite ejecutar el mantenimiento de la plaza principal, apoyando el objetivo de gestión de conservación de la infraestructura urbana.» Pulse </w:t>
       </w:r>
       <w:r>
         <w:rPr>
@@ -7633,7 +7647,7 @@
       <w:r>
         <w:drawing>
           <wp:inline distT="0" distB="0" distL="0" distR="0">
-            <wp:extent cx="5124450" cy="4381500"/>
+            <wp:extent cx="4105275" cy="4572000"/>
             <wp:effectExtent t="0" r="0" b="0" l="0"/>
             <wp:docPr id="1" name="05-presupuesto-sigep.png" descr="Pestaña Presupuesto y SIGEP antes de certificar" title="Pestaña Presupuesto y SIGEP antes de certificar"/>
             <wp:cNvGraphicFramePr>
@@ -7658,7 +7672,7 @@
                   <pic:spPr bwMode="auto">
                     <a:xfrm>
                       <a:off x="0" y="0"/>
-                      <a:ext cx="5124450" cy="4381500"/>
+                      <a:ext cx="4105275" cy="4572000"/>
                     </a:xfrm>
                     <a:prstGeom prst="rect">
                       <a:avLst/>
@@ -7781,6 +7795,59 @@
       <w:r>
         <w:rPr>
           <w:rFonts w:ascii="Calibri" w:cs="Calibri" w:eastAsia="Calibri" w:hAnsi="Calibri"/>
+        </w:rPr>
+        <w:t xml:space="preserve">Antes de certificar fíjese en la tarjeta </w:t>
+      </w:r>
+      <w:r>
+        <w:rPr>
+          <w:rFonts w:ascii="Calibri" w:cs="Calibri" w:eastAsia="Calibri" w:hAnsi="Calibri"/>
+          <w:b/>
+          <w:bCs/>
+        </w:rPr>
+        <w:t xml:space="preserve">«Certificación del POA — programa y objetivo»</w:t>
+      </w:r>
+      <w:r>
+        <w:rPr>
+          <w:rFonts w:ascii="Calibri" w:cs="Calibri" w:eastAsia="Calibri" w:hAnsi="Calibri"/>
+        </w:rPr>
+        <w:t xml:space="preserve">: muestra el programa </w:t>
+      </w:r>
+      <w:r>
+        <w:rPr>
+          <w:rFonts w:ascii="Calibri" w:cs="Calibri" w:eastAsia="Calibri" w:hAnsi="Calibri"/>
+          <w:b/>
+          <w:bCs/>
+        </w:rPr>
+        <w:t xml:space="preserve">01</w:t>
+      </w:r>
+      <w:r>
+        <w:rPr>
+          <w:rFonts w:ascii="Calibri" w:cs="Calibri" w:eastAsia="Calibri" w:hAnsi="Calibri"/>
+        </w:rPr>
+        <w:t xml:space="preserve"> con su objetivo </w:t>
+      </w:r>
+      <w:r>
+        <w:rPr>
+          <w:rFonts w:ascii="Calibri" w:cs="Calibri" w:eastAsia="Calibri" w:hAnsi="Calibri"/>
+          <w:b/>
+          <w:bCs/>
+        </w:rPr>
+        <w:t xml:space="preserve">OBJ2</w:t>
+      </w:r>
+      <w:r>
+        <w:rPr>
+          <w:rFonts w:ascii="Calibri" w:cs="Calibri" w:eastAsia="Calibri" w:hAnsi="Calibri"/>
+        </w:rPr>
+        <w:t xml:space="preserve"> y la justificación del solicitante.</w:t>
+      </w:r>
+    </w:p>
+    <w:p>
+      <w:pPr>
+        <w:spacing w:after="120"/>
+      </w:pPr>
+      <w:r>
+        <w:rPr>
+          <w:rFonts w:ascii="Calibri" w:cs="Calibri" w:eastAsia="Calibri" w:hAnsi="Calibri"/>
           <w:b/>
           <w:bCs/>
         </w:rPr>
@@ -7804,7 +7871,21 @@
         <w:rPr>
           <w:rFonts w:ascii="Calibri" w:cs="Calibri" w:eastAsia="Calibri" w:hAnsi="Calibri"/>
         </w:rPr>
-        <w:t xml:space="preserve">. El </w:t>
+        <w:t xml:space="preserve"> y dos documentos nuevos (Certificación C-31 y </w:t>
+      </w:r>
+      <w:r>
+        <w:rPr>
+          <w:rFonts w:ascii="Calibri" w:cs="Calibri" w:eastAsia="Calibri" w:hAnsi="Calibri"/>
+          <w:b/>
+          <w:bCs/>
+        </w:rPr>
+        <w:t xml:space="preserve">Certificación del POA</w:t>
+      </w:r>
+      <w:r>
+        <w:rPr>
+          <w:rFonts w:ascii="Calibri" w:cs="Calibri" w:eastAsia="Calibri" w:hAnsi="Calibri"/>
+        </w:rPr>
+        <w:t xml:space="preserve">). El </w:t>
       </w:r>
       <w:r>
         <w:rPr>
@@ -7891,7 +7972,7 @@
       <w:r>
         <w:drawing>
           <wp:inline distT="0" distB="0" distL="0" distR="0">
-            <wp:extent cx="5124450" cy="4019550"/>
+            <wp:extent cx="4667250" cy="4572000"/>
             <wp:effectExtent t="0" r="0" b="0" l="0"/>
             <wp:docPr id="1" name="06-bloque-sigep-certificado.png" descr="Bloque SIGEP listo para copiar" title="Bloque SIGEP listo para copiar"/>
             <wp:cNvGraphicFramePr>
@@ -7916,7 +7997,7 @@
                   <pic:spPr bwMode="auto">
                     <a:xfrm>
                       <a:off x="0" y="0"/>
-                      <a:ext cx="5124450" cy="4019550"/>
+                      <a:ext cx="4667250" cy="4572000"/>
                     </a:xfrm>
                     <a:prstGeom prst="rect">
                       <a:avLst/>
@@ -10274,9 +10355,9 @@
       <w:r>
         <w:drawing>
           <wp:inline distT="0" distB="0" distL="0" distR="0">
-            <wp:extent cx="4933950" cy="3476625"/>
+            <wp:extent cx="4933950" cy="3600450"/>
             <wp:effectExtent t="0" r="0" b="0" l="0"/>
-            <wp:docPr id="1" name="15-documentos-expediente.png" descr="Expediente final: siete documentos PDF" title="Expediente final: siete documentos PDF"/>
+            <wp:docPr id="1" name="15-documentos-expediente.png" descr="Expediente final: ocho documentos PDF" title="Expediente final: ocho documentos PDF"/>
             <wp:cNvGraphicFramePr>
               <a:graphicFrameLocks xmlns:a="http://schemas.openxmlformats.org/drawingml/2006/main" noChangeAspect="1"/>
             </wp:cNvGraphicFramePr>
@@ -10299,7 +10380,7 @@
                   <pic:spPr bwMode="auto">
                     <a:xfrm>
                       <a:off x="0" y="0"/>
-                      <a:ext cx="4933950" cy="3476625"/>
+                      <a:ext cx="4933950" cy="3600450"/>
                     </a:xfrm>
                     <a:prstGeom prst="rect">
                       <a:avLst/>
@@ -10326,7 +10407,7 @@
           <w:sz w:val="18"/>
           <w:szCs w:val="18"/>
         </w:rPr>
-        <w:t xml:space="preserve">Figura: Expediente final: siete documentos PDF</w:t>
+        <w:t xml:space="preserve">Figura: Expediente final: ocho documentos PDF</w:t>
       </w:r>
     </w:p>
     <w:p>
@@ -11267,6 +11348,48 @@
         <w:rPr>
           <w:rFonts w:ascii="Calibri" w:cs="Calibri" w:eastAsia="Calibri" w:hAnsi="Calibri"/>
         </w:rPr>
+        <w:t xml:space="preserve">. Como el monto supera Bs 20.000, en </w:t>
+      </w:r>
+      <w:r>
+        <w:rPr>
+          <w:rFonts w:ascii="Calibri" w:cs="Calibri" w:eastAsia="Calibri" w:hAnsi="Calibri"/>
+          <w:b/>
+          <w:bCs/>
+        </w:rPr>
+        <w:t xml:space="preserve">Documentos</w:t>
+      </w:r>
+      <w:r>
+        <w:rPr>
+          <w:rFonts w:ascii="Calibri" w:cs="Calibri" w:eastAsia="Calibri" w:hAnsi="Calibri"/>
+        </w:rPr>
+        <w:t xml:space="preserve"> aparece además la </w:t>
+      </w:r>
+      <w:r>
+        <w:rPr>
+          <w:rFonts w:ascii="Calibri" w:cs="Calibri" w:eastAsia="Calibri" w:hAnsi="Calibri"/>
+          <w:b/>
+          <w:bCs/>
+        </w:rPr>
+        <w:t xml:space="preserve">Nota de solicitud de registro al PAC</w:t>
+      </w:r>
+      <w:r>
+        <w:rPr>
+          <w:rFonts w:ascii="Calibri" w:cs="Calibri" w:eastAsia="Calibri" w:hAnsi="Calibri"/>
+        </w:rPr>
+        <w:t xml:space="preserve"> y, tras certificar, la </w:t>
+      </w:r>
+      <w:r>
+        <w:rPr>
+          <w:rFonts w:ascii="Calibri" w:cs="Calibri" w:eastAsia="Calibri" w:hAnsi="Calibri"/>
+          <w:b/>
+          <w:bCs/>
+        </w:rPr>
+        <w:t xml:space="preserve">Certificación del POA</w:t>
+      </w:r>
+      <w:r>
+        <w:rPr>
+          <w:rFonts w:ascii="Calibri" w:cs="Calibri" w:eastAsia="Calibri" w:hAnsi="Calibri"/>
+        </w:rPr>
         <w:t xml:space="preserve">.</w:t>
       </w:r>
     </w:p>
@@ -14223,7 +14346,7 @@
               <w:rPr>
                 <w:rFonts w:ascii="Calibri" w:cs="Calibri" w:eastAsia="Calibri" w:hAnsi="Calibri"/>
               </w:rPr>
-              <w:t xml:space="preserve">El expediente tiene 7 PDF y la página de verificación dice «auténtico»</w:t>
+              <w:t xml:space="preserve">El expediente tiene 8 PDF (incluida la Certificación del POA) y la página de verificación dice «auténtico»</w:t>
             </w:r>
           </w:p>
         </w:tc>
@@ -14733,6 +14856,486 @@
           </w:p>
         </w:tc>
       </w:tr>
+      <w:tr>
+        <w:trPr>
+          <w:cantSplit/>
+        </w:trPr>
+        <w:tc>
+          <w:tcPr>
+            <w:tcW w:type="dxa" w:w="500"/>
+            <w:tcBorders>
+              <w:top w:val="single" w:color="BFC8D4" w:sz="4"/>
+              <w:left w:val="single" w:color="BFC8D4" w:sz="4"/>
+              <w:bottom w:val="single" w:color="BFC8D4" w:sz="4"/>
+              <w:right w:val="single" w:color="BFC8D4" w:sz="4"/>
+            </w:tcBorders>
+            <w:tcMar>
+              <w:top w:type="dxa" w:w="60"/>
+              <w:left w:type="dxa" w:w="100"/>
+              <w:bottom w:type="dxa" w:w="60"/>
+              <w:right w:type="dxa" w:w="100"/>
+            </w:tcMar>
+          </w:tcPr>
+          <w:p>
+            <w:r>
+              <w:rPr>
+                <w:rFonts w:ascii="Calibri" w:cs="Calibri" w:eastAsia="Calibri" w:hAnsi="Calibri"/>
+              </w:rPr>
+              <w:t xml:space="preserve">16</w:t>
+            </w:r>
+          </w:p>
+        </w:tc>
+        <w:tc>
+          <w:tcPr>
+            <w:tcW w:type="dxa" w:w="8000"/>
+            <w:tcBorders>
+              <w:top w:val="single" w:color="BFC8D4" w:sz="4"/>
+              <w:left w:val="single" w:color="BFC8D4" w:sz="4"/>
+              <w:bottom w:val="single" w:color="BFC8D4" w:sz="4"/>
+              <w:right w:val="single" w:color="BFC8D4" w:sz="4"/>
+            </w:tcBorders>
+            <w:tcMar>
+              <w:top w:type="dxa" w:w="60"/>
+              <w:left w:type="dxa" w:w="100"/>
+              <w:bottom w:type="dxa" w:w="60"/>
+              <w:right w:type="dxa" w:w="100"/>
+            </w:tcMar>
+          </w:tcPr>
+          <w:p>
+            <w:r>
+              <w:rPr>
+                <w:rFonts w:ascii="Calibri" w:cs="Calibri" w:eastAsia="Calibri" w:hAnsi="Calibri"/>
+              </w:rPr>
+              <w:t xml:space="preserve">Importar presupuesto con errores: lista las filas y no deja confirmar</w:t>
+            </w:r>
+          </w:p>
+        </w:tc>
+        <w:tc>
+          <w:tcPr>
+            <w:tcW w:type="dxa" w:w="860"/>
+            <w:tcBorders>
+              <w:top w:val="single" w:color="BFC8D4" w:sz="4"/>
+              <w:left w:val="single" w:color="BFC8D4" w:sz="4"/>
+              <w:bottom w:val="single" w:color="BFC8D4" w:sz="4"/>
+              <w:right w:val="single" w:color="BFC8D4" w:sz="4"/>
+            </w:tcBorders>
+            <w:tcMar>
+              <w:top w:type="dxa" w:w="60"/>
+              <w:left w:type="dxa" w:w="100"/>
+              <w:bottom w:type="dxa" w:w="60"/>
+              <w:right w:type="dxa" w:w="100"/>
+            </w:tcMar>
+          </w:tcPr>
+          <w:p>
+            <w:r>
+              <w:rPr>
+                <w:rFonts w:ascii="Calibri" w:cs="Calibri" w:eastAsia="Calibri" w:hAnsi="Calibri"/>
+              </w:rPr>
+              <w:t xml:space="preserve">☐</w:t>
+            </w:r>
+          </w:p>
+        </w:tc>
+      </w:tr>
+      <w:tr>
+        <w:trPr>
+          <w:cantSplit/>
+        </w:trPr>
+        <w:tc>
+          <w:tcPr>
+            <w:tcW w:type="dxa" w:w="500"/>
+            <w:tcBorders>
+              <w:top w:val="single" w:color="BFC8D4" w:sz="4"/>
+              <w:left w:val="single" w:color="BFC8D4" w:sz="4"/>
+              <w:bottom w:val="single" w:color="BFC8D4" w:sz="4"/>
+              <w:right w:val="single" w:color="BFC8D4" w:sz="4"/>
+            </w:tcBorders>
+            <w:tcMar>
+              <w:top w:type="dxa" w:w="60"/>
+              <w:left w:type="dxa" w:w="100"/>
+              <w:bottom w:type="dxa" w:w="60"/>
+              <w:right w:type="dxa" w:w="100"/>
+            </w:tcMar>
+          </w:tcPr>
+          <w:p>
+            <w:r>
+              <w:rPr>
+                <w:rFonts w:ascii="Calibri" w:cs="Calibri" w:eastAsia="Calibri" w:hAnsi="Calibri"/>
+              </w:rPr>
+              <w:t xml:space="preserve">17</w:t>
+            </w:r>
+          </w:p>
+        </w:tc>
+        <w:tc>
+          <w:tcPr>
+            <w:tcW w:type="dxa" w:w="8000"/>
+            <w:tcBorders>
+              <w:top w:val="single" w:color="BFC8D4" w:sz="4"/>
+              <w:left w:val="single" w:color="BFC8D4" w:sz="4"/>
+              <w:bottom w:val="single" w:color="BFC8D4" w:sz="4"/>
+              <w:right w:val="single" w:color="BFC8D4" w:sz="4"/>
+            </w:tcBorders>
+            <w:tcMar>
+              <w:top w:type="dxa" w:w="60"/>
+              <w:left w:type="dxa" w:w="100"/>
+              <w:bottom w:type="dxa" w:w="60"/>
+              <w:right w:type="dxa" w:w="100"/>
+            </w:tcMar>
+          </w:tcPr>
+          <w:p>
+            <w:r>
+              <w:rPr>
+                <w:rFonts w:ascii="Calibri" w:cs="Calibri" w:eastAsia="Calibri" w:hAnsi="Calibri"/>
+              </w:rPr>
+              <w:t xml:space="preserve">Importar presupuesto correcto y repetirlo: no duplica filas</w:t>
+            </w:r>
+          </w:p>
+        </w:tc>
+        <w:tc>
+          <w:tcPr>
+            <w:tcW w:type="dxa" w:w="860"/>
+            <w:tcBorders>
+              <w:top w:val="single" w:color="BFC8D4" w:sz="4"/>
+              <w:left w:val="single" w:color="BFC8D4" w:sz="4"/>
+              <w:bottom w:val="single" w:color="BFC8D4" w:sz="4"/>
+              <w:right w:val="single" w:color="BFC8D4" w:sz="4"/>
+            </w:tcBorders>
+            <w:tcMar>
+              <w:top w:type="dxa" w:w="60"/>
+              <w:left w:type="dxa" w:w="100"/>
+              <w:bottom w:type="dxa" w:w="60"/>
+              <w:right w:type="dxa" w:w="100"/>
+            </w:tcMar>
+          </w:tcPr>
+          <w:p>
+            <w:r>
+              <w:rPr>
+                <w:rFonts w:ascii="Calibri" w:cs="Calibri" w:eastAsia="Calibri" w:hAnsi="Calibri"/>
+              </w:rPr>
+              <w:t xml:space="preserve">☐</w:t>
+            </w:r>
+          </w:p>
+        </w:tc>
+      </w:tr>
+      <w:tr>
+        <w:trPr>
+          <w:cantSplit/>
+        </w:trPr>
+        <w:tc>
+          <w:tcPr>
+            <w:tcW w:type="dxa" w:w="500"/>
+            <w:tcBorders>
+              <w:top w:val="single" w:color="BFC8D4" w:sz="4"/>
+              <w:left w:val="single" w:color="BFC8D4" w:sz="4"/>
+              <w:bottom w:val="single" w:color="BFC8D4" w:sz="4"/>
+              <w:right w:val="single" w:color="BFC8D4" w:sz="4"/>
+            </w:tcBorders>
+            <w:tcMar>
+              <w:top w:type="dxa" w:w="60"/>
+              <w:left w:type="dxa" w:w="100"/>
+              <w:bottom w:type="dxa" w:w="60"/>
+              <w:right w:type="dxa" w:w="100"/>
+            </w:tcMar>
+          </w:tcPr>
+          <w:p>
+            <w:r>
+              <w:rPr>
+                <w:rFonts w:ascii="Calibri" w:cs="Calibri" w:eastAsia="Calibri" w:hAnsi="Calibri"/>
+              </w:rPr>
+              <w:t xml:space="preserve">18</w:t>
+            </w:r>
+          </w:p>
+        </w:tc>
+        <w:tc>
+          <w:tcPr>
+            <w:tcW w:type="dxa" w:w="8000"/>
+            <w:tcBorders>
+              <w:top w:val="single" w:color="BFC8D4" w:sz="4"/>
+              <w:left w:val="single" w:color="BFC8D4" w:sz="4"/>
+              <w:bottom w:val="single" w:color="BFC8D4" w:sz="4"/>
+              <w:right w:val="single" w:color="BFC8D4" w:sz="4"/>
+            </w:tcBorders>
+            <w:tcMar>
+              <w:top w:type="dxa" w:w="60"/>
+              <w:left w:type="dxa" w:w="100"/>
+              <w:bottom w:type="dxa" w:w="60"/>
+              <w:right w:type="dxa" w:w="100"/>
+            </w:tcMar>
+          </w:tcPr>
+          <w:p>
+            <w:r>
+              <w:rPr>
+                <w:rFonts w:ascii="Calibri" w:cs="Calibri" w:eastAsia="Calibri" w:hAnsi="Calibri"/>
+              </w:rPr>
+              <w:t xml:space="preserve">Importar catálogo CHB: cemento «REEMPLAZA» y fecha de registro de hoy</w:t>
+            </w:r>
+          </w:p>
+        </w:tc>
+        <w:tc>
+          <w:tcPr>
+            <w:tcW w:type="dxa" w:w="860"/>
+            <w:tcBorders>
+              <w:top w:val="single" w:color="BFC8D4" w:sz="4"/>
+              <w:left w:val="single" w:color="BFC8D4" w:sz="4"/>
+              <w:bottom w:val="single" w:color="BFC8D4" w:sz="4"/>
+              <w:right w:val="single" w:color="BFC8D4" w:sz="4"/>
+            </w:tcBorders>
+            <w:tcMar>
+              <w:top w:type="dxa" w:w="60"/>
+              <w:left w:type="dxa" w:w="100"/>
+              <w:bottom w:type="dxa" w:w="60"/>
+              <w:right w:type="dxa" w:w="100"/>
+            </w:tcMar>
+          </w:tcPr>
+          <w:p>
+            <w:r>
+              <w:rPr>
+                <w:rFonts w:ascii="Calibri" w:cs="Calibri" w:eastAsia="Calibri" w:hAnsi="Calibri"/>
+              </w:rPr>
+              <w:t xml:space="preserve">☐</w:t>
+            </w:r>
+          </w:p>
+        </w:tc>
+      </w:tr>
+      <w:tr>
+        <w:trPr>
+          <w:cantSplit/>
+        </w:trPr>
+        <w:tc>
+          <w:tcPr>
+            <w:tcW w:type="dxa" w:w="500"/>
+            <w:tcBorders>
+              <w:top w:val="single" w:color="BFC8D4" w:sz="4"/>
+              <w:left w:val="single" w:color="BFC8D4" w:sz="4"/>
+              <w:bottom w:val="single" w:color="BFC8D4" w:sz="4"/>
+              <w:right w:val="single" w:color="BFC8D4" w:sz="4"/>
+            </w:tcBorders>
+            <w:tcMar>
+              <w:top w:type="dxa" w:w="60"/>
+              <w:left w:type="dxa" w:w="100"/>
+              <w:bottom w:type="dxa" w:w="60"/>
+              <w:right w:type="dxa" w:w="100"/>
+            </w:tcMar>
+          </w:tcPr>
+          <w:p>
+            <w:r>
+              <w:rPr>
+                <w:rFonts w:ascii="Calibri" w:cs="Calibri" w:eastAsia="Calibri" w:hAnsi="Calibri"/>
+              </w:rPr>
+              <w:t xml:space="preserve">19</w:t>
+            </w:r>
+          </w:p>
+        </w:tc>
+        <w:tc>
+          <w:tcPr>
+            <w:tcW w:type="dxa" w:w="8000"/>
+            <w:tcBorders>
+              <w:top w:val="single" w:color="BFC8D4" w:sz="4"/>
+              <w:left w:val="single" w:color="BFC8D4" w:sz="4"/>
+              <w:bottom w:val="single" w:color="BFC8D4" w:sz="4"/>
+              <w:right w:val="single" w:color="BFC8D4" w:sz="4"/>
+            </w:tcBorders>
+            <w:tcMar>
+              <w:top w:type="dxa" w:w="60"/>
+              <w:left w:type="dxa" w:w="100"/>
+              <w:bottom w:type="dxa" w:w="60"/>
+              <w:right w:type="dxa" w:w="100"/>
+            </w:tcMar>
+          </w:tcPr>
+          <w:p>
+            <w:r>
+              <w:rPr>
+                <w:rFonts w:ascii="Calibri" w:cs="Calibri" w:eastAsia="Calibri" w:hAnsi="Calibri"/>
+              </w:rPr>
+              <w:t xml:space="preserve">Solicitud de Bs 25.000: se genera la Nota PAC dirigida a la autoridad registrada</w:t>
+            </w:r>
+          </w:p>
+        </w:tc>
+        <w:tc>
+          <w:tcPr>
+            <w:tcW w:type="dxa" w:w="860"/>
+            <w:tcBorders>
+              <w:top w:val="single" w:color="BFC8D4" w:sz="4"/>
+              <w:left w:val="single" w:color="BFC8D4" w:sz="4"/>
+              <w:bottom w:val="single" w:color="BFC8D4" w:sz="4"/>
+              <w:right w:val="single" w:color="BFC8D4" w:sz="4"/>
+            </w:tcBorders>
+            <w:tcMar>
+              <w:top w:type="dxa" w:w="60"/>
+              <w:left w:type="dxa" w:w="100"/>
+              <w:bottom w:type="dxa" w:w="60"/>
+              <w:right w:type="dxa" w:w="100"/>
+            </w:tcMar>
+          </w:tcPr>
+          <w:p>
+            <w:r>
+              <w:rPr>
+                <w:rFonts w:ascii="Calibri" w:cs="Calibri" w:eastAsia="Calibri" w:hAnsi="Calibri"/>
+              </w:rPr>
+              <w:t xml:space="preserve">☐</w:t>
+            </w:r>
+          </w:p>
+        </w:tc>
+      </w:tr>
+      <w:tr>
+        <w:trPr>
+          <w:cantSplit/>
+        </w:trPr>
+        <w:tc>
+          <w:tcPr>
+            <w:tcW w:type="dxa" w:w="500"/>
+            <w:tcBorders>
+              <w:top w:val="single" w:color="BFC8D4" w:sz="4"/>
+              <w:left w:val="single" w:color="BFC8D4" w:sz="4"/>
+              <w:bottom w:val="single" w:color="BFC8D4" w:sz="4"/>
+              <w:right w:val="single" w:color="BFC8D4" w:sz="4"/>
+            </w:tcBorders>
+            <w:tcMar>
+              <w:top w:type="dxa" w:w="60"/>
+              <w:left w:type="dxa" w:w="100"/>
+              <w:bottom w:type="dxa" w:w="60"/>
+              <w:right w:type="dxa" w:w="100"/>
+            </w:tcMar>
+          </w:tcPr>
+          <w:p>
+            <w:r>
+              <w:rPr>
+                <w:rFonts w:ascii="Calibri" w:cs="Calibri" w:eastAsia="Calibri" w:hAnsi="Calibri"/>
+              </w:rPr>
+              <w:t xml:space="preserve">20</w:t>
+            </w:r>
+          </w:p>
+        </w:tc>
+        <w:tc>
+          <w:tcPr>
+            <w:tcW w:type="dxa" w:w="8000"/>
+            <w:tcBorders>
+              <w:top w:val="single" w:color="BFC8D4" w:sz="4"/>
+              <w:left w:val="single" w:color="BFC8D4" w:sz="4"/>
+              <w:bottom w:val="single" w:color="BFC8D4" w:sz="4"/>
+              <w:right w:val="single" w:color="BFC8D4" w:sz="4"/>
+            </w:tcBorders>
+            <w:tcMar>
+              <w:top w:type="dxa" w:w="60"/>
+              <w:left w:type="dxa" w:w="100"/>
+              <w:bottom w:type="dxa" w:w="60"/>
+              <w:right w:type="dxa" w:w="100"/>
+            </w:tcMar>
+          </w:tcPr>
+          <w:p>
+            <w:r>
+              <w:rPr>
+                <w:rFonts w:ascii="Calibri" w:cs="Calibri" w:eastAsia="Calibri" w:hAnsi="Calibri"/>
+              </w:rPr>
+              <w:t xml:space="preserve">Al certificar se genera la Certificación del POA con programa y objetivo</w:t>
+            </w:r>
+          </w:p>
+        </w:tc>
+        <w:tc>
+          <w:tcPr>
+            <w:tcW w:type="dxa" w:w="860"/>
+            <w:tcBorders>
+              <w:top w:val="single" w:color="BFC8D4" w:sz="4"/>
+              <w:left w:val="single" w:color="BFC8D4" w:sz="4"/>
+              <w:bottom w:val="single" w:color="BFC8D4" w:sz="4"/>
+              <w:right w:val="single" w:color="BFC8D4" w:sz="4"/>
+            </w:tcBorders>
+            <w:tcMar>
+              <w:top w:type="dxa" w:w="60"/>
+              <w:left w:type="dxa" w:w="100"/>
+              <w:bottom w:type="dxa" w:w="60"/>
+              <w:right w:type="dxa" w:w="100"/>
+            </w:tcMar>
+          </w:tcPr>
+          <w:p>
+            <w:r>
+              <w:rPr>
+                <w:rFonts w:ascii="Calibri" w:cs="Calibri" w:eastAsia="Calibri" w:hAnsi="Calibri"/>
+              </w:rPr>
+              <w:t xml:space="preserve">☐</w:t>
+            </w:r>
+          </w:p>
+        </w:tc>
+      </w:tr>
+      <w:tr>
+        <w:trPr>
+          <w:cantSplit/>
+        </w:trPr>
+        <w:tc>
+          <w:tcPr>
+            <w:tcW w:type="dxa" w:w="500"/>
+            <w:tcBorders>
+              <w:top w:val="single" w:color="BFC8D4" w:sz="4"/>
+              <w:left w:val="single" w:color="BFC8D4" w:sz="4"/>
+              <w:bottom w:val="single" w:color="BFC8D4" w:sz="4"/>
+              <w:right w:val="single" w:color="BFC8D4" w:sz="4"/>
+            </w:tcBorders>
+            <w:tcMar>
+              <w:top w:type="dxa" w:w="60"/>
+              <w:left w:type="dxa" w:w="100"/>
+              <w:bottom w:type="dxa" w:w="60"/>
+              <w:right w:type="dxa" w:w="100"/>
+            </w:tcMar>
+          </w:tcPr>
+          <w:p>
+            <w:r>
+              <w:rPr>
+                <w:rFonts w:ascii="Calibri" w:cs="Calibri" w:eastAsia="Calibri" w:hAnsi="Calibri"/>
+              </w:rPr>
+              <w:t xml:space="preserve">21</w:t>
+            </w:r>
+          </w:p>
+        </w:tc>
+        <w:tc>
+          <w:tcPr>
+            <w:tcW w:type="dxa" w:w="8000"/>
+            <w:tcBorders>
+              <w:top w:val="single" w:color="BFC8D4" w:sz="4"/>
+              <w:left w:val="single" w:color="BFC8D4" w:sz="4"/>
+              <w:bottom w:val="single" w:color="BFC8D4" w:sz="4"/>
+              <w:right w:val="single" w:color="BFC8D4" w:sz="4"/>
+            </w:tcBorders>
+            <w:tcMar>
+              <w:top w:type="dxa" w:w="60"/>
+              <w:left w:type="dxa" w:w="100"/>
+              <w:bottom w:type="dxa" w:w="60"/>
+              <w:right w:type="dxa" w:w="100"/>
+            </w:tcMar>
+          </w:tcPr>
+          <w:p>
+            <w:r>
+              <w:rPr>
+                <w:rFonts w:ascii="Calibri" w:cs="Calibri" w:eastAsia="Calibri" w:hAnsi="Calibri"/>
+              </w:rPr>
+              <w:t xml:space="preserve">Sin objetivo o sin justificación POA: no se puede certificar</w:t>
+            </w:r>
+          </w:p>
+        </w:tc>
+        <w:tc>
+          <w:tcPr>
+            <w:tcW w:type="dxa" w:w="860"/>
+            <w:tcBorders>
+              <w:top w:val="single" w:color="BFC8D4" w:sz="4"/>
+              <w:left w:val="single" w:color="BFC8D4" w:sz="4"/>
+              <w:bottom w:val="single" w:color="BFC8D4" w:sz="4"/>
+              <w:right w:val="single" w:color="BFC8D4" w:sz="4"/>
+            </w:tcBorders>
+            <w:tcMar>
+              <w:top w:type="dxa" w:w="60"/>
+              <w:left w:type="dxa" w:w="100"/>
+              <w:bottom w:type="dxa" w:w="60"/>
+              <w:right w:type="dxa" w:w="100"/>
+            </w:tcMar>
+          </w:tcPr>
+          <w:p>
+            <w:r>
+              <w:rPr>
+                <w:rFonts w:ascii="Calibri" w:cs="Calibri" w:eastAsia="Calibri" w:hAnsi="Calibri"/>
+              </w:rPr>
+              <w:t xml:space="preserve">☐</w:t>
+            </w:r>
+          </w:p>
+        </w:tc>
+      </w:tr>
     </w:tbl>
     <w:p>
       <w:pPr>
@@ -14816,6 +15419,3564 @@
         </w:rPr>
         <w:t xml:space="preserve">.</w:t>
       </w:r>
+    </w:p>
+    <w:p>
+      <w:pPr>
+        <w:pStyle w:val="Heading1"/>
+        <w:pageBreakBefore/>
+      </w:pPr>
+      <w:r>
+        <w:rPr>
+          <w:rFonts w:ascii="Calibri" w:cs="Calibri" w:eastAsia="Calibri" w:hAnsi="Calibri"/>
+        </w:rPr>
+        <w:t xml:space="preserve">PARTE 5 — Funciones nuevas: importar desde Excel, POA y nota PAC</w:t>
+      </w:r>
+    </w:p>
+    <w:p>
+      <w:pPr>
+        <w:spacing w:after="120"/>
+      </w:pPr>
+      <w:r>
+        <w:rPr>
+          <w:rFonts w:ascii="Calibri" w:cs="Calibri" w:eastAsia="Calibri" w:hAnsi="Calibri"/>
+        </w:rPr>
+        <w:t xml:space="preserve">Esta parte prueba lo último que se agregó al sistema: </w:t>
+      </w:r>
+      <w:r>
+        <w:rPr>
+          <w:rFonts w:ascii="Calibri" w:cs="Calibri" w:eastAsia="Calibri" w:hAnsi="Calibri"/>
+          <w:b/>
+          <w:bCs/>
+        </w:rPr>
+        <w:t xml:space="preserve">cargar datos desde Excel</w:t>
+      </w:r>
+      <w:r>
+        <w:rPr>
+          <w:rFonts w:ascii="Calibri" w:cs="Calibri" w:eastAsia="Calibri" w:hAnsi="Calibri"/>
+        </w:rPr>
+        <w:t xml:space="preserve"> (presupuesto, catálogo «Compro Hecho en Bolivia» y objetivos del POA), la </w:t>
+      </w:r>
+      <w:r>
+        <w:rPr>
+          <w:rFonts w:ascii="Calibri" w:cs="Calibri" w:eastAsia="Calibri" w:hAnsi="Calibri"/>
+          <w:b/>
+          <w:bCs/>
+        </w:rPr>
+        <w:t xml:space="preserve">Certificación del POA</w:t>
+      </w:r>
+      <w:r>
+        <w:rPr>
+          <w:rFonts w:ascii="Calibri" w:cs="Calibri" w:eastAsia="Calibri" w:hAnsi="Calibri"/>
+        </w:rPr>
+        <w:t xml:space="preserve"> y la </w:t>
+      </w:r>
+      <w:r>
+        <w:rPr>
+          <w:rFonts w:ascii="Calibri" w:cs="Calibri" w:eastAsia="Calibri" w:hAnsi="Calibri"/>
+          <w:b/>
+          <w:bCs/>
+        </w:rPr>
+        <w:t xml:space="preserve">Nota de solicitud de registro al PAC</w:t>
+      </w:r>
+      <w:r>
+        <w:rPr>
+          <w:rFonts w:ascii="Calibri" w:cs="Calibri" w:eastAsia="Calibri" w:hAnsi="Calibri"/>
+        </w:rPr>
+        <w:t xml:space="preserve">. No necesita escribir comandos: todo se hace con botones.</w:t>
+      </w:r>
+    </w:p>
+    <w:p>
+      <w:pPr>
+        <w:pStyle w:val="Heading2"/>
+      </w:pPr>
+      <w:r>
+        <w:rPr>
+          <w:rFonts w:ascii="Calibri" w:cs="Calibri" w:eastAsia="Calibri" w:hAnsi="Calibri"/>
+        </w:rPr>
+        <w:t xml:space="preserve">5.1 Archivos de ejemplo</w:t>
+      </w:r>
+    </w:p>
+    <w:p>
+      <w:pPr>
+        <w:spacing w:after="120"/>
+      </w:pPr>
+      <w:r>
+        <w:rPr>
+          <w:rFonts w:ascii="Calibri" w:cs="Calibri" w:eastAsia="Calibri" w:hAnsi="Calibri"/>
+        </w:rPr>
+        <w:t xml:space="preserve">En la carpeta </w:t>
+      </w:r>
+      <w:r>
+        <w:rPr>
+          <w:rFonts w:ascii="Consolas" w:cs="Consolas" w:eastAsia="Consolas" w:hAnsi="Consolas"/>
+          <w:color w:val="7A1F1F"/>
+          <w:sz w:val="20"/>
+          <w:szCs w:val="20"/>
+        </w:rPr>
+        <w:t xml:space="preserve">sicom-muni\docs\ejemplos</w:t>
+      </w:r>
+      <w:r>
+        <w:rPr>
+          <w:rFonts w:ascii="Calibri" w:cs="Calibri" w:eastAsia="Calibri" w:hAnsi="Calibri"/>
+        </w:rPr>
+        <w:t xml:space="preserve"> hay cuatro archivos Excel listos para probar:</w:t>
+      </w:r>
+    </w:p>
+    <w:tbl>
+      <w:tblPr>
+        <w:tblW w:type="dxa" w:w="9360"/>
+        <w:tblBorders>
+          <w:top w:val="single" w:color="auto" w:sz="4"/>
+          <w:left w:val="single" w:color="auto" w:sz="4"/>
+          <w:bottom w:val="single" w:color="auto" w:sz="4"/>
+          <w:right w:val="single" w:color="auto" w:sz="4"/>
+          <w:insideH w:val="single" w:color="auto" w:sz="4"/>
+          <w:insideV w:val="single" w:color="auto" w:sz="4"/>
+        </w:tblBorders>
+      </w:tblPr>
+      <w:tblGrid>
+        <w:gridCol w:w="3300"/>
+        <w:gridCol w:w="4260"/>
+        <w:gridCol w:w="1800"/>
+      </w:tblGrid>
+      <w:tr>
+        <w:trPr>
+          <w:tblHeader/>
+        </w:trPr>
+        <w:tc>
+          <w:tcPr>
+            <w:tcW w:type="dxa" w:w="3300"/>
+            <w:tcBorders>
+              <w:top w:val="single" w:color="BFC8D4" w:sz="4"/>
+              <w:left w:val="single" w:color="BFC8D4" w:sz="4"/>
+              <w:bottom w:val="single" w:color="BFC8D4" w:sz="4"/>
+              <w:right w:val="single" w:color="BFC8D4" w:sz="4"/>
+            </w:tcBorders>
+            <w:shd w:fill="1F4E79" w:color="auto" w:val="clear"/>
+            <w:tcMar>
+              <w:top w:type="dxa" w:w="60"/>
+              <w:left w:type="dxa" w:w="100"/>
+              <w:bottom w:type="dxa" w:w="60"/>
+              <w:right w:type="dxa" w:w="100"/>
+            </w:tcMar>
+          </w:tcPr>
+          <w:p>
+            <w:r>
+              <w:rPr>
+                <w:rFonts w:ascii="Calibri" w:cs="Calibri" w:eastAsia="Calibri" w:hAnsi="Calibri"/>
+                <w:b/>
+                <w:bCs/>
+                <w:color w:val="FFFFFF"/>
+                <w:sz w:val="19"/>
+                <w:szCs w:val="19"/>
+              </w:rPr>
+              <w:t xml:space="preserve">Archivo</w:t>
+            </w:r>
+          </w:p>
+        </w:tc>
+        <w:tc>
+          <w:tcPr>
+            <w:tcW w:type="dxa" w:w="4260"/>
+            <w:tcBorders>
+              <w:top w:val="single" w:color="BFC8D4" w:sz="4"/>
+              <w:left w:val="single" w:color="BFC8D4" w:sz="4"/>
+              <w:bottom w:val="single" w:color="BFC8D4" w:sz="4"/>
+              <w:right w:val="single" w:color="BFC8D4" w:sz="4"/>
+            </w:tcBorders>
+            <w:shd w:fill="1F4E79" w:color="auto" w:val="clear"/>
+            <w:tcMar>
+              <w:top w:type="dxa" w:w="60"/>
+              <w:left w:type="dxa" w:w="100"/>
+              <w:bottom w:type="dxa" w:w="60"/>
+              <w:right w:type="dxa" w:w="100"/>
+            </w:tcMar>
+          </w:tcPr>
+          <w:p>
+            <w:r>
+              <w:rPr>
+                <w:rFonts w:ascii="Calibri" w:cs="Calibri" w:eastAsia="Calibri" w:hAnsi="Calibri"/>
+                <w:b/>
+                <w:bCs/>
+                <w:color w:val="FFFFFF"/>
+                <w:sz w:val="19"/>
+                <w:szCs w:val="19"/>
+              </w:rPr>
+              <w:t xml:space="preserve">Qué contiene</w:t>
+            </w:r>
+          </w:p>
+        </w:tc>
+        <w:tc>
+          <w:tcPr>
+            <w:tcW w:type="dxa" w:w="1800"/>
+            <w:tcBorders>
+              <w:top w:val="single" w:color="BFC8D4" w:sz="4"/>
+              <w:left w:val="single" w:color="BFC8D4" w:sz="4"/>
+              <w:bottom w:val="single" w:color="BFC8D4" w:sz="4"/>
+              <w:right w:val="single" w:color="BFC8D4" w:sz="4"/>
+            </w:tcBorders>
+            <w:shd w:fill="1F4E79" w:color="auto" w:val="clear"/>
+            <w:tcMar>
+              <w:top w:type="dxa" w:w="60"/>
+              <w:left w:type="dxa" w:w="100"/>
+              <w:bottom w:type="dxa" w:w="60"/>
+              <w:right w:type="dxa" w:w="100"/>
+            </w:tcMar>
+          </w:tcPr>
+          <w:p>
+            <w:r>
+              <w:rPr>
+                <w:rFonts w:ascii="Calibri" w:cs="Calibri" w:eastAsia="Calibri" w:hAnsi="Calibri"/>
+                <w:b/>
+                <w:bCs/>
+                <w:color w:val="FFFFFF"/>
+                <w:sz w:val="19"/>
+                <w:szCs w:val="19"/>
+              </w:rPr>
+              <w:t xml:space="preserve">Quién lo importa</w:t>
+            </w:r>
+          </w:p>
+        </w:tc>
+      </w:tr>
+      <w:tr>
+        <w:trPr>
+          <w:cantSplit/>
+        </w:trPr>
+        <w:tc>
+          <w:tcPr>
+            <w:tcW w:type="dxa" w:w="3300"/>
+            <w:tcBorders>
+              <w:top w:val="single" w:color="BFC8D4" w:sz="4"/>
+              <w:left w:val="single" w:color="BFC8D4" w:sz="4"/>
+              <w:bottom w:val="single" w:color="BFC8D4" w:sz="4"/>
+              <w:right w:val="single" w:color="BFC8D4" w:sz="4"/>
+            </w:tcBorders>
+            <w:tcMar>
+              <w:top w:type="dxa" w:w="60"/>
+              <w:left w:type="dxa" w:w="100"/>
+              <w:bottom w:type="dxa" w:w="60"/>
+              <w:right w:type="dxa" w:w="100"/>
+            </w:tcMar>
+          </w:tcPr>
+          <w:p>
+            <w:r>
+              <w:rPr>
+                <w:rFonts w:ascii="Consolas" w:cs="Consolas" w:eastAsia="Consolas" w:hAnsi="Consolas"/>
+                <w:color w:val="7A1F1F"/>
+                <w:sz w:val="20"/>
+                <w:szCs w:val="20"/>
+              </w:rPr>
+              <w:t xml:space="preserve">ejemplo_objetivos_poa.xlsx</w:t>
+            </w:r>
+          </w:p>
+        </w:tc>
+        <w:tc>
+          <w:tcPr>
+            <w:tcW w:type="dxa" w:w="4260"/>
+            <w:tcBorders>
+              <w:top w:val="single" w:color="BFC8D4" w:sz="4"/>
+              <w:left w:val="single" w:color="BFC8D4" w:sz="4"/>
+              <w:bottom w:val="single" w:color="BFC8D4" w:sz="4"/>
+              <w:right w:val="single" w:color="BFC8D4" w:sz="4"/>
+            </w:tcBorders>
+            <w:tcMar>
+              <w:top w:type="dxa" w:w="60"/>
+              <w:left w:type="dxa" w:w="100"/>
+              <w:bottom w:type="dxa" w:w="60"/>
+              <w:right w:type="dxa" w:w="100"/>
+            </w:tcMar>
+          </w:tcPr>
+          <w:p>
+            <w:r>
+              <w:rPr>
+                <w:rFonts w:ascii="Calibri" w:cs="Calibri" w:eastAsia="Calibri" w:hAnsi="Calibri"/>
+              </w:rPr>
+              <w:t xml:space="preserve">Los 34 programas y su objetivo del POA (la tabla que usted envió)</w:t>
+            </w:r>
+          </w:p>
+        </w:tc>
+        <w:tc>
+          <w:tcPr>
+            <w:tcW w:type="dxa" w:w="1800"/>
+            <w:tcBorders>
+              <w:top w:val="single" w:color="BFC8D4" w:sz="4"/>
+              <w:left w:val="single" w:color="BFC8D4" w:sz="4"/>
+              <w:bottom w:val="single" w:color="BFC8D4" w:sz="4"/>
+              <w:right w:val="single" w:color="BFC8D4" w:sz="4"/>
+            </w:tcBorders>
+            <w:tcMar>
+              <w:top w:type="dxa" w:w="60"/>
+              <w:left w:type="dxa" w:w="100"/>
+              <w:bottom w:type="dxa" w:w="60"/>
+              <w:right w:type="dxa" w:w="100"/>
+            </w:tcMar>
+          </w:tcPr>
+          <w:p>
+            <w:r>
+              <w:rPr>
+                <w:rFonts w:ascii="Calibri" w:cs="Calibri" w:eastAsia="Calibri" w:hAnsi="Calibri"/>
+              </w:rPr>
+              <w:t xml:space="preserve">Presupuesto</w:t>
+            </w:r>
+          </w:p>
+        </w:tc>
+      </w:tr>
+      <w:tr>
+        <w:trPr>
+          <w:cantSplit/>
+        </w:trPr>
+        <w:tc>
+          <w:tcPr>
+            <w:tcW w:type="dxa" w:w="3300"/>
+            <w:tcBorders>
+              <w:top w:val="single" w:color="BFC8D4" w:sz="4"/>
+              <w:left w:val="single" w:color="BFC8D4" w:sz="4"/>
+              <w:bottom w:val="single" w:color="BFC8D4" w:sz="4"/>
+              <w:right w:val="single" w:color="BFC8D4" w:sz="4"/>
+            </w:tcBorders>
+            <w:tcMar>
+              <w:top w:type="dxa" w:w="60"/>
+              <w:left w:type="dxa" w:w="100"/>
+              <w:bottom w:type="dxa" w:w="60"/>
+              <w:right w:type="dxa" w:w="100"/>
+            </w:tcMar>
+          </w:tcPr>
+          <w:p>
+            <w:r>
+              <w:rPr>
+                <w:rFonts w:ascii="Consolas" w:cs="Consolas" w:eastAsia="Consolas" w:hAnsi="Consolas"/>
+                <w:color w:val="7A1F1F"/>
+                <w:sz w:val="20"/>
+                <w:szCs w:val="20"/>
+              </w:rPr>
+              <w:t xml:space="preserve">ejemplo_presupuesto.xlsx</w:t>
+            </w:r>
+          </w:p>
+        </w:tc>
+        <w:tc>
+          <w:tcPr>
+            <w:tcW w:type="dxa" w:w="4260"/>
+            <w:tcBorders>
+              <w:top w:val="single" w:color="BFC8D4" w:sz="4"/>
+              <w:left w:val="single" w:color="BFC8D4" w:sz="4"/>
+              <w:bottom w:val="single" w:color="BFC8D4" w:sz="4"/>
+              <w:right w:val="single" w:color="BFC8D4" w:sz="4"/>
+            </w:tcBorders>
+            <w:tcMar>
+              <w:top w:type="dxa" w:w="60"/>
+              <w:left w:type="dxa" w:w="100"/>
+              <w:bottom w:type="dxa" w:w="60"/>
+              <w:right w:type="dxa" w:w="100"/>
+            </w:tcMar>
+          </w:tcPr>
+          <w:p>
+            <w:r>
+              <w:rPr>
+                <w:rFonts w:ascii="Calibri" w:cs="Calibri" w:eastAsia="Calibri" w:hAnsi="Calibri"/>
+              </w:rPr>
+              <w:t xml:space="preserve">Dos aperturas programáticas con sus partidas, fuente, organismo, presupuesto, ejecutado y saldo</w:t>
+            </w:r>
+          </w:p>
+        </w:tc>
+        <w:tc>
+          <w:tcPr>
+            <w:tcW w:type="dxa" w:w="1800"/>
+            <w:tcBorders>
+              <w:top w:val="single" w:color="BFC8D4" w:sz="4"/>
+              <w:left w:val="single" w:color="BFC8D4" w:sz="4"/>
+              <w:bottom w:val="single" w:color="BFC8D4" w:sz="4"/>
+              <w:right w:val="single" w:color="BFC8D4" w:sz="4"/>
+            </w:tcBorders>
+            <w:tcMar>
+              <w:top w:type="dxa" w:w="60"/>
+              <w:left w:type="dxa" w:w="100"/>
+              <w:bottom w:type="dxa" w:w="60"/>
+              <w:right w:type="dxa" w:w="100"/>
+            </w:tcMar>
+          </w:tcPr>
+          <w:p>
+            <w:r>
+              <w:rPr>
+                <w:rFonts w:ascii="Calibri" w:cs="Calibri" w:eastAsia="Calibri" w:hAnsi="Calibri"/>
+              </w:rPr>
+              <w:t xml:space="preserve">Presupuesto</w:t>
+            </w:r>
+          </w:p>
+        </w:tc>
+      </w:tr>
+      <w:tr>
+        <w:trPr>
+          <w:cantSplit/>
+        </w:trPr>
+        <w:tc>
+          <w:tcPr>
+            <w:tcW w:type="dxa" w:w="3300"/>
+            <w:tcBorders>
+              <w:top w:val="single" w:color="BFC8D4" w:sz="4"/>
+              <w:left w:val="single" w:color="BFC8D4" w:sz="4"/>
+              <w:bottom w:val="single" w:color="BFC8D4" w:sz="4"/>
+              <w:right w:val="single" w:color="BFC8D4" w:sz="4"/>
+            </w:tcBorders>
+            <w:tcMar>
+              <w:top w:type="dxa" w:w="60"/>
+              <w:left w:type="dxa" w:w="100"/>
+              <w:bottom w:type="dxa" w:w="60"/>
+              <w:right w:type="dxa" w:w="100"/>
+            </w:tcMar>
+          </w:tcPr>
+          <w:p>
+            <w:r>
+              <w:rPr>
+                <w:rFonts w:ascii="Consolas" w:cs="Consolas" w:eastAsia="Consolas" w:hAnsi="Consolas"/>
+                <w:color w:val="7A1F1F"/>
+                <w:sz w:val="20"/>
+                <w:szCs w:val="20"/>
+              </w:rPr>
+              <w:t xml:space="preserve">ejemplo_presupuesto_con_errores.xlsx</w:t>
+            </w:r>
+          </w:p>
+        </w:tc>
+        <w:tc>
+          <w:tcPr>
+            <w:tcW w:type="dxa" w:w="4260"/>
+            <w:tcBorders>
+              <w:top w:val="single" w:color="BFC8D4" w:sz="4"/>
+              <w:left w:val="single" w:color="BFC8D4" w:sz="4"/>
+              <w:bottom w:val="single" w:color="BFC8D4" w:sz="4"/>
+              <w:right w:val="single" w:color="BFC8D4" w:sz="4"/>
+            </w:tcBorders>
+            <w:tcMar>
+              <w:top w:type="dxa" w:w="60"/>
+              <w:left w:type="dxa" w:w="100"/>
+              <w:bottom w:type="dxa" w:w="60"/>
+              <w:right w:type="dxa" w:w="100"/>
+            </w:tcMar>
+          </w:tcPr>
+          <w:p>
+            <w:r>
+              <w:rPr>
+                <w:rFonts w:ascii="Calibri" w:cs="Calibri" w:eastAsia="Calibri" w:hAnsi="Calibri"/>
+              </w:rPr>
+              <w:t xml:space="preserve">Lo mismo pero con 3 errores a propósito, para ver cómo avisa el sistema</w:t>
+            </w:r>
+          </w:p>
+        </w:tc>
+        <w:tc>
+          <w:tcPr>
+            <w:tcW w:type="dxa" w:w="1800"/>
+            <w:tcBorders>
+              <w:top w:val="single" w:color="BFC8D4" w:sz="4"/>
+              <w:left w:val="single" w:color="BFC8D4" w:sz="4"/>
+              <w:bottom w:val="single" w:color="BFC8D4" w:sz="4"/>
+              <w:right w:val="single" w:color="BFC8D4" w:sz="4"/>
+            </w:tcBorders>
+            <w:tcMar>
+              <w:top w:type="dxa" w:w="60"/>
+              <w:left w:type="dxa" w:w="100"/>
+              <w:bottom w:type="dxa" w:w="60"/>
+              <w:right w:type="dxa" w:w="100"/>
+            </w:tcMar>
+          </w:tcPr>
+          <w:p>
+            <w:r>
+              <w:rPr>
+                <w:rFonts w:ascii="Calibri" w:cs="Calibri" w:eastAsia="Calibri" w:hAnsi="Calibri"/>
+              </w:rPr>
+              <w:t xml:space="preserve">Presupuesto</w:t>
+            </w:r>
+          </w:p>
+        </w:tc>
+      </w:tr>
+      <w:tr>
+        <w:trPr>
+          <w:cantSplit/>
+        </w:trPr>
+        <w:tc>
+          <w:tcPr>
+            <w:tcW w:type="dxa" w:w="3300"/>
+            <w:tcBorders>
+              <w:top w:val="single" w:color="BFC8D4" w:sz="4"/>
+              <w:left w:val="single" w:color="BFC8D4" w:sz="4"/>
+              <w:bottom w:val="single" w:color="BFC8D4" w:sz="4"/>
+              <w:right w:val="single" w:color="BFC8D4" w:sz="4"/>
+            </w:tcBorders>
+            <w:tcMar>
+              <w:top w:type="dxa" w:w="60"/>
+              <w:left w:type="dxa" w:w="100"/>
+              <w:bottom w:type="dxa" w:w="60"/>
+              <w:right w:type="dxa" w:w="100"/>
+            </w:tcMar>
+          </w:tcPr>
+          <w:p>
+            <w:r>
+              <w:rPr>
+                <w:rFonts w:ascii="Consolas" w:cs="Consolas" w:eastAsia="Consolas" w:hAnsi="Consolas"/>
+                <w:color w:val="7A1F1F"/>
+                <w:sz w:val="20"/>
+                <w:szCs w:val="20"/>
+              </w:rPr>
+              <w:t xml:space="preserve">ejemplo_catalogo_chb.xlsx</w:t>
+            </w:r>
+          </w:p>
+        </w:tc>
+        <w:tc>
+          <w:tcPr>
+            <w:tcW w:type="dxa" w:w="4260"/>
+            <w:tcBorders>
+              <w:top w:val="single" w:color="BFC8D4" w:sz="4"/>
+              <w:left w:val="single" w:color="BFC8D4" w:sz="4"/>
+              <w:bottom w:val="single" w:color="BFC8D4" w:sz="4"/>
+              <w:right w:val="single" w:color="BFC8D4" w:sz="4"/>
+            </w:tcBorders>
+            <w:tcMar>
+              <w:top w:type="dxa" w:w="60"/>
+              <w:left w:type="dxa" w:w="100"/>
+              <w:bottom w:type="dxa" w:w="60"/>
+              <w:right w:type="dxa" w:w="100"/>
+            </w:tcMar>
+          </w:tcPr>
+          <w:p>
+            <w:r>
+              <w:rPr>
+                <w:rFonts w:ascii="Calibri" w:cs="Calibri" w:eastAsia="Calibri" w:hAnsi="Calibri"/>
+              </w:rPr>
+              <w:t xml:space="preserve">8 productos con código UNSPSC, descripción y precio</w:t>
+            </w:r>
+          </w:p>
+        </w:tc>
+        <w:tc>
+          <w:tcPr>
+            <w:tcW w:type="dxa" w:w="1800"/>
+            <w:tcBorders>
+              <w:top w:val="single" w:color="BFC8D4" w:sz="4"/>
+              <w:left w:val="single" w:color="BFC8D4" w:sz="4"/>
+              <w:bottom w:val="single" w:color="BFC8D4" w:sz="4"/>
+              <w:right w:val="single" w:color="BFC8D4" w:sz="4"/>
+            </w:tcBorders>
+            <w:tcMar>
+              <w:top w:type="dxa" w:w="60"/>
+              <w:left w:type="dxa" w:w="100"/>
+              <w:bottom w:type="dxa" w:w="60"/>
+              <w:right w:type="dxa" w:w="100"/>
+            </w:tcMar>
+          </w:tcPr>
+          <w:p>
+            <w:r>
+              <w:rPr>
+                <w:rFonts w:ascii="Calibri" w:cs="Calibri" w:eastAsia="Calibri" w:hAnsi="Calibri"/>
+              </w:rPr>
+              <w:t xml:space="preserve">Contrataciones</w:t>
+            </w:r>
+          </w:p>
+        </w:tc>
+      </w:tr>
+    </w:tbl>
+    <w:p>
+      <w:pPr>
+        <w:spacing w:after="160"/>
+      </w:pPr>
+    </w:p>
+    <w:tbl>
+      <w:tblPr>
+        <w:tblW w:type="dxa" w:w="9360"/>
+        <w:tblBorders>
+          <w:top w:val="single" w:color="auto" w:sz="4"/>
+          <w:left w:val="single" w:color="auto" w:sz="4"/>
+          <w:bottom w:val="single" w:color="auto" w:sz="4"/>
+          <w:right w:val="single" w:color="auto" w:sz="4"/>
+          <w:insideH w:val="single" w:color="auto" w:sz="4"/>
+          <w:insideV w:val="single" w:color="auto" w:sz="4"/>
+        </w:tblBorders>
+      </w:tblPr>
+      <w:tblGrid>
+        <w:gridCol w:w="9360"/>
+      </w:tblGrid>
+      <w:tr>
+        <w:tc>
+          <w:tcPr>
+            <w:tcW w:type="dxa" w:w="9360"/>
+            <w:tcBorders>
+              <w:top w:val="single" w:color="BFC8D4" w:sz="4"/>
+              <w:left w:val="single" w:color="BFC8D4" w:sz="4"/>
+              <w:bottom w:val="single" w:color="BFC8D4" w:sz="4"/>
+              <w:right w:val="single" w:color="BFC8D4" w:sz="4"/>
+            </w:tcBorders>
+            <w:shd w:fill="E8F1FB" w:color="auto" w:val="clear"/>
+            <w:tcMar>
+              <w:top w:type="dxa" w:w="100"/>
+              <w:left w:type="dxa" w:w="160"/>
+              <w:bottom w:type="dxa" w:w="100"/>
+              <w:right w:type="dxa" w:w="160"/>
+            </w:tcMar>
+          </w:tcPr>
+          <w:p>
+            <w:r>
+              <w:rPr>
+                <w:rFonts w:ascii="Calibri" w:cs="Calibri" w:eastAsia="Calibri" w:hAnsi="Calibri"/>
+                <w:b/>
+                <w:bCs/>
+              </w:rPr>
+              <w:t xml:space="preserve">Consejo: </w:t>
+            </w:r>
+            <w:r>
+              <w:rPr>
+                <w:rFonts w:ascii="Calibri" w:cs="Calibri" w:eastAsia="Calibri" w:hAnsi="Calibri"/>
+              </w:rPr>
+              <w:t xml:space="preserve">Para usar </w:t>
+            </w:r>
+            <w:r>
+              <w:rPr>
+                <w:rFonts w:ascii="Calibri" w:cs="Calibri" w:eastAsia="Calibri" w:hAnsi="Calibri"/>
+                <w:b/>
+                <w:bCs/>
+              </w:rPr>
+              <w:t xml:space="preserve">sus propios datos</w:t>
+            </w:r>
+            <w:r>
+              <w:rPr>
+                <w:rFonts w:ascii="Calibri" w:cs="Calibri" w:eastAsia="Calibri" w:hAnsi="Calibri"/>
+              </w:rPr>
+              <w:t xml:space="preserve">, descargue la plantilla desde el botón «Descargar plantilla de ejemplo» de cada ventana de importación, copie sus datos en ella y guárdela como </w:t>
+            </w:r>
+            <w:r>
+              <w:rPr>
+                <w:rFonts w:ascii="Calibri" w:cs="Calibri" w:eastAsia="Calibri" w:hAnsi="Calibri"/>
+                <w:b/>
+                <w:bCs/>
+              </w:rPr>
+              <w:t xml:space="preserve">.xlsx</w:t>
+            </w:r>
+            <w:r>
+              <w:rPr>
+                <w:rFonts w:ascii="Calibri" w:cs="Calibri" w:eastAsia="Calibri" w:hAnsi="Calibri"/>
+              </w:rPr>
+              <w:t xml:space="preserve">. Los nombres de las columnas deben ser los de la plantilla (no importan mayúsculas ni tildes).</w:t>
+            </w:r>
+          </w:p>
+        </w:tc>
+      </w:tr>
+    </w:tbl>
+    <w:p>
+      <w:pPr>
+        <w:spacing w:after="160"/>
+      </w:pPr>
+    </w:p>
+    <w:p>
+      <w:pPr>
+        <w:pStyle w:val="Heading2"/>
+      </w:pPr>
+      <w:r>
+        <w:rPr>
+          <w:rFonts w:ascii="Calibri" w:cs="Calibri" w:eastAsia="Calibri" w:hAnsi="Calibri"/>
+        </w:rPr>
+        <w:t xml:space="preserve">5.2 Importar los objetivos del POA (usuario: presupuesto)</w:t>
+      </w:r>
+    </w:p>
+    <w:p>
+      <w:pPr>
+        <w:pStyle w:val="ListParagraph"/>
+        <w:numPr>
+          <w:ilvl w:val="0"/>
+          <w:numId w:val="7"/>
+        </w:numPr>
+        <w:spacing w:after="80"/>
+      </w:pPr>
+      <w:r>
+        <w:rPr>
+          <w:rFonts w:ascii="Calibri" w:cs="Calibri" w:eastAsia="Calibri" w:hAnsi="Calibri"/>
+        </w:rPr>
+        <w:t xml:space="preserve">Entre con </w:t>
+      </w:r>
+      <w:r>
+        <w:rPr>
+          <w:rFonts w:ascii="Consolas" w:cs="Consolas" w:eastAsia="Consolas" w:hAnsi="Consolas"/>
+          <w:color w:val="7A1F1F"/>
+          <w:sz w:val="20"/>
+          <w:szCs w:val="20"/>
+        </w:rPr>
+        <w:t xml:space="preserve">presupuesto</w:t>
+      </w:r>
+      <w:r>
+        <w:rPr>
+          <w:rFonts w:ascii="Calibri" w:cs="Calibri" w:eastAsia="Calibri" w:hAnsi="Calibri"/>
+        </w:rPr>
+        <w:t xml:space="preserve">. En el menú izquierdo pulse </w:t>
+      </w:r>
+      <w:r>
+        <w:rPr>
+          <w:rFonts w:ascii="Calibri" w:cs="Calibri" w:eastAsia="Calibri" w:hAnsi="Calibri"/>
+          <w:b/>
+          <w:bCs/>
+        </w:rPr>
+        <w:t xml:space="preserve">Objetivos POA</w:t>
+      </w:r>
+      <w:r>
+        <w:rPr>
+          <w:rFonts w:ascii="Calibri" w:cs="Calibri" w:eastAsia="Calibri" w:hAnsi="Calibri"/>
+        </w:rPr>
+        <w:t xml:space="preserve">.</w:t>
+      </w:r>
+    </w:p>
+    <w:p>
+      <w:pPr>
+        <w:pStyle w:val="ListParagraph"/>
+        <w:numPr>
+          <w:ilvl w:val="0"/>
+          <w:numId w:val="7"/>
+        </w:numPr>
+        <w:spacing w:after="80"/>
+      </w:pPr>
+      <w:r>
+        <w:rPr>
+          <w:rFonts w:ascii="Calibri" w:cs="Calibri" w:eastAsia="Calibri" w:hAnsi="Calibri"/>
+        </w:rPr>
+        <w:t xml:space="preserve">Pulse </w:t>
+      </w:r>
+      <w:r>
+        <w:rPr>
+          <w:rFonts w:ascii="Calibri" w:cs="Calibri" w:eastAsia="Calibri" w:hAnsi="Calibri"/>
+          <w:b/>
+          <w:bCs/>
+        </w:rPr>
+        <w:t xml:space="preserve">Importar desde Excel</w:t>
+      </w:r>
+      <w:r>
+        <w:rPr>
+          <w:rFonts w:ascii="Calibri" w:cs="Calibri" w:eastAsia="Calibri" w:hAnsi="Calibri"/>
+        </w:rPr>
+        <w:t xml:space="preserve">.</w:t>
+      </w:r>
+    </w:p>
+    <w:p>
+      <w:pPr>
+        <w:pStyle w:val="ListParagraph"/>
+        <w:numPr>
+          <w:ilvl w:val="0"/>
+          <w:numId w:val="7"/>
+        </w:numPr>
+        <w:spacing w:after="80"/>
+      </w:pPr>
+      <w:r>
+        <w:rPr>
+          <w:rFonts w:ascii="Calibri" w:cs="Calibri" w:eastAsia="Calibri" w:hAnsi="Calibri"/>
+        </w:rPr>
+        <w:t xml:space="preserve">Pulse </w:t>
+      </w:r>
+      <w:r>
+        <w:rPr>
+          <w:rFonts w:ascii="Calibri" w:cs="Calibri" w:eastAsia="Calibri" w:hAnsi="Calibri"/>
+          <w:b/>
+          <w:bCs/>
+        </w:rPr>
+        <w:t xml:space="preserve">Choose File / Elegir archivo</w:t>
+      </w:r>
+      <w:r>
+        <w:rPr>
+          <w:rFonts w:ascii="Calibri" w:cs="Calibri" w:eastAsia="Calibri" w:hAnsi="Calibri"/>
+        </w:rPr>
+        <w:t xml:space="preserve"> y busque </w:t>
+      </w:r>
+      <w:r>
+        <w:rPr>
+          <w:rFonts w:ascii="Consolas" w:cs="Consolas" w:eastAsia="Consolas" w:hAnsi="Consolas"/>
+          <w:color w:val="7A1F1F"/>
+          <w:sz w:val="20"/>
+          <w:szCs w:val="20"/>
+        </w:rPr>
+        <w:t xml:space="preserve">ejemplo_objetivos_poa.xlsx</w:t>
+      </w:r>
+      <w:r>
+        <w:rPr>
+          <w:rFonts w:ascii="Calibri" w:cs="Calibri" w:eastAsia="Calibri" w:hAnsi="Calibri"/>
+        </w:rPr>
+        <w:t xml:space="preserve">.</w:t>
+      </w:r>
+    </w:p>
+    <w:p>
+      <w:pPr>
+        <w:pStyle w:val="ListParagraph"/>
+        <w:numPr>
+          <w:ilvl w:val="0"/>
+          <w:numId w:val="7"/>
+        </w:numPr>
+        <w:spacing w:after="80"/>
+      </w:pPr>
+      <w:r>
+        <w:rPr>
+          <w:rFonts w:ascii="Calibri" w:cs="Calibri" w:eastAsia="Calibri" w:hAnsi="Calibri"/>
+        </w:rPr>
+        <w:t xml:space="preserve">Pulse </w:t>
+      </w:r>
+      <w:r>
+        <w:rPr>
+          <w:rFonts w:ascii="Calibri" w:cs="Calibri" w:eastAsia="Calibri" w:hAnsi="Calibri"/>
+          <w:b/>
+          <w:bCs/>
+        </w:rPr>
+        <w:t xml:space="preserve">Validar archivo</w:t>
+      </w:r>
+      <w:r>
+        <w:rPr>
+          <w:rFonts w:ascii="Calibri" w:cs="Calibri" w:eastAsia="Calibri" w:hAnsi="Calibri"/>
+        </w:rPr>
+        <w:t xml:space="preserve">. Debe aparecer un cuadro azul «Archivo válido (aún no se guardó nada)». Todavía no se ha guardado nada.</w:t>
+      </w:r>
+    </w:p>
+    <w:p>
+      <w:pPr>
+        <w:pStyle w:val="ListParagraph"/>
+        <w:numPr>
+          <w:ilvl w:val="0"/>
+          <w:numId w:val="7"/>
+        </w:numPr>
+        <w:spacing w:after="80"/>
+      </w:pPr>
+      <w:r>
+        <w:rPr>
+          <w:rFonts w:ascii="Calibri" w:cs="Calibri" w:eastAsia="Calibri" w:hAnsi="Calibri"/>
+        </w:rPr>
+        <w:t xml:space="preserve">Pulse el botón verde </w:t>
+      </w:r>
+      <w:r>
+        <w:rPr>
+          <w:rFonts w:ascii="Calibri" w:cs="Calibri" w:eastAsia="Calibri" w:hAnsi="Calibri"/>
+          <w:b/>
+          <w:bCs/>
+        </w:rPr>
+        <w:t xml:space="preserve">Confirmar importación</w:t>
+      </w:r>
+      <w:r>
+        <w:rPr>
+          <w:rFonts w:ascii="Calibri" w:cs="Calibri" w:eastAsia="Calibri" w:hAnsi="Calibri"/>
+        </w:rPr>
+        <w:t xml:space="preserve">. Aparece «Importación realizada». Pulse </w:t>
+      </w:r>
+      <w:r>
+        <w:rPr>
+          <w:rFonts w:ascii="Calibri" w:cs="Calibri" w:eastAsia="Calibri" w:hAnsi="Calibri"/>
+          <w:b/>
+          <w:bCs/>
+        </w:rPr>
+        <w:t xml:space="preserve">Cerrar</w:t>
+      </w:r>
+      <w:r>
+        <w:rPr>
+          <w:rFonts w:ascii="Calibri" w:cs="Calibri" w:eastAsia="Calibri" w:hAnsi="Calibri"/>
+        </w:rPr>
+        <w:t xml:space="preserve">.</w:t>
+      </w:r>
+    </w:p>
+    <w:p>
+      <w:pPr>
+        <w:pStyle w:val="ListParagraph"/>
+        <w:numPr>
+          <w:ilvl w:val="0"/>
+          <w:numId w:val="7"/>
+        </w:numPr>
+        <w:spacing w:after="80"/>
+      </w:pPr>
+      <w:r>
+        <w:rPr>
+          <w:rFonts w:ascii="Calibri" w:cs="Calibri" w:eastAsia="Calibri" w:hAnsi="Calibri"/>
+        </w:rPr>
+        <w:t xml:space="preserve">La tabla muestra cada programa con su objetivo. También puede agregar o corregir uno con </w:t>
+      </w:r>
+      <w:r>
+        <w:rPr>
+          <w:rFonts w:ascii="Calibri" w:cs="Calibri" w:eastAsia="Calibri" w:hAnsi="Calibri"/>
+          <w:b/>
+          <w:bCs/>
+        </w:rPr>
+        <w:t xml:space="preserve">Registrar objetivo</w:t>
+      </w:r>
+      <w:r>
+        <w:rPr>
+          <w:rFonts w:ascii="Calibri" w:cs="Calibri" w:eastAsia="Calibri" w:hAnsi="Calibri"/>
+        </w:rPr>
+        <w:t xml:space="preserve"> o </w:t>
+      </w:r>
+      <w:r>
+        <w:rPr>
+          <w:rFonts w:ascii="Calibri" w:cs="Calibri" w:eastAsia="Calibri" w:hAnsi="Calibri"/>
+          <w:b/>
+          <w:bCs/>
+        </w:rPr>
+        <w:t xml:space="preserve">Editar</w:t>
+      </w:r>
+      <w:r>
+        <w:rPr>
+          <w:rFonts w:ascii="Calibri" w:cs="Calibri" w:eastAsia="Calibri" w:hAnsi="Calibri"/>
+        </w:rPr>
+        <w:t xml:space="preserve">.</w:t>
+      </w:r>
+    </w:p>
+    <w:p>
+      <w:pPr>
+        <w:keepNext/>
+        <w:spacing w:after="40" w:before="80"/>
+        <w:jc w:val="center"/>
+      </w:pPr>
+      <w:r>
+        <w:drawing>
+          <wp:inline distT="0" distB="0" distL="0" distR="0">
+            <wp:extent cx="4752975" cy="3343275"/>
+            <wp:effectExtent t="0" r="0" b="0" l="0"/>
+            <wp:docPr id="1" name="35-poa-importar-valido.png" descr="Validación del archivo de objetivos POA" title="Validación del archivo de objetivos POA"/>
+            <wp:cNvGraphicFramePr>
+              <a:graphicFrameLocks xmlns:a="http://schemas.openxmlformats.org/drawingml/2006/main" noChangeAspect="1"/>
+            </wp:cNvGraphicFramePr>
+            <a:graphic xmlns:a="http://schemas.openxmlformats.org/drawingml/2006/main">
+              <a:graphicData uri="http://schemas.openxmlformats.org/drawingml/2006/picture">
+                <pic:pic xmlns:pic="http://schemas.openxmlformats.org/drawingml/2006/picture">
+                  <pic:nvPicPr>
+                    <pic:cNvPr id="0" name="" descr=""/>
+                    <pic:cNvPicPr>
+                      <a:picLocks noChangeAspect="1" noChangeArrowheads="1"/>
+                    </pic:cNvPicPr>
+                  </pic:nvPicPr>
+                  <pic:blipFill>
+                    <a:blip r:embed="rId30" cstate="none"/>
+                    <a:srcRect/>
+                    <a:stretch>
+                      <a:fillRect/>
+                    </a:stretch>
+                  </pic:blipFill>
+                  <pic:spPr bwMode="auto">
+                    <a:xfrm>
+                      <a:off x="0" y="0"/>
+                      <a:ext cx="4752975" cy="3343275"/>
+                    </a:xfrm>
+                    <a:prstGeom prst="rect">
+                      <a:avLst/>
+                    </a:prstGeom>
+                  </pic:spPr>
+                </pic:pic>
+              </a:graphicData>
+            </a:graphic>
+          </wp:inline>
+        </w:drawing>
+      </w:r>
+    </w:p>
+    <w:p>
+      <w:pPr>
+        <w:spacing w:after="200"/>
+        <w:jc w:val="center"/>
+      </w:pPr>
+      <w:r>
+        <w:rPr>
+          <w:rFonts w:ascii="Calibri" w:cs="Calibri" w:eastAsia="Calibri" w:hAnsi="Calibri"/>
+          <w:i/>
+          <w:iCs/>
+          <w:color w:val="555555"/>
+          <w:sz w:val="18"/>
+          <w:szCs w:val="18"/>
+        </w:rPr>
+        <w:t xml:space="preserve">Figura: Validación del archivo de objetivos POA</w:t>
+      </w:r>
+    </w:p>
+    <w:p>
+      <w:pPr>
+        <w:pStyle w:val="Heading2"/>
+      </w:pPr>
+      <w:r>
+        <w:rPr>
+          <w:rFonts w:ascii="Calibri" w:cs="Calibri" w:eastAsia="Calibri" w:hAnsi="Calibri"/>
+        </w:rPr>
+        <w:t xml:space="preserve">5.3 Importar el presupuesto por apertura programática (usuario: presupuesto)</w:t>
+      </w:r>
+    </w:p>
+    <w:p>
+      <w:pPr>
+        <w:pStyle w:val="ListParagraph"/>
+        <w:numPr>
+          <w:ilvl w:val="0"/>
+          <w:numId w:val="8"/>
+        </w:numPr>
+        <w:spacing w:after="80"/>
+      </w:pPr>
+      <w:r>
+        <w:rPr>
+          <w:rFonts w:ascii="Calibri" w:cs="Calibri" w:eastAsia="Calibri" w:hAnsi="Calibri"/>
+        </w:rPr>
+        <w:t xml:space="preserve">En el menú pulse </w:t>
+      </w:r>
+      <w:r>
+        <w:rPr>
+          <w:rFonts w:ascii="Calibri" w:cs="Calibri" w:eastAsia="Calibri" w:hAnsi="Calibri"/>
+          <w:b/>
+          <w:bCs/>
+        </w:rPr>
+        <w:t xml:space="preserve">Presupuesto</w:t>
+      </w:r>
+      <w:r>
+        <w:rPr>
+          <w:rFonts w:ascii="Calibri" w:cs="Calibri" w:eastAsia="Calibri" w:hAnsi="Calibri"/>
+        </w:rPr>
+        <w:t xml:space="preserve"> y luego </w:t>
+      </w:r>
+      <w:r>
+        <w:rPr>
+          <w:rFonts w:ascii="Calibri" w:cs="Calibri" w:eastAsia="Calibri" w:hAnsi="Calibri"/>
+          <w:b/>
+          <w:bCs/>
+        </w:rPr>
+        <w:t xml:space="preserve">Importar desde Excel</w:t>
+      </w:r>
+      <w:r>
+        <w:rPr>
+          <w:rFonts w:ascii="Calibri" w:cs="Calibri" w:eastAsia="Calibri" w:hAnsi="Calibri"/>
+        </w:rPr>
+        <w:t xml:space="preserve">.</w:t>
+      </w:r>
+    </w:p>
+    <w:p>
+      <w:pPr>
+        <w:pStyle w:val="ListParagraph"/>
+        <w:numPr>
+          <w:ilvl w:val="0"/>
+          <w:numId w:val="8"/>
+        </w:numPr>
+        <w:spacing w:after="80"/>
+      </w:pPr>
+      <w:r>
+        <w:rPr>
+          <w:rFonts w:ascii="Calibri" w:cs="Calibri" w:eastAsia="Calibri" w:hAnsi="Calibri"/>
+          <w:b/>
+          <w:bCs/>
+        </w:rPr>
+        <w:t xml:space="preserve">Primero la prueba con errores:</w:t>
+      </w:r>
+      <w:r>
+        <w:rPr>
+          <w:rFonts w:ascii="Calibri" w:cs="Calibri" w:eastAsia="Calibri" w:hAnsi="Calibri"/>
+        </w:rPr>
+        <w:t xml:space="preserve"> elija </w:t>
+      </w:r>
+      <w:r>
+        <w:rPr>
+          <w:rFonts w:ascii="Consolas" w:cs="Consolas" w:eastAsia="Consolas" w:hAnsi="Consolas"/>
+          <w:color w:val="7A1F1F"/>
+          <w:sz w:val="20"/>
+          <w:szCs w:val="20"/>
+        </w:rPr>
+        <w:t xml:space="preserve">ejemplo_presupuesto_con_errores.xlsx</w:t>
+      </w:r>
+      <w:r>
+        <w:rPr>
+          <w:rFonts w:ascii="Calibri" w:cs="Calibri" w:eastAsia="Calibri" w:hAnsi="Calibri"/>
+        </w:rPr>
+        <w:t xml:space="preserve"> y pulse </w:t>
+      </w:r>
+      <w:r>
+        <w:rPr>
+          <w:rFonts w:ascii="Calibri" w:cs="Calibri" w:eastAsia="Calibri" w:hAnsi="Calibri"/>
+          <w:b/>
+          <w:bCs/>
+        </w:rPr>
+        <w:t xml:space="preserve">Validar archivo</w:t>
+      </w:r>
+      <w:r>
+        <w:rPr>
+          <w:rFonts w:ascii="Calibri" w:cs="Calibri" w:eastAsia="Calibri" w:hAnsi="Calibri"/>
+        </w:rPr>
+        <w:t xml:space="preserve">. El sistema muestra un cuadro </w:t>
+      </w:r>
+      <w:r>
+        <w:rPr>
+          <w:rFonts w:ascii="Calibri" w:cs="Calibri" w:eastAsia="Calibri" w:hAnsi="Calibri"/>
+          <w:b/>
+          <w:bCs/>
+        </w:rPr>
+        <w:t xml:space="preserve">rojo</w:t>
+      </w:r>
+      <w:r>
+        <w:rPr>
+          <w:rFonts w:ascii="Calibri" w:cs="Calibri" w:eastAsia="Calibri" w:hAnsi="Calibri"/>
+        </w:rPr>
+        <w:t xml:space="preserve"> con la lista de errores (fila 3: código de apertura inválido; fila 4: partida de 4 dígitos; fila 5: monto negativo) y el botón </w:t>
+      </w:r>
+      <w:r>
+        <w:rPr>
+          <w:rFonts w:ascii="Calibri" w:cs="Calibri" w:eastAsia="Calibri" w:hAnsi="Calibri"/>
+          <w:b/>
+          <w:bCs/>
+        </w:rPr>
+        <w:t xml:space="preserve">Confirmar importación</w:t>
+      </w:r>
+      <w:r>
+        <w:rPr>
+          <w:rFonts w:ascii="Calibri" w:cs="Calibri" w:eastAsia="Calibri" w:hAnsi="Calibri"/>
+        </w:rPr>
+        <w:t xml:space="preserve"> queda </w:t>
+      </w:r>
+      <w:r>
+        <w:rPr>
+          <w:rFonts w:ascii="Calibri" w:cs="Calibri" w:eastAsia="Calibri" w:hAnsi="Calibri"/>
+          <w:b/>
+          <w:bCs/>
+        </w:rPr>
+        <w:t xml:space="preserve">apagado</w:t>
+      </w:r>
+      <w:r>
+        <w:rPr>
+          <w:rFonts w:ascii="Calibri" w:cs="Calibri" w:eastAsia="Calibri" w:hAnsi="Calibri"/>
+        </w:rPr>
+        <w:t xml:space="preserve">: no deja guardar datos malos.</w:t>
+      </w:r>
+    </w:p>
+    <w:p>
+      <w:pPr>
+        <w:pStyle w:val="ListParagraph"/>
+        <w:numPr>
+          <w:ilvl w:val="0"/>
+          <w:numId w:val="8"/>
+        </w:numPr>
+        <w:spacing w:after="80"/>
+      </w:pPr>
+      <w:r>
+        <w:rPr>
+          <w:rFonts w:ascii="Calibri" w:cs="Calibri" w:eastAsia="Calibri" w:hAnsi="Calibri"/>
+        </w:rPr>
+        <w:t xml:space="preserve">Ahora elija </w:t>
+      </w:r>
+      <w:r>
+        <w:rPr>
+          <w:rFonts w:ascii="Consolas" w:cs="Consolas" w:eastAsia="Consolas" w:hAnsi="Consolas"/>
+          <w:color w:val="7A1F1F"/>
+          <w:sz w:val="20"/>
+          <w:szCs w:val="20"/>
+        </w:rPr>
+        <w:t xml:space="preserve">ejemplo_presupuesto.xlsx</w:t>
+      </w:r>
+      <w:r>
+        <w:rPr>
+          <w:rFonts w:ascii="Calibri" w:cs="Calibri" w:eastAsia="Calibri" w:hAnsi="Calibri"/>
+        </w:rPr>
+        <w:t xml:space="preserve"> y pulse </w:t>
+      </w:r>
+      <w:r>
+        <w:rPr>
+          <w:rFonts w:ascii="Calibri" w:cs="Calibri" w:eastAsia="Calibri" w:hAnsi="Calibri"/>
+          <w:b/>
+          <w:bCs/>
+        </w:rPr>
+        <w:t xml:space="preserve">Validar archivo</w:t>
+      </w:r>
+      <w:r>
+        <w:rPr>
+          <w:rFonts w:ascii="Calibri" w:cs="Calibri" w:eastAsia="Calibri" w:hAnsi="Calibri"/>
+        </w:rPr>
+        <w:t xml:space="preserve">: «6 nuevas, 0 existentes que se actualizarán, 1 omitida». (La omitida es una partida 52100: el sistema solo usa partidas de 10000 a 49999.)</w:t>
+      </w:r>
+    </w:p>
+    <w:p>
+      <w:pPr>
+        <w:pStyle w:val="ListParagraph"/>
+        <w:numPr>
+          <w:ilvl w:val="0"/>
+          <w:numId w:val="8"/>
+        </w:numPr>
+        <w:spacing w:after="80"/>
+      </w:pPr>
+      <w:r>
+        <w:rPr>
+          <w:rFonts w:ascii="Calibri" w:cs="Calibri" w:eastAsia="Calibri" w:hAnsi="Calibri"/>
+        </w:rPr>
+        <w:t xml:space="preserve">Pulse </w:t>
+      </w:r>
+      <w:r>
+        <w:rPr>
+          <w:rFonts w:ascii="Calibri" w:cs="Calibri" w:eastAsia="Calibri" w:hAnsi="Calibri"/>
+          <w:b/>
+          <w:bCs/>
+        </w:rPr>
+        <w:t xml:space="preserve">Confirmar importación</w:t>
+      </w:r>
+      <w:r>
+        <w:rPr>
+          <w:rFonts w:ascii="Calibri" w:cs="Calibri" w:eastAsia="Calibri" w:hAnsi="Calibri"/>
+        </w:rPr>
+        <w:t xml:space="preserve"> y </w:t>
+      </w:r>
+      <w:r>
+        <w:rPr>
+          <w:rFonts w:ascii="Calibri" w:cs="Calibri" w:eastAsia="Calibri" w:hAnsi="Calibri"/>
+          <w:b/>
+          <w:bCs/>
+        </w:rPr>
+        <w:t xml:space="preserve">Cerrar</w:t>
+      </w:r>
+      <w:r>
+        <w:rPr>
+          <w:rFonts w:ascii="Calibri" w:cs="Calibri" w:eastAsia="Calibri" w:hAnsi="Calibri"/>
+        </w:rPr>
+        <w:t xml:space="preserve">.</w:t>
+      </w:r>
+    </w:p>
+    <w:p>
+      <w:pPr>
+        <w:pStyle w:val="ListParagraph"/>
+        <w:numPr>
+          <w:ilvl w:val="0"/>
+          <w:numId w:val="8"/>
+        </w:numPr>
+        <w:spacing w:after="80"/>
+      </w:pPr>
+      <w:r>
+        <w:rPr>
+          <w:rFonts w:ascii="Calibri" w:cs="Calibri" w:eastAsia="Calibri" w:hAnsi="Calibri"/>
+        </w:rPr>
+        <w:t xml:space="preserve">La tabla ahora muestra </w:t>
+      </w:r>
+      <w:r>
+        <w:rPr>
+          <w:rFonts w:ascii="Calibri" w:cs="Calibri" w:eastAsia="Calibri" w:hAnsi="Calibri"/>
+          <w:b/>
+          <w:bCs/>
+        </w:rPr>
+        <w:t xml:space="preserve">Apertura (Prog-Proy-Act)</w:t>
+      </w:r>
+      <w:r>
+        <w:rPr>
+          <w:rFonts w:ascii="Calibri" w:cs="Calibri" w:eastAsia="Calibri" w:hAnsi="Calibri"/>
+        </w:rPr>
+        <w:t xml:space="preserve">, descripción de la apertura, partida, fuente/organismo, </w:t>
+      </w:r>
+      <w:r>
+        <w:rPr>
+          <w:rFonts w:ascii="Calibri" w:cs="Calibri" w:eastAsia="Calibri" w:hAnsi="Calibri"/>
+          <w:b/>
+          <w:bCs/>
+        </w:rPr>
+        <w:t xml:space="preserve">Presupuesto, Ejecutado, Preventivo activo y Saldo</w:t>
+      </w:r>
+      <w:r>
+        <w:rPr>
+          <w:rFonts w:ascii="Calibri" w:cs="Calibri" w:eastAsia="Calibri" w:hAnsi="Calibri"/>
+        </w:rPr>
+        <w:t xml:space="preserve">.</w:t>
+      </w:r>
+    </w:p>
+    <w:p>
+      <w:pPr>
+        <w:pStyle w:val="ListParagraph"/>
+        <w:numPr>
+          <w:ilvl w:val="0"/>
+          <w:numId w:val="8"/>
+        </w:numPr>
+        <w:spacing w:after="80"/>
+      </w:pPr>
+      <w:r>
+        <w:rPr>
+          <w:rFonts w:ascii="Calibri" w:cs="Calibri" w:eastAsia="Calibri" w:hAnsi="Calibri"/>
+        </w:rPr>
+        <w:t xml:space="preserve">Pruebe repetir la importación del mismo archivo: dirá «0 nuevas, 6 existentes que se actualizarán»: no se duplica nada.</w:t>
+      </w:r>
+    </w:p>
+    <w:p>
+      <w:pPr>
+        <w:keepNext/>
+        <w:spacing w:after="40" w:before="80"/>
+        <w:jc w:val="center"/>
+      </w:pPr>
+      <w:r>
+        <w:drawing>
+          <wp:inline distT="0" distB="0" distL="0" distR="0">
+            <wp:extent cx="4752975" cy="3343275"/>
+            <wp:effectExtent t="0" r="0" b="0" l="0"/>
+            <wp:docPr id="1" name="31-presupuesto-importar-errores.png" descr="El sistema lista los errores y no deja confirmar" title="El sistema lista los errores y no deja confirmar"/>
+            <wp:cNvGraphicFramePr>
+              <a:graphicFrameLocks xmlns:a="http://schemas.openxmlformats.org/drawingml/2006/main" noChangeAspect="1"/>
+            </wp:cNvGraphicFramePr>
+            <a:graphic xmlns:a="http://schemas.openxmlformats.org/drawingml/2006/main">
+              <a:graphicData uri="http://schemas.openxmlformats.org/drawingml/2006/picture">
+                <pic:pic xmlns:pic="http://schemas.openxmlformats.org/drawingml/2006/picture">
+                  <pic:nvPicPr>
+                    <pic:cNvPr id="0" name="" descr=""/>
+                    <pic:cNvPicPr>
+                      <a:picLocks noChangeAspect="1" noChangeArrowheads="1"/>
+                    </pic:cNvPicPr>
+                  </pic:nvPicPr>
+                  <pic:blipFill>
+                    <a:blip r:embed="rId31" cstate="none"/>
+                    <a:srcRect/>
+                    <a:stretch>
+                      <a:fillRect/>
+                    </a:stretch>
+                  </pic:blipFill>
+                  <pic:spPr bwMode="auto">
+                    <a:xfrm>
+                      <a:off x="0" y="0"/>
+                      <a:ext cx="4752975" cy="3343275"/>
+                    </a:xfrm>
+                    <a:prstGeom prst="rect">
+                      <a:avLst/>
+                    </a:prstGeom>
+                  </pic:spPr>
+                </pic:pic>
+              </a:graphicData>
+            </a:graphic>
+          </wp:inline>
+        </w:drawing>
+      </w:r>
+    </w:p>
+    <w:p>
+      <w:pPr>
+        <w:spacing w:after="200"/>
+        <w:jc w:val="center"/>
+      </w:pPr>
+      <w:r>
+        <w:rPr>
+          <w:rFonts w:ascii="Calibri" w:cs="Calibri" w:eastAsia="Calibri" w:hAnsi="Calibri"/>
+          <w:i/>
+          <w:iCs/>
+          <w:color w:val="555555"/>
+          <w:sz w:val="18"/>
+          <w:szCs w:val="18"/>
+        </w:rPr>
+        <w:t xml:space="preserve">Figura: El sistema lista los errores y no deja confirmar</w:t>
+      </w:r>
+    </w:p>
+    <w:p>
+      <w:pPr>
+        <w:keepNext/>
+        <w:spacing w:after="40" w:before="80"/>
+        <w:jc w:val="center"/>
+      </w:pPr>
+      <w:r>
+        <w:drawing>
+          <wp:inline distT="0" distB="0" distL="0" distR="0">
+            <wp:extent cx="4752975" cy="3343275"/>
+            <wp:effectExtent t="0" r="0" b="0" l="0"/>
+            <wp:docPr id="1" name="33-presupuesto-tabla.png" descr="Presupuesto por apertura programática" title="Presupuesto por apertura programática"/>
+            <wp:cNvGraphicFramePr>
+              <a:graphicFrameLocks xmlns:a="http://schemas.openxmlformats.org/drawingml/2006/main" noChangeAspect="1"/>
+            </wp:cNvGraphicFramePr>
+            <a:graphic xmlns:a="http://schemas.openxmlformats.org/drawingml/2006/main">
+              <a:graphicData uri="http://schemas.openxmlformats.org/drawingml/2006/picture">
+                <pic:pic xmlns:pic="http://schemas.openxmlformats.org/drawingml/2006/picture">
+                  <pic:nvPicPr>
+                    <pic:cNvPr id="0" name="" descr=""/>
+                    <pic:cNvPicPr>
+                      <a:picLocks noChangeAspect="1" noChangeArrowheads="1"/>
+                    </pic:cNvPicPr>
+                  </pic:nvPicPr>
+                  <pic:blipFill>
+                    <a:blip r:embed="rId32" cstate="none"/>
+                    <a:srcRect/>
+                    <a:stretch>
+                      <a:fillRect/>
+                    </a:stretch>
+                  </pic:blipFill>
+                  <pic:spPr bwMode="auto">
+                    <a:xfrm>
+                      <a:off x="0" y="0"/>
+                      <a:ext cx="4752975" cy="3343275"/>
+                    </a:xfrm>
+                    <a:prstGeom prst="rect">
+                      <a:avLst/>
+                    </a:prstGeom>
+                  </pic:spPr>
+                </pic:pic>
+              </a:graphicData>
+            </a:graphic>
+          </wp:inline>
+        </w:drawing>
+      </w:r>
+    </w:p>
+    <w:p>
+      <w:pPr>
+        <w:spacing w:after="200"/>
+        <w:jc w:val="center"/>
+      </w:pPr>
+      <w:r>
+        <w:rPr>
+          <w:rFonts w:ascii="Calibri" w:cs="Calibri" w:eastAsia="Calibri" w:hAnsi="Calibri"/>
+          <w:i/>
+          <w:iCs/>
+          <w:color w:val="555555"/>
+          <w:sz w:val="18"/>
+          <w:szCs w:val="18"/>
+        </w:rPr>
+        <w:t xml:space="preserve">Figura: Presupuesto por apertura programática</w:t>
+      </w:r>
+    </w:p>
+    <w:p>
+      <w:pPr>
+        <w:pStyle w:val="Heading2"/>
+      </w:pPr>
+      <w:r>
+        <w:rPr>
+          <w:rFonts w:ascii="Calibri" w:cs="Calibri" w:eastAsia="Calibri" w:hAnsi="Calibri"/>
+        </w:rPr>
+        <w:t xml:space="preserve">5.4 Importar el catálogo CHB (usuario: contrataciones)</w:t>
+      </w:r>
+    </w:p>
+    <w:p>
+      <w:pPr>
+        <w:pStyle w:val="ListParagraph"/>
+        <w:numPr>
+          <w:ilvl w:val="0"/>
+          <w:numId w:val="9"/>
+        </w:numPr>
+        <w:spacing w:after="80"/>
+      </w:pPr>
+      <w:r>
+        <w:rPr>
+          <w:rFonts w:ascii="Calibri" w:cs="Calibri" w:eastAsia="Calibri" w:hAnsi="Calibri"/>
+        </w:rPr>
+        <w:t xml:space="preserve">Entre con </w:t>
+      </w:r>
+      <w:r>
+        <w:rPr>
+          <w:rFonts w:ascii="Consolas" w:cs="Consolas" w:eastAsia="Consolas" w:hAnsi="Consolas"/>
+          <w:color w:val="7A1F1F"/>
+          <w:sz w:val="20"/>
+          <w:szCs w:val="20"/>
+        </w:rPr>
+        <w:t xml:space="preserve">contrataciones</w:t>
+      </w:r>
+      <w:r>
+        <w:rPr>
+          <w:rFonts w:ascii="Calibri" w:cs="Calibri" w:eastAsia="Calibri" w:hAnsi="Calibri"/>
+        </w:rPr>
+        <w:t xml:space="preserve">. En el menú pulse </w:t>
+      </w:r>
+      <w:r>
+        <w:rPr>
+          <w:rFonts w:ascii="Calibri" w:cs="Calibri" w:eastAsia="Calibri" w:hAnsi="Calibri"/>
+          <w:b/>
+          <w:bCs/>
+        </w:rPr>
+        <w:t xml:space="preserve">Catálogo CHB</w:t>
+      </w:r>
+      <w:r>
+        <w:rPr>
+          <w:rFonts w:ascii="Calibri" w:cs="Calibri" w:eastAsia="Calibri" w:hAnsi="Calibri"/>
+        </w:rPr>
+        <w:t xml:space="preserve">.</w:t>
+      </w:r>
+    </w:p>
+    <w:p>
+      <w:pPr>
+        <w:pStyle w:val="ListParagraph"/>
+        <w:numPr>
+          <w:ilvl w:val="0"/>
+          <w:numId w:val="9"/>
+        </w:numPr>
+        <w:spacing w:after="80"/>
+      </w:pPr>
+      <w:r>
+        <w:rPr>
+          <w:rFonts w:ascii="Calibri" w:cs="Calibri" w:eastAsia="Calibri" w:hAnsi="Calibri"/>
+        </w:rPr>
+        <w:t xml:space="preserve">Pulse </w:t>
+      </w:r>
+      <w:r>
+        <w:rPr>
+          <w:rFonts w:ascii="Calibri" w:cs="Calibri" w:eastAsia="Calibri" w:hAnsi="Calibri"/>
+          <w:b/>
+          <w:bCs/>
+        </w:rPr>
+        <w:t xml:space="preserve">Importar desde Excel</w:t>
+      </w:r>
+      <w:r>
+        <w:rPr>
+          <w:rFonts w:ascii="Calibri" w:cs="Calibri" w:eastAsia="Calibri" w:hAnsi="Calibri"/>
+        </w:rPr>
+        <w:t xml:space="preserve">, elija </w:t>
+      </w:r>
+      <w:r>
+        <w:rPr>
+          <w:rFonts w:ascii="Consolas" w:cs="Consolas" w:eastAsia="Consolas" w:hAnsi="Consolas"/>
+          <w:color w:val="7A1F1F"/>
+          <w:sz w:val="20"/>
+          <w:szCs w:val="20"/>
+        </w:rPr>
+        <w:t xml:space="preserve">ejemplo_catalogo_chb.xlsx</w:t>
+      </w:r>
+      <w:r>
+        <w:rPr>
+          <w:rFonts w:ascii="Calibri" w:cs="Calibri" w:eastAsia="Calibri" w:hAnsi="Calibri"/>
+        </w:rPr>
+        <w:t xml:space="preserve">, </w:t>
+      </w:r>
+      <w:r>
+        <w:rPr>
+          <w:rFonts w:ascii="Calibri" w:cs="Calibri" w:eastAsia="Calibri" w:hAnsi="Calibri"/>
+          <w:b/>
+          <w:bCs/>
+        </w:rPr>
+        <w:t xml:space="preserve">Validar archivo</w:t>
+      </w:r>
+      <w:r>
+        <w:rPr>
+          <w:rFonts w:ascii="Calibri" w:cs="Calibri" w:eastAsia="Calibri" w:hAnsi="Calibri"/>
+        </w:rPr>
+        <w:t xml:space="preserve">.</w:t>
+      </w:r>
+    </w:p>
+    <w:p>
+      <w:pPr>
+        <w:pStyle w:val="ListParagraph"/>
+        <w:numPr>
+          <w:ilvl w:val="0"/>
+          <w:numId w:val="9"/>
+        </w:numPr>
+        <w:spacing w:after="80"/>
+      </w:pPr>
+      <w:r>
+        <w:rPr>
+          <w:rFonts w:ascii="Calibri" w:cs="Calibri" w:eastAsia="Calibri" w:hAnsi="Calibri"/>
+        </w:rPr>
+        <w:t xml:space="preserve">Verá en la vista previa el cemento (30111505) como </w:t>
+      </w:r>
+      <w:r>
+        <w:rPr>
+          <w:rFonts w:ascii="Calibri" w:cs="Calibri" w:eastAsia="Calibri" w:hAnsi="Calibri"/>
+          <w:b/>
+          <w:bCs/>
+        </w:rPr>
+        <w:t xml:space="preserve">REEMPLAZA</w:t>
+      </w:r>
+      <w:r>
+        <w:rPr>
+          <w:rFonts w:ascii="Calibri" w:cs="Calibri" w:eastAsia="Calibri" w:hAnsi="Calibri"/>
+        </w:rPr>
+        <w:t xml:space="preserve"> (ya existía: se actualiza su precio) y los demás como </w:t>
+      </w:r>
+      <w:r>
+        <w:rPr>
+          <w:rFonts w:ascii="Calibri" w:cs="Calibri" w:eastAsia="Calibri" w:hAnsi="Calibri"/>
+          <w:b/>
+          <w:bCs/>
+        </w:rPr>
+        <w:t xml:space="preserve">NUEVO</w:t>
+      </w:r>
+      <w:r>
+        <w:rPr>
+          <w:rFonts w:ascii="Calibri" w:cs="Calibri" w:eastAsia="Calibri" w:hAnsi="Calibri"/>
+        </w:rPr>
+        <w:t xml:space="preserve">. Pulse </w:t>
+      </w:r>
+      <w:r>
+        <w:rPr>
+          <w:rFonts w:ascii="Calibri" w:cs="Calibri" w:eastAsia="Calibri" w:hAnsi="Calibri"/>
+          <w:b/>
+          <w:bCs/>
+        </w:rPr>
+        <w:t xml:space="preserve">Confirmar importación</w:t>
+      </w:r>
+      <w:r>
+        <w:rPr>
+          <w:rFonts w:ascii="Calibri" w:cs="Calibri" w:eastAsia="Calibri" w:hAnsi="Calibri"/>
+        </w:rPr>
+        <w:t xml:space="preserve">.</w:t>
+      </w:r>
+    </w:p>
+    <w:p>
+      <w:pPr>
+        <w:pStyle w:val="ListParagraph"/>
+        <w:numPr>
+          <w:ilvl w:val="0"/>
+          <w:numId w:val="9"/>
+        </w:numPr>
+        <w:spacing w:after="80"/>
+      </w:pPr>
+      <w:r>
+        <w:rPr>
+          <w:rFonts w:ascii="Calibri" w:cs="Calibri" w:eastAsia="Calibri" w:hAnsi="Calibri"/>
+        </w:rPr>
+        <w:t xml:space="preserve">En la lista aparece la columna </w:t>
+      </w:r>
+      <w:r>
+        <w:rPr>
+          <w:rFonts w:ascii="Calibri" w:cs="Calibri" w:eastAsia="Calibri" w:hAnsi="Calibri"/>
+          <w:b/>
+          <w:bCs/>
+        </w:rPr>
+        <w:t xml:space="preserve">Fecha de registro</w:t>
+      </w:r>
+      <w:r>
+        <w:rPr>
+          <w:rFonts w:ascii="Calibri" w:cs="Calibri" w:eastAsia="Calibri" w:hAnsi="Calibri"/>
+        </w:rPr>
+        <w:t xml:space="preserve"> con la fecha de hoy. Cada vez que importe, los códigos repetidos se reemplazan (nuevo precio y fecha); los que no vengan en el archivo se conservan.</w:t>
+      </w:r>
+    </w:p>
+    <w:p>
+      <w:pPr>
+        <w:keepNext/>
+        <w:spacing w:after="40" w:before="80"/>
+        <w:jc w:val="center"/>
+      </w:pPr>
+      <w:r>
+        <w:drawing>
+          <wp:inline distT="0" distB="0" distL="0" distR="0">
+            <wp:extent cx="4752975" cy="3343275"/>
+            <wp:effectExtent t="0" r="0" b="0" l="0"/>
+            <wp:docPr id="1" name="38-chb-importar-valido.png" descr="Catálogo CHB: REEMPLAZA / NUEVO" title="Catálogo CHB: REEMPLAZA / NUEVO"/>
+            <wp:cNvGraphicFramePr>
+              <a:graphicFrameLocks xmlns:a="http://schemas.openxmlformats.org/drawingml/2006/main" noChangeAspect="1"/>
+            </wp:cNvGraphicFramePr>
+            <a:graphic xmlns:a="http://schemas.openxmlformats.org/drawingml/2006/main">
+              <a:graphicData uri="http://schemas.openxmlformats.org/drawingml/2006/picture">
+                <pic:pic xmlns:pic="http://schemas.openxmlformats.org/drawingml/2006/picture">
+                  <pic:nvPicPr>
+                    <pic:cNvPr id="0" name="" descr=""/>
+                    <pic:cNvPicPr>
+                      <a:picLocks noChangeAspect="1" noChangeArrowheads="1"/>
+                    </pic:cNvPicPr>
+                  </pic:nvPicPr>
+                  <pic:blipFill>
+                    <a:blip r:embed="rId33" cstate="none"/>
+                    <a:srcRect/>
+                    <a:stretch>
+                      <a:fillRect/>
+                    </a:stretch>
+                  </pic:blipFill>
+                  <pic:spPr bwMode="auto">
+                    <a:xfrm>
+                      <a:off x="0" y="0"/>
+                      <a:ext cx="4752975" cy="3343275"/>
+                    </a:xfrm>
+                    <a:prstGeom prst="rect">
+                      <a:avLst/>
+                    </a:prstGeom>
+                  </pic:spPr>
+                </pic:pic>
+              </a:graphicData>
+            </a:graphic>
+          </wp:inline>
+        </w:drawing>
+      </w:r>
+    </w:p>
+    <w:p>
+      <w:pPr>
+        <w:spacing w:after="200"/>
+        <w:jc w:val="center"/>
+      </w:pPr>
+      <w:r>
+        <w:rPr>
+          <w:rFonts w:ascii="Calibri" w:cs="Calibri" w:eastAsia="Calibri" w:hAnsi="Calibri"/>
+          <w:i/>
+          <w:iCs/>
+          <w:color w:val="555555"/>
+          <w:sz w:val="18"/>
+          <w:szCs w:val="18"/>
+        </w:rPr>
+        <w:t xml:space="preserve">Figura: Catálogo CHB: REEMPLAZA / NUEVO</w:t>
+      </w:r>
+    </w:p>
+    <w:p>
+      <w:pPr>
+        <w:pStyle w:val="Heading2"/>
+      </w:pPr>
+      <w:r>
+        <w:rPr>
+          <w:rFonts w:ascii="Calibri" w:cs="Calibri" w:eastAsia="Calibri" w:hAnsi="Calibri"/>
+        </w:rPr>
+        <w:t xml:space="preserve">5.5 Registrar la Máxima Autoridad Ejecutiva (usuario: admin)</w:t>
+      </w:r>
+    </w:p>
+    <w:p>
+      <w:pPr>
+        <w:pStyle w:val="ListParagraph"/>
+        <w:numPr>
+          <w:ilvl w:val="0"/>
+          <w:numId w:val="10"/>
+        </w:numPr>
+        <w:spacing w:after="80"/>
+      </w:pPr>
+      <w:r>
+        <w:rPr>
+          <w:rFonts w:ascii="Calibri" w:cs="Calibri" w:eastAsia="Calibri" w:hAnsi="Calibri"/>
+        </w:rPr>
+        <w:t xml:space="preserve">Entre con </w:t>
+      </w:r>
+      <w:r>
+        <w:rPr>
+          <w:rFonts w:ascii="Consolas" w:cs="Consolas" w:eastAsia="Consolas" w:hAnsi="Consolas"/>
+          <w:color w:val="7A1F1F"/>
+          <w:sz w:val="20"/>
+          <w:szCs w:val="20"/>
+        </w:rPr>
+        <w:t xml:space="preserve">admin</w:t>
+      </w:r>
+      <w:r>
+        <w:rPr>
+          <w:rFonts w:ascii="Calibri" w:cs="Calibri" w:eastAsia="Calibri" w:hAnsi="Calibri"/>
+        </w:rPr>
+        <w:t xml:space="preserve">. Menú </w:t>
+      </w:r>
+      <w:r>
+        <w:rPr>
+          <w:rFonts w:ascii="Calibri" w:cs="Calibri" w:eastAsia="Calibri" w:hAnsi="Calibri"/>
+          <w:b/>
+          <w:bCs/>
+        </w:rPr>
+        <w:t xml:space="preserve">Parámetros del GAM</w:t>
+      </w:r>
+      <w:r>
+        <w:rPr>
+          <w:rFonts w:ascii="Calibri" w:cs="Calibri" w:eastAsia="Calibri" w:hAnsi="Calibri"/>
+        </w:rPr>
+        <w:t xml:space="preserve">.</w:t>
+      </w:r>
+    </w:p>
+    <w:p>
+      <w:pPr>
+        <w:pStyle w:val="ListParagraph"/>
+        <w:numPr>
+          <w:ilvl w:val="0"/>
+          <w:numId w:val="10"/>
+        </w:numPr>
+        <w:spacing w:after="80"/>
+      </w:pPr>
+      <w:r>
+        <w:rPr>
+          <w:rFonts w:ascii="Calibri" w:cs="Calibri" w:eastAsia="Calibri" w:hAnsi="Calibri"/>
+        </w:rPr>
+        <w:t xml:space="preserve">Busque las filas </w:t>
+      </w:r>
+      <w:r>
+        <w:rPr>
+          <w:rFonts w:ascii="Consolas" w:cs="Consolas" w:eastAsia="Consolas" w:hAnsi="Consolas"/>
+          <w:color w:val="7A1F1F"/>
+          <w:sz w:val="20"/>
+          <w:szCs w:val="20"/>
+        </w:rPr>
+        <w:t xml:space="preserve">mae_nombre</w:t>
+      </w:r>
+      <w:r>
+        <w:rPr>
+          <w:rFonts w:ascii="Calibri" w:cs="Calibri" w:eastAsia="Calibri" w:hAnsi="Calibri"/>
+        </w:rPr>
+        <w:t xml:space="preserve"> y </w:t>
+      </w:r>
+      <w:r>
+        <w:rPr>
+          <w:rFonts w:ascii="Consolas" w:cs="Consolas" w:eastAsia="Consolas" w:hAnsi="Consolas"/>
+          <w:color w:val="7A1F1F"/>
+          <w:sz w:val="20"/>
+          <w:szCs w:val="20"/>
+        </w:rPr>
+        <w:t xml:space="preserve">mae_cargo</w:t>
+      </w:r>
+      <w:r>
+        <w:rPr>
+          <w:rFonts w:ascii="Calibri" w:cs="Calibri" w:eastAsia="Calibri" w:hAnsi="Calibri"/>
+        </w:rPr>
+        <w:t xml:space="preserve">. Escriba el nombre y el cargo de su autoridad (en la demostración ya aparecen datos ficticios) y pulse </w:t>
+      </w:r>
+      <w:r>
+        <w:rPr>
+          <w:rFonts w:ascii="Calibri" w:cs="Calibri" w:eastAsia="Calibri" w:hAnsi="Calibri"/>
+          <w:b/>
+          <w:bCs/>
+        </w:rPr>
+        <w:t xml:space="preserve">Guardar</w:t>
+      </w:r>
+      <w:r>
+        <w:rPr>
+          <w:rFonts w:ascii="Calibri" w:cs="Calibri" w:eastAsia="Calibri" w:hAnsi="Calibri"/>
+        </w:rPr>
+        <w:t xml:space="preserve"> en cada una.</w:t>
+      </w:r>
+    </w:p>
+    <w:p>
+      <w:pPr>
+        <w:pStyle w:val="ListParagraph"/>
+        <w:numPr>
+          <w:ilvl w:val="0"/>
+          <w:numId w:val="10"/>
+        </w:numPr>
+        <w:spacing w:after="80"/>
+      </w:pPr>
+      <w:r>
+        <w:rPr>
+          <w:rFonts w:ascii="Calibri" w:cs="Calibri" w:eastAsia="Calibri" w:hAnsi="Calibri"/>
+        </w:rPr>
+        <w:t xml:space="preserve">Esa persona será la destinataria de la </w:t>
+      </w:r>
+      <w:r>
+        <w:rPr>
+          <w:rFonts w:ascii="Calibri" w:cs="Calibri" w:eastAsia="Calibri" w:hAnsi="Calibri"/>
+          <w:b/>
+          <w:bCs/>
+        </w:rPr>
+        <w:t xml:space="preserve">Nota de solicitud de registro al PAC</w:t>
+      </w:r>
+      <w:r>
+        <w:rPr>
+          <w:rFonts w:ascii="Calibri" w:cs="Calibri" w:eastAsia="Calibri" w:hAnsi="Calibri"/>
+        </w:rPr>
+        <w:t xml:space="preserve">.</w:t>
+      </w:r>
+    </w:p>
+    <w:p>
+      <w:pPr>
+        <w:keepNext/>
+        <w:spacing w:after="40" w:before="80"/>
+        <w:jc w:val="center"/>
+      </w:pPr>
+      <w:r>
+        <w:drawing>
+          <wp:inline distT="0" distB="0" distL="0" distR="0">
+            <wp:extent cx="3305175" cy="4933950"/>
+            <wp:effectExtent t="0" r="0" b="0" l="0"/>
+            <wp:docPr id="1" name="41-parametros-mae.png" descr="Parámetros con la Máxima Autoridad Ejecutiva" title="Parámetros con la Máxima Autoridad Ejecutiva"/>
+            <wp:cNvGraphicFramePr>
+              <a:graphicFrameLocks xmlns:a="http://schemas.openxmlformats.org/drawingml/2006/main" noChangeAspect="1"/>
+            </wp:cNvGraphicFramePr>
+            <a:graphic xmlns:a="http://schemas.openxmlformats.org/drawingml/2006/main">
+              <a:graphicData uri="http://schemas.openxmlformats.org/drawingml/2006/picture">
+                <pic:pic xmlns:pic="http://schemas.openxmlformats.org/drawingml/2006/picture">
+                  <pic:nvPicPr>
+                    <pic:cNvPr id="0" name="" descr=""/>
+                    <pic:cNvPicPr>
+                      <a:picLocks noChangeAspect="1" noChangeArrowheads="1"/>
+                    </pic:cNvPicPr>
+                  </pic:nvPicPr>
+                  <pic:blipFill>
+                    <a:blip r:embed="rId34" cstate="none"/>
+                    <a:srcRect/>
+                    <a:stretch>
+                      <a:fillRect/>
+                    </a:stretch>
+                  </pic:blipFill>
+                  <pic:spPr bwMode="auto">
+                    <a:xfrm>
+                      <a:off x="0" y="0"/>
+                      <a:ext cx="3305175" cy="4933950"/>
+                    </a:xfrm>
+                    <a:prstGeom prst="rect">
+                      <a:avLst/>
+                    </a:prstGeom>
+                  </pic:spPr>
+                </pic:pic>
+              </a:graphicData>
+            </a:graphic>
+          </wp:inline>
+        </w:drawing>
+      </w:r>
+    </w:p>
+    <w:p>
+      <w:pPr>
+        <w:spacing w:after="200"/>
+        <w:jc w:val="center"/>
+      </w:pPr>
+      <w:r>
+        <w:rPr>
+          <w:rFonts w:ascii="Calibri" w:cs="Calibri" w:eastAsia="Calibri" w:hAnsi="Calibri"/>
+          <w:i/>
+          <w:iCs/>
+          <w:color w:val="555555"/>
+          <w:sz w:val="18"/>
+          <w:szCs w:val="18"/>
+        </w:rPr>
+        <w:t xml:space="preserve">Figura: Parámetros con la Máxima Autoridad Ejecutiva</w:t>
+      </w:r>
+    </w:p>
+    <w:p>
+      <w:pPr>
+        <w:pStyle w:val="Heading2"/>
+      </w:pPr>
+      <w:r>
+        <w:rPr>
+          <w:rFonts w:ascii="Calibri" w:cs="Calibri" w:eastAsia="Calibri" w:hAnsi="Calibri"/>
+        </w:rPr>
+        <w:t xml:space="preserve">5.6 Ejemplo 3: compra de computadoras por Bs 25.000</w:t>
+      </w:r>
+    </w:p>
+    <w:p>
+      <w:pPr>
+        <w:spacing w:after="120"/>
+      </w:pPr>
+      <w:r>
+        <w:rPr>
+          <w:rFonts w:ascii="Calibri" w:cs="Calibri" w:eastAsia="Calibri" w:hAnsi="Calibri"/>
+        </w:rPr>
+        <w:t xml:space="preserve">Es la compra de la nota modelo («equipos de computación, 25.000 Bs»). Como supera Bs 20.000 se emite la </w:t>
+      </w:r>
+      <w:r>
+        <w:rPr>
+          <w:rFonts w:ascii="Calibri" w:cs="Calibri" w:eastAsia="Calibri" w:hAnsi="Calibri"/>
+          <w:b/>
+          <w:bCs/>
+        </w:rPr>
+        <w:t xml:space="preserve">nota PAC</w:t>
+      </w:r>
+      <w:r>
+        <w:rPr>
+          <w:rFonts w:ascii="Calibri" w:cs="Calibri" w:eastAsia="Calibri" w:hAnsi="Calibri"/>
+        </w:rPr>
+        <w:t xml:space="preserve">, y al certificar se emite la </w:t>
+      </w:r>
+      <w:r>
+        <w:rPr>
+          <w:rFonts w:ascii="Calibri" w:cs="Calibri" w:eastAsia="Calibri" w:hAnsi="Calibri"/>
+          <w:b/>
+          <w:bCs/>
+        </w:rPr>
+        <w:t xml:space="preserve">Certificación del POA</w:t>
+      </w:r>
+      <w:r>
+        <w:rPr>
+          <w:rFonts w:ascii="Calibri" w:cs="Calibri" w:eastAsia="Calibri" w:hAnsi="Calibri"/>
+        </w:rPr>
+        <w:t xml:space="preserve">.</w:t>
+      </w:r>
+    </w:p>
+    <w:p>
+      <w:pPr>
+        <w:keepNext/>
+        <w:spacing w:after="60" w:before="200"/>
+      </w:pPr>
+      <w:r>
+        <w:rPr>
+          <w:rFonts w:ascii="Calibri" w:cs="Calibri" w:eastAsia="Calibri" w:hAnsi="Calibri"/>
+          <w:b/>
+          <w:bCs/>
+          <w:color w:val="1F4E79"/>
+        </w:rPr>
+        <w:t xml:space="preserve">Paso P1 — </w:t>
+      </w:r>
+      <w:r>
+        <w:rPr>
+          <w:rFonts w:ascii="Calibri" w:cs="Calibri" w:eastAsia="Calibri" w:hAnsi="Calibri"/>
+          <w:b/>
+          <w:bCs/>
+        </w:rPr>
+        <w:t xml:space="preserve">Crear y enviar la solicitud</w:t>
+      </w:r>
+      <w:r>
+        <w:rPr>
+          <w:rFonts w:ascii="Calibri" w:cs="Calibri" w:eastAsia="Calibri" w:hAnsi="Calibri"/>
+          <w:color w:val="666666"/>
+          <w:sz w:val="20"/>
+          <w:szCs w:val="20"/>
+        </w:rPr>
+        <w:t xml:space="preserve">   [solicitante]</w:t>
+      </w:r>
+    </w:p>
+    <w:p>
+      <w:pPr>
+        <w:spacing w:after="120"/>
+      </w:pPr>
+      <w:r>
+        <w:rPr>
+          <w:rFonts w:ascii="Calibri" w:cs="Calibri" w:eastAsia="Calibri" w:hAnsi="Calibri"/>
+        </w:rPr>
+        <w:t xml:space="preserve">Entre con </w:t>
+      </w:r>
+      <w:r>
+        <w:rPr>
+          <w:rFonts w:ascii="Consolas" w:cs="Consolas" w:eastAsia="Consolas" w:hAnsi="Consolas"/>
+          <w:color w:val="7A1F1F"/>
+          <w:sz w:val="20"/>
+          <w:szCs w:val="20"/>
+        </w:rPr>
+        <w:t xml:space="preserve">solicitante</w:t>
+      </w:r>
+      <w:r>
+        <w:rPr>
+          <w:rFonts w:ascii="Calibri" w:cs="Calibri" w:eastAsia="Calibri" w:hAnsi="Calibri"/>
+        </w:rPr>
+        <w:t xml:space="preserve"> → </w:t>
+      </w:r>
+      <w:r>
+        <w:rPr>
+          <w:rFonts w:ascii="Calibri" w:cs="Calibri" w:eastAsia="Calibri" w:hAnsi="Calibri"/>
+          <w:b/>
+          <w:bCs/>
+        </w:rPr>
+        <w:t xml:space="preserve">Nueva solicitud</w:t>
+      </w:r>
+      <w:r>
+        <w:rPr>
+          <w:rFonts w:ascii="Calibri" w:cs="Calibri" w:eastAsia="Calibri" w:hAnsi="Calibri"/>
+        </w:rPr>
+        <w:t xml:space="preserve">. Objeto: «Adquisición de equipos de computación (computadoras de escritorio) para la Unidad de Sistemas». Tipo </w:t>
+      </w:r>
+      <w:r>
+        <w:rPr>
+          <w:rFonts w:ascii="Calibri" w:cs="Calibri" w:eastAsia="Calibri" w:hAnsi="Calibri"/>
+          <w:b/>
+          <w:bCs/>
+        </w:rPr>
+        <w:t xml:space="preserve">Bien</w:t>
+      </w:r>
+      <w:r>
+        <w:rPr>
+          <w:rFonts w:ascii="Calibri" w:cs="Calibri" w:eastAsia="Calibri" w:hAnsi="Calibri"/>
+        </w:rPr>
+        <w:t xml:space="preserve">, plazo </w:t>
+      </w:r>
+      <w:r>
+        <w:rPr>
+          <w:rFonts w:ascii="Calibri" w:cs="Calibri" w:eastAsia="Calibri" w:hAnsi="Calibri"/>
+          <w:b/>
+          <w:bCs/>
+        </w:rPr>
+        <w:t xml:space="preserve">10</w:t>
+      </w:r>
+      <w:r>
+        <w:rPr>
+          <w:rFonts w:ascii="Calibri" w:cs="Calibri" w:eastAsia="Calibri" w:hAnsi="Calibri"/>
+        </w:rPr>
+        <w:t xml:space="preserve">, unidad «Unidad de Sistemas», lugar «Unidad de Sistemas, edificio municipal», justificación «renovar los equipos obsoletos de la unidad y garantizar la continuidad operativa del personal», redacción cualquiera (más de 20 letras). Pulse </w:t>
+      </w:r>
+      <w:r>
+        <w:rPr>
+          <w:rFonts w:ascii="Calibri" w:cs="Calibri" w:eastAsia="Calibri" w:hAnsi="Calibri"/>
+          <w:b/>
+          <w:bCs/>
+        </w:rPr>
+        <w:t xml:space="preserve">Guardar borrador y continuar</w:t>
+      </w:r>
+      <w:r>
+        <w:rPr>
+          <w:rFonts w:ascii="Calibri" w:cs="Calibri" w:eastAsia="Calibri" w:hAnsi="Calibri"/>
+        </w:rPr>
+        <w:t xml:space="preserve">.</w:t>
+      </w:r>
+    </w:p>
+    <w:p>
+      <w:pPr>
+        <w:spacing w:after="120"/>
+      </w:pPr>
+      <w:r>
+        <w:rPr>
+          <w:rFonts w:ascii="Calibri" w:cs="Calibri" w:eastAsia="Calibri" w:hAnsi="Calibri"/>
+        </w:rPr>
+        <w:t xml:space="preserve">Agregue el ítem: código </w:t>
+      </w:r>
+      <w:r>
+        <w:rPr>
+          <w:rFonts w:ascii="Consolas" w:cs="Consolas" w:eastAsia="Consolas" w:hAnsi="Consolas"/>
+          <w:color w:val="7A1F1F"/>
+          <w:sz w:val="20"/>
+          <w:szCs w:val="20"/>
+        </w:rPr>
+        <w:t xml:space="preserve">43211500</w:t>
+      </w:r>
+      <w:r>
+        <w:rPr>
+          <w:rFonts w:ascii="Calibri" w:cs="Calibri" w:eastAsia="Calibri" w:hAnsi="Calibri"/>
+        </w:rPr>
+        <w:t xml:space="preserve">, </w:t>
+      </w:r>
+      <w:r>
+        <w:rPr>
+          <w:rFonts w:ascii="Calibri" w:cs="Calibri" w:eastAsia="Calibri" w:hAnsi="Calibri"/>
+          <w:b/>
+          <w:bCs/>
+        </w:rPr>
+        <w:t xml:space="preserve">Partida</w:t>
+      </w:r>
+      <w:r>
+        <w:rPr>
+          <w:rFonts w:ascii="Calibri" w:cs="Calibri" w:eastAsia="Calibri" w:hAnsi="Calibri"/>
+        </w:rPr>
+        <w:t xml:space="preserve"> la que dice </w:t>
+      </w:r>
+      <w:r>
+        <w:rPr>
+          <w:rFonts w:ascii="Consolas" w:cs="Consolas" w:eastAsia="Consolas" w:hAnsi="Consolas"/>
+          <w:color w:val="7A1F1F"/>
+          <w:sz w:val="20"/>
+          <w:szCs w:val="20"/>
+        </w:rPr>
+        <w:t xml:space="preserve">43100 … Apertura 002-0000-001 · Fte 20/Org 230</w:t>
+      </w:r>
+      <w:r>
+        <w:rPr>
+          <w:rFonts w:ascii="Calibri" w:cs="Calibri" w:eastAsia="Calibri" w:hAnsi="Calibri"/>
+        </w:rPr>
+        <w:t xml:space="preserve">, descripción «Computadora de escritorio completa (CPU, monitor, teclado y mouse)», unidad </w:t>
+      </w:r>
+      <w:r>
+        <w:rPr>
+          <w:rFonts w:ascii="Consolas" w:cs="Consolas" w:eastAsia="Consolas" w:hAnsi="Consolas"/>
+          <w:color w:val="7A1F1F"/>
+          <w:sz w:val="20"/>
+          <w:szCs w:val="20"/>
+        </w:rPr>
+        <w:t xml:space="preserve">Unidad</w:t>
+      </w:r>
+      <w:r>
+        <w:rPr>
+          <w:rFonts w:ascii="Calibri" w:cs="Calibri" w:eastAsia="Calibri" w:hAnsi="Calibri"/>
+        </w:rPr>
+        <w:t xml:space="preserve">, cantidad </w:t>
+      </w:r>
+      <w:r>
+        <w:rPr>
+          <w:rFonts w:ascii="Consolas" w:cs="Consolas" w:eastAsia="Consolas" w:hAnsi="Consolas"/>
+          <w:color w:val="7A1F1F"/>
+          <w:sz w:val="20"/>
+          <w:szCs w:val="20"/>
+        </w:rPr>
+        <w:t xml:space="preserve">5</w:t>
+      </w:r>
+      <w:r>
+        <w:rPr>
+          <w:rFonts w:ascii="Calibri" w:cs="Calibri" w:eastAsia="Calibri" w:hAnsi="Calibri"/>
+        </w:rPr>
+        <w:t xml:space="preserve">, precio </w:t>
+      </w:r>
+      <w:r>
+        <w:rPr>
+          <w:rFonts w:ascii="Consolas" w:cs="Consolas" w:eastAsia="Consolas" w:hAnsi="Consolas"/>
+          <w:color w:val="7A1F1F"/>
+          <w:sz w:val="20"/>
+          <w:szCs w:val="20"/>
+        </w:rPr>
+        <w:t xml:space="preserve">5000</w:t>
+      </w:r>
+      <w:r>
+        <w:rPr>
+          <w:rFonts w:ascii="Calibri" w:cs="Calibri" w:eastAsia="Calibri" w:hAnsi="Calibri"/>
+        </w:rPr>
+        <w:t xml:space="preserve">. Pulse </w:t>
+      </w:r>
+      <w:r>
+        <w:rPr>
+          <w:rFonts w:ascii="Calibri" w:cs="Calibri" w:eastAsia="Calibri" w:hAnsi="Calibri"/>
+          <w:b/>
+          <w:bCs/>
+        </w:rPr>
+        <w:t xml:space="preserve">Agregar</w:t>
+      </w:r>
+      <w:r>
+        <w:rPr>
+          <w:rFonts w:ascii="Calibri" w:cs="Calibri" w:eastAsia="Calibri" w:hAnsi="Calibri"/>
+        </w:rPr>
+        <w:t xml:space="preserve">. Como la computadora está en el catálogo CHB, marque la excepción (lápiz → casilla «Se compra fuera del catálogo…» → </w:t>
+      </w:r>
+      <w:r>
+        <w:rPr>
+          <w:rFonts w:ascii="Calibri" w:cs="Calibri" w:eastAsia="Calibri" w:hAnsi="Calibri"/>
+          <w:b/>
+          <w:bCs/>
+        </w:rPr>
+        <w:t xml:space="preserve">Actualizar</w:t>
+      </w:r>
+      <w:r>
+        <w:rPr>
+          <w:rFonts w:ascii="Calibri" w:cs="Calibri" w:eastAsia="Calibri" w:hAnsi="Calibri"/>
+        </w:rPr>
+        <w:t xml:space="preserve">) y escriba la justificación de 80 letras o más y el código </w:t>
+      </w:r>
+      <w:r>
+        <w:rPr>
+          <w:rFonts w:ascii="Consolas" w:cs="Consolas" w:eastAsia="Consolas" w:hAnsi="Consolas"/>
+          <w:color w:val="7A1F1F"/>
+          <w:sz w:val="20"/>
+          <w:szCs w:val="20"/>
+        </w:rPr>
+        <w:t xml:space="preserve">MDPyEP-AUT-0412</w:t>
+      </w:r>
+      <w:r>
+        <w:rPr>
+          <w:rFonts w:ascii="Calibri" w:cs="Calibri" w:eastAsia="Calibri" w:hAnsi="Calibri"/>
+        </w:rPr>
+        <w:t xml:space="preserve">.</w:t>
+      </w:r>
+    </w:p>
+    <w:p>
+      <w:pPr>
+        <w:spacing w:after="120"/>
+      </w:pPr>
+      <w:r>
+        <w:rPr>
+          <w:rFonts w:ascii="Calibri" w:cs="Calibri" w:eastAsia="Calibri" w:hAnsi="Calibri"/>
+        </w:rPr>
+        <w:t xml:space="preserve">Complete los dos campos nuevos: </w:t>
+      </w:r>
+      <w:r>
+        <w:rPr>
+          <w:rFonts w:ascii="Calibri" w:cs="Calibri" w:eastAsia="Calibri" w:hAnsi="Calibri"/>
+          <w:b/>
+          <w:bCs/>
+        </w:rPr>
+        <w:t xml:space="preserve">«¿Cómo apoya la compra al logro del objetivo del POA?»</w:t>
+      </w:r>
+      <w:r>
+        <w:rPr>
+          <w:rFonts w:ascii="Calibri" w:cs="Calibri" w:eastAsia="Calibri" w:hAnsi="Calibri"/>
+        </w:rPr>
+        <w:t xml:space="preserve"> (escriba: «La adquisición permite que la Unidad de Sistemas mantenga operativa la plataforma institucional, apoyando el logro del objetivo de gestión de eficiencia administrativa de la entidad.») y </w:t>
+      </w:r>
+      <w:r>
+        <w:rPr>
+          <w:rFonts w:ascii="Calibri" w:cs="Calibri" w:eastAsia="Calibri" w:hAnsi="Calibri"/>
+          <w:b/>
+          <w:bCs/>
+        </w:rPr>
+        <w:t xml:space="preserve">«Mes estimado de publicación (PAC)»</w:t>
+      </w:r>
+      <w:r>
+        <w:rPr>
+          <w:rFonts w:ascii="Calibri" w:cs="Calibri" w:eastAsia="Calibri" w:hAnsi="Calibri"/>
+        </w:rPr>
+        <w:t xml:space="preserve"> (elija noviembre de 2026). Pulse </w:t>
+      </w:r>
+      <w:r>
+        <w:rPr>
+          <w:rFonts w:ascii="Calibri" w:cs="Calibri" w:eastAsia="Calibri" w:hAnsi="Calibri"/>
+          <w:b/>
+          <w:bCs/>
+        </w:rPr>
+        <w:t xml:space="preserve">Guardar datos</w:t>
+      </w:r>
+      <w:r>
+        <w:rPr>
+          <w:rFonts w:ascii="Calibri" w:cs="Calibri" w:eastAsia="Calibri" w:hAnsi="Calibri"/>
+        </w:rPr>
+        <w:t xml:space="preserve"> y luego </w:t>
+      </w:r>
+      <w:r>
+        <w:rPr>
+          <w:rFonts w:ascii="Calibri" w:cs="Calibri" w:eastAsia="Calibri" w:hAnsi="Calibri"/>
+          <w:b/>
+          <w:bCs/>
+        </w:rPr>
+        <w:t xml:space="preserve">Enviar solicitud a Presupuesto</w:t>
+      </w:r>
+      <w:r>
+        <w:rPr>
+          <w:rFonts w:ascii="Calibri" w:cs="Calibri" w:eastAsia="Calibri" w:hAnsi="Calibri"/>
+        </w:rPr>
+        <w:t xml:space="preserve">.</w:t>
+      </w:r>
+    </w:p>
+    <w:p>
+      <w:pPr>
+        <w:keepNext/>
+        <w:spacing w:after="40" w:before="80"/>
+        <w:jc w:val="center"/>
+      </w:pPr>
+      <w:r>
+        <w:drawing>
+          <wp:inline distT="0" distB="0" distL="0" distR="0">
+            <wp:extent cx="4572000" cy="6324600"/>
+            <wp:effectExtent t="0" r="0" b="0" l="0"/>
+            <wp:docPr id="1" name="42-formulador-poa-pac.png" descr="Los dos campos nuevos del formulador" title="Los dos campos nuevos del formulador"/>
+            <wp:cNvGraphicFramePr>
+              <a:graphicFrameLocks xmlns:a="http://schemas.openxmlformats.org/drawingml/2006/main" noChangeAspect="1"/>
+            </wp:cNvGraphicFramePr>
+            <a:graphic xmlns:a="http://schemas.openxmlformats.org/drawingml/2006/main">
+              <a:graphicData uri="http://schemas.openxmlformats.org/drawingml/2006/picture">
+                <pic:pic xmlns:pic="http://schemas.openxmlformats.org/drawingml/2006/picture">
+                  <pic:nvPicPr>
+                    <pic:cNvPr id="0" name="" descr=""/>
+                    <pic:cNvPicPr>
+                      <a:picLocks noChangeAspect="1" noChangeArrowheads="1"/>
+                    </pic:cNvPicPr>
+                  </pic:nvPicPr>
+                  <pic:blipFill>
+                    <a:blip r:embed="rId35" cstate="none"/>
+                    <a:srcRect/>
+                    <a:stretch>
+                      <a:fillRect/>
+                    </a:stretch>
+                  </pic:blipFill>
+                  <pic:spPr bwMode="auto">
+                    <a:xfrm>
+                      <a:off x="0" y="0"/>
+                      <a:ext cx="4572000" cy="6324600"/>
+                    </a:xfrm>
+                    <a:prstGeom prst="rect">
+                      <a:avLst/>
+                    </a:prstGeom>
+                  </pic:spPr>
+                </pic:pic>
+              </a:graphicData>
+            </a:graphic>
+          </wp:inline>
+        </w:drawing>
+      </w:r>
+    </w:p>
+    <w:p>
+      <w:pPr>
+        <w:spacing w:after="200"/>
+        <w:jc w:val="center"/>
+      </w:pPr>
+      <w:r>
+        <w:rPr>
+          <w:rFonts w:ascii="Calibri" w:cs="Calibri" w:eastAsia="Calibri" w:hAnsi="Calibri"/>
+          <w:i/>
+          <w:iCs/>
+          <w:color w:val="555555"/>
+          <w:sz w:val="18"/>
+          <w:szCs w:val="18"/>
+        </w:rPr>
+        <w:t xml:space="preserve">Figura: Los dos campos nuevos del formulador</w:t>
+      </w:r>
+    </w:p>
+    <w:p>
+      <w:pPr>
+        <w:spacing w:after="120"/>
+      </w:pPr>
+      <w:r>
+        <w:rPr>
+          <w:rFonts w:ascii="Calibri" w:cs="Calibri" w:eastAsia="Calibri" w:hAnsi="Calibri"/>
+          <w:b/>
+          <w:bCs/>
+        </w:rPr>
+        <w:t xml:space="preserve">Resultado esperado:</w:t>
+      </w:r>
+      <w:r>
+        <w:rPr>
+          <w:rFonts w:ascii="Calibri" w:cs="Calibri" w:eastAsia="Calibri" w:hAnsi="Calibri"/>
+        </w:rPr>
+        <w:t xml:space="preserve"> estado </w:t>
+      </w:r>
+      <w:r>
+        <w:rPr>
+          <w:rFonts w:ascii="Calibri" w:cs="Calibri" w:eastAsia="Calibri" w:hAnsi="Calibri"/>
+          <w:b/>
+          <w:bCs/>
+        </w:rPr>
+        <w:t xml:space="preserve">Solicitado</w:t>
+      </w:r>
+      <w:r>
+        <w:rPr>
+          <w:rFonts w:ascii="Calibri" w:cs="Calibri" w:eastAsia="Calibri" w:hAnsi="Calibri"/>
+        </w:rPr>
+        <w:t xml:space="preserve">. En la pestaña </w:t>
+      </w:r>
+      <w:r>
+        <w:rPr>
+          <w:rFonts w:ascii="Calibri" w:cs="Calibri" w:eastAsia="Calibri" w:hAnsi="Calibri"/>
+          <w:b/>
+          <w:bCs/>
+        </w:rPr>
+        <w:t xml:space="preserve">Documentos</w:t>
+      </w:r>
+      <w:r>
+        <w:rPr>
+          <w:rFonts w:ascii="Calibri" w:cs="Calibri" w:eastAsia="Calibri" w:hAnsi="Calibri"/>
+        </w:rPr>
+        <w:t xml:space="preserve"> aparecen </w:t>
+      </w:r>
+      <w:r>
+        <w:rPr>
+          <w:rFonts w:ascii="Calibri" w:cs="Calibri" w:eastAsia="Calibri" w:hAnsi="Calibri"/>
+          <w:b/>
+          <w:bCs/>
+        </w:rPr>
+        <w:t xml:space="preserve">tres</w:t>
+      </w:r>
+      <w:r>
+        <w:rPr>
+          <w:rFonts w:ascii="Calibri" w:cs="Calibri" w:eastAsia="Calibri" w:hAnsi="Calibri"/>
+        </w:rPr>
+        <w:t xml:space="preserve"> PDF: el C-1, el Informe de excepción CHB y la </w:t>
+      </w:r>
+      <w:r>
+        <w:rPr>
+          <w:rFonts w:ascii="Calibri" w:cs="Calibri" w:eastAsia="Calibri" w:hAnsi="Calibri"/>
+          <w:b/>
+          <w:bCs/>
+        </w:rPr>
+        <w:t xml:space="preserve">Nota de solicitud de registro al PAC</w:t>
+      </w:r>
+      <w:r>
+        <w:rPr>
+          <w:rFonts w:ascii="Calibri" w:cs="Calibri" w:eastAsia="Calibri" w:hAnsi="Calibri"/>
+        </w:rPr>
+        <w:t xml:space="preserve"> (con un número CITE como </w:t>
+      </w:r>
+      <w:r>
+        <w:rPr>
+          <w:rFonts w:ascii="Consolas" w:cs="Consolas" w:eastAsia="Consolas" w:hAnsi="Consolas"/>
+          <w:color w:val="7A1F1F"/>
+          <w:sz w:val="20"/>
+          <w:szCs w:val="20"/>
+        </w:rPr>
+        <w:t xml:space="preserve">SOL-PAC-001/2026</w:t>
+      </w:r>
+      <w:r>
+        <w:rPr>
+          <w:rFonts w:ascii="Calibri" w:cs="Calibri" w:eastAsia="Calibri" w:hAnsi="Calibri"/>
+        </w:rPr>
+        <w:t xml:space="preserve">, dirigida a la autoridad que registró en 5.5). Ábrala con </w:t>
+      </w:r>
+      <w:r>
+        <w:rPr>
+          <w:rFonts w:ascii="Calibri" w:cs="Calibri" w:eastAsia="Calibri" w:hAnsi="Calibri"/>
+          <w:b/>
+          <w:bCs/>
+        </w:rPr>
+        <w:t xml:space="preserve">Ver PDF</w:t>
+      </w:r>
+      <w:r>
+        <w:rPr>
+          <w:rFonts w:ascii="Calibri" w:cs="Calibri" w:eastAsia="Calibri" w:hAnsi="Calibri"/>
+        </w:rPr>
+        <w:t xml:space="preserve">. No necesita aprobación: solo debe existir.</w:t>
+      </w:r>
+    </w:p>
+    <w:p>
+      <w:pPr>
+        <w:keepNext/>
+        <w:spacing w:after="40" w:before="80"/>
+        <w:jc w:val="center"/>
+      </w:pPr>
+      <w:r>
+        <w:drawing>
+          <wp:inline distT="0" distB="0" distL="0" distR="0">
+            <wp:extent cx="4752975" cy="3343275"/>
+            <wp:effectExtent t="0" r="0" b="0" l="0"/>
+            <wp:docPr id="1" name="43-documentos-nota-pac.png" descr="La nota PAC aparece en el expediente" title="La nota PAC aparece en el expediente"/>
+            <wp:cNvGraphicFramePr>
+              <a:graphicFrameLocks xmlns:a="http://schemas.openxmlformats.org/drawingml/2006/main" noChangeAspect="1"/>
+            </wp:cNvGraphicFramePr>
+            <a:graphic xmlns:a="http://schemas.openxmlformats.org/drawingml/2006/main">
+              <a:graphicData uri="http://schemas.openxmlformats.org/drawingml/2006/picture">
+                <pic:pic xmlns:pic="http://schemas.openxmlformats.org/drawingml/2006/picture">
+                  <pic:nvPicPr>
+                    <pic:cNvPr id="0" name="" descr=""/>
+                    <pic:cNvPicPr>
+                      <a:picLocks noChangeAspect="1" noChangeArrowheads="1"/>
+                    </pic:cNvPicPr>
+                  </pic:nvPicPr>
+                  <pic:blipFill>
+                    <a:blip r:embed="rId36" cstate="none"/>
+                    <a:srcRect/>
+                    <a:stretch>
+                      <a:fillRect/>
+                    </a:stretch>
+                  </pic:blipFill>
+                  <pic:spPr bwMode="auto">
+                    <a:xfrm>
+                      <a:off x="0" y="0"/>
+                      <a:ext cx="4752975" cy="3343275"/>
+                    </a:xfrm>
+                    <a:prstGeom prst="rect">
+                      <a:avLst/>
+                    </a:prstGeom>
+                  </pic:spPr>
+                </pic:pic>
+              </a:graphicData>
+            </a:graphic>
+          </wp:inline>
+        </w:drawing>
+      </w:r>
+    </w:p>
+    <w:p>
+      <w:pPr>
+        <w:spacing w:after="200"/>
+        <w:jc w:val="center"/>
+      </w:pPr>
+      <w:r>
+        <w:rPr>
+          <w:rFonts w:ascii="Calibri" w:cs="Calibri" w:eastAsia="Calibri" w:hAnsi="Calibri"/>
+          <w:i/>
+          <w:iCs/>
+          <w:color w:val="555555"/>
+          <w:sz w:val="18"/>
+          <w:szCs w:val="18"/>
+        </w:rPr>
+        <w:t xml:space="preserve">Figura: La nota PAC aparece en el expediente</w:t>
+      </w:r>
+    </w:p>
+    <w:p>
+      <w:pPr>
+        <w:keepNext/>
+        <w:spacing w:after="40" w:before="80"/>
+        <w:jc w:val="center"/>
+      </w:pPr>
+      <w:r>
+        <w:drawing>
+          <wp:inline distT="0" distB="0" distL="0" distR="0">
+            <wp:extent cx="3476625" cy="4495800"/>
+            <wp:effectExtent t="0" r="0" b="0" l="0"/>
+            <wp:docPr id="1" name="pdf-pac-1.png" descr="La Nota de solicitud de registro al PAC" title="La Nota de solicitud de registro al PAC"/>
+            <wp:cNvGraphicFramePr>
+              <a:graphicFrameLocks xmlns:a="http://schemas.openxmlformats.org/drawingml/2006/main" noChangeAspect="1"/>
+            </wp:cNvGraphicFramePr>
+            <a:graphic xmlns:a="http://schemas.openxmlformats.org/drawingml/2006/main">
+              <a:graphicData uri="http://schemas.openxmlformats.org/drawingml/2006/picture">
+                <pic:pic xmlns:pic="http://schemas.openxmlformats.org/drawingml/2006/picture">
+                  <pic:nvPicPr>
+                    <pic:cNvPr id="0" name="" descr=""/>
+                    <pic:cNvPicPr>
+                      <a:picLocks noChangeAspect="1" noChangeArrowheads="1"/>
+                    </pic:cNvPicPr>
+                  </pic:nvPicPr>
+                  <pic:blipFill>
+                    <a:blip r:embed="rId37" cstate="none"/>
+                    <a:srcRect/>
+                    <a:stretch>
+                      <a:fillRect/>
+                    </a:stretch>
+                  </pic:blipFill>
+                  <pic:spPr bwMode="auto">
+                    <a:xfrm>
+                      <a:off x="0" y="0"/>
+                      <a:ext cx="3476625" cy="4495800"/>
+                    </a:xfrm>
+                    <a:prstGeom prst="rect">
+                      <a:avLst/>
+                    </a:prstGeom>
+                  </pic:spPr>
+                </pic:pic>
+              </a:graphicData>
+            </a:graphic>
+          </wp:inline>
+        </w:drawing>
+      </w:r>
+    </w:p>
+    <w:p>
+      <w:pPr>
+        <w:spacing w:after="200"/>
+        <w:jc w:val="center"/>
+      </w:pPr>
+      <w:r>
+        <w:rPr>
+          <w:rFonts w:ascii="Calibri" w:cs="Calibri" w:eastAsia="Calibri" w:hAnsi="Calibri"/>
+          <w:i/>
+          <w:iCs/>
+          <w:color w:val="555555"/>
+          <w:sz w:val="18"/>
+          <w:szCs w:val="18"/>
+        </w:rPr>
+        <w:t xml:space="preserve">Figura: La Nota de solicitud de registro al PAC</w:t>
+      </w:r>
+    </w:p>
+    <w:p>
+      <w:pPr>
+        <w:keepNext/>
+        <w:spacing w:after="60" w:before="200"/>
+      </w:pPr>
+      <w:r>
+        <w:rPr>
+          <w:rFonts w:ascii="Calibri" w:cs="Calibri" w:eastAsia="Calibri" w:hAnsi="Calibri"/>
+          <w:b/>
+          <w:bCs/>
+          <w:color w:val="1F4E79"/>
+        </w:rPr>
+        <w:t xml:space="preserve">Paso P2 — </w:t>
+      </w:r>
+      <w:r>
+        <w:rPr>
+          <w:rFonts w:ascii="Calibri" w:cs="Calibri" w:eastAsia="Calibri" w:hAnsi="Calibri"/>
+          <w:b/>
+          <w:bCs/>
+        </w:rPr>
+        <w:t xml:space="preserve">Certificar: ahora también certifica el POA</w:t>
+      </w:r>
+      <w:r>
+        <w:rPr>
+          <w:rFonts w:ascii="Calibri" w:cs="Calibri" w:eastAsia="Calibri" w:hAnsi="Calibri"/>
+          <w:color w:val="666666"/>
+          <w:sz w:val="20"/>
+          <w:szCs w:val="20"/>
+        </w:rPr>
+        <w:t xml:space="preserve">   [presupuesto]</w:t>
+      </w:r>
+    </w:p>
+    <w:p>
+      <w:pPr>
+        <w:spacing w:after="120"/>
+      </w:pPr>
+      <w:r>
+        <w:rPr>
+          <w:rFonts w:ascii="Calibri" w:cs="Calibri" w:eastAsia="Calibri" w:hAnsi="Calibri"/>
+        </w:rPr>
+        <w:t xml:space="preserve">Entre con </w:t>
+      </w:r>
+      <w:r>
+        <w:rPr>
+          <w:rFonts w:ascii="Consolas" w:cs="Consolas" w:eastAsia="Consolas" w:hAnsi="Consolas"/>
+          <w:color w:val="7A1F1F"/>
+          <w:sz w:val="20"/>
+          <w:szCs w:val="20"/>
+        </w:rPr>
+        <w:t xml:space="preserve">presupuesto</w:t>
+      </w:r>
+      <w:r>
+        <w:rPr>
+          <w:rFonts w:ascii="Calibri" w:cs="Calibri" w:eastAsia="Calibri" w:hAnsi="Calibri"/>
+        </w:rPr>
+        <w:t xml:space="preserve">, abra el trámite → </w:t>
+      </w:r>
+      <w:r>
+        <w:rPr>
+          <w:rFonts w:ascii="Calibri" w:cs="Calibri" w:eastAsia="Calibri" w:hAnsi="Calibri"/>
+          <w:b/>
+          <w:bCs/>
+        </w:rPr>
+        <w:t xml:space="preserve">Presupuesto y SIGEP</w:t>
+      </w:r>
+      <w:r>
+        <w:rPr>
+          <w:rFonts w:ascii="Calibri" w:cs="Calibri" w:eastAsia="Calibri" w:hAnsi="Calibri"/>
+        </w:rPr>
+        <w:t xml:space="preserve">. Baje a la tarjeta </w:t>
+      </w:r>
+      <w:r>
+        <w:rPr>
+          <w:rFonts w:ascii="Calibri" w:cs="Calibri" w:eastAsia="Calibri" w:hAnsi="Calibri"/>
+          <w:b/>
+          <w:bCs/>
+        </w:rPr>
+        <w:t xml:space="preserve">«Certificación del POA — programa y objetivo»</w:t>
+      </w:r>
+      <w:r>
+        <w:rPr>
+          <w:rFonts w:ascii="Calibri" w:cs="Calibri" w:eastAsia="Calibri" w:hAnsi="Calibri"/>
+        </w:rPr>
+        <w:t xml:space="preserve">: muestra el programa </w:t>
+      </w:r>
+      <w:r>
+        <w:rPr>
+          <w:rFonts w:ascii="Calibri" w:cs="Calibri" w:eastAsia="Calibri" w:hAnsi="Calibri"/>
+          <w:b/>
+          <w:bCs/>
+        </w:rPr>
+        <w:t xml:space="preserve">002 — ADMINISTRACIÓN CENTRAL</w:t>
+      </w:r>
+      <w:r>
+        <w:rPr>
+          <w:rFonts w:ascii="Calibri" w:cs="Calibri" w:eastAsia="Calibri" w:hAnsi="Calibri"/>
+        </w:rPr>
+        <w:t xml:space="preserve">, su objetivo </w:t>
+      </w:r>
+      <w:r>
+        <w:rPr>
+          <w:rFonts w:ascii="Calibri" w:cs="Calibri" w:eastAsia="Calibri" w:hAnsi="Calibri"/>
+          <w:b/>
+          <w:bCs/>
+        </w:rPr>
+        <w:t xml:space="preserve">OBJ3</w:t>
+      </w:r>
+      <w:r>
+        <w:rPr>
+          <w:rFonts w:ascii="Calibri" w:cs="Calibri" w:eastAsia="Calibri" w:hAnsi="Calibri"/>
+        </w:rPr>
+        <w:t xml:space="preserve"> y la justificación que escribió el solicitante (puede corregirla). Escriba el comprobante </w:t>
+      </w:r>
+      <w:r>
+        <w:rPr>
+          <w:rFonts w:ascii="Consolas" w:cs="Consolas" w:eastAsia="Consolas" w:hAnsi="Consolas"/>
+          <w:color w:val="7A1F1F"/>
+          <w:sz w:val="20"/>
+          <w:szCs w:val="20"/>
+        </w:rPr>
+        <w:t xml:space="preserve">C31-2026-00555</w:t>
+      </w:r>
+      <w:r>
+        <w:rPr>
+          <w:rFonts w:ascii="Calibri" w:cs="Calibri" w:eastAsia="Calibri" w:hAnsi="Calibri"/>
+        </w:rPr>
+        <w:t xml:space="preserve"> y pulse </w:t>
+      </w:r>
+      <w:r>
+        <w:rPr>
+          <w:rFonts w:ascii="Calibri" w:cs="Calibri" w:eastAsia="Calibri" w:hAnsi="Calibri"/>
+          <w:b/>
+          <w:bCs/>
+        </w:rPr>
+        <w:t xml:space="preserve">Certificar presupuesto</w:t>
+      </w:r>
+      <w:r>
+        <w:rPr>
+          <w:rFonts w:ascii="Calibri" w:cs="Calibri" w:eastAsia="Calibri" w:hAnsi="Calibri"/>
+        </w:rPr>
+        <w:t xml:space="preserve">.</w:t>
+      </w:r>
+    </w:p>
+    <w:p>
+      <w:pPr>
+        <w:spacing w:after="120"/>
+      </w:pPr>
+      <w:r>
+        <w:rPr>
+          <w:rFonts w:ascii="Calibri" w:cs="Calibri" w:eastAsia="Calibri" w:hAnsi="Calibri"/>
+          <w:b/>
+          <w:bCs/>
+        </w:rPr>
+        <w:t xml:space="preserve">Resultado esperado:</w:t>
+      </w:r>
+      <w:r>
+        <w:rPr>
+          <w:rFonts w:ascii="Calibri" w:cs="Calibri" w:eastAsia="Calibri" w:hAnsi="Calibri"/>
+        </w:rPr>
+        <w:t xml:space="preserve"> en </w:t>
+      </w:r>
+      <w:r>
+        <w:rPr>
+          <w:rFonts w:ascii="Calibri" w:cs="Calibri" w:eastAsia="Calibri" w:hAnsi="Calibri"/>
+          <w:b/>
+          <w:bCs/>
+        </w:rPr>
+        <w:t xml:space="preserve">Documentos</w:t>
+      </w:r>
+      <w:r>
+        <w:rPr>
+          <w:rFonts w:ascii="Calibri" w:cs="Calibri" w:eastAsia="Calibri" w:hAnsi="Calibri"/>
+        </w:rPr>
+        <w:t xml:space="preserve"> hay ahora cinco PDF; los nuevos son la </w:t>
+      </w:r>
+      <w:r>
+        <w:rPr>
+          <w:rFonts w:ascii="Calibri" w:cs="Calibri" w:eastAsia="Calibri" w:hAnsi="Calibri"/>
+          <w:b/>
+          <w:bCs/>
+        </w:rPr>
+        <w:t xml:space="preserve">Certificación C-31</w:t>
+      </w:r>
+      <w:r>
+        <w:rPr>
+          <w:rFonts w:ascii="Calibri" w:cs="Calibri" w:eastAsia="Calibri" w:hAnsi="Calibri"/>
+        </w:rPr>
+        <w:t xml:space="preserve"> y la </w:t>
+      </w:r>
+      <w:r>
+        <w:rPr>
+          <w:rFonts w:ascii="Calibri" w:cs="Calibri" w:eastAsia="Calibri" w:hAnsi="Calibri"/>
+          <w:b/>
+          <w:bCs/>
+        </w:rPr>
+        <w:t xml:space="preserve">Certificación del Programa Operativo Anual (POA)</w:t>
+      </w:r>
+      <w:r>
+        <w:rPr>
+          <w:rFonts w:ascii="Calibri" w:cs="Calibri" w:eastAsia="Calibri" w:hAnsi="Calibri"/>
+        </w:rPr>
+        <w:t xml:space="preserve">.</w:t>
+      </w:r>
+    </w:p>
+    <w:p>
+      <w:pPr>
+        <w:keepNext/>
+        <w:spacing w:after="40" w:before="80"/>
+        <w:jc w:val="center"/>
+      </w:pPr>
+      <w:r>
+        <w:drawing>
+          <wp:inline distT="0" distB="0" distL="0" distR="0">
+            <wp:extent cx="4572000" cy="4972050"/>
+            <wp:effectExtent t="0" r="0" b="0" l="0"/>
+            <wp:docPr id="1" name="44-presupuesto-poa.png" descr="Tarjeta de la Certificación del POA" title="Tarjeta de la Certificación del POA"/>
+            <wp:cNvGraphicFramePr>
+              <a:graphicFrameLocks xmlns:a="http://schemas.openxmlformats.org/drawingml/2006/main" noChangeAspect="1"/>
+            </wp:cNvGraphicFramePr>
+            <a:graphic xmlns:a="http://schemas.openxmlformats.org/drawingml/2006/main">
+              <a:graphicData uri="http://schemas.openxmlformats.org/drawingml/2006/picture">
+                <pic:pic xmlns:pic="http://schemas.openxmlformats.org/drawingml/2006/picture">
+                  <pic:nvPicPr>
+                    <pic:cNvPr id="0" name="" descr=""/>
+                    <pic:cNvPicPr>
+                      <a:picLocks noChangeAspect="1" noChangeArrowheads="1"/>
+                    </pic:cNvPicPr>
+                  </pic:nvPicPr>
+                  <pic:blipFill>
+                    <a:blip r:embed="rId38" cstate="none"/>
+                    <a:srcRect/>
+                    <a:stretch>
+                      <a:fillRect/>
+                    </a:stretch>
+                  </pic:blipFill>
+                  <pic:spPr bwMode="auto">
+                    <a:xfrm>
+                      <a:off x="0" y="0"/>
+                      <a:ext cx="4572000" cy="4972050"/>
+                    </a:xfrm>
+                    <a:prstGeom prst="rect">
+                      <a:avLst/>
+                    </a:prstGeom>
+                  </pic:spPr>
+                </pic:pic>
+              </a:graphicData>
+            </a:graphic>
+          </wp:inline>
+        </w:drawing>
+      </w:r>
+    </w:p>
+    <w:p>
+      <w:pPr>
+        <w:spacing w:after="200"/>
+        <w:jc w:val="center"/>
+      </w:pPr>
+      <w:r>
+        <w:rPr>
+          <w:rFonts w:ascii="Calibri" w:cs="Calibri" w:eastAsia="Calibri" w:hAnsi="Calibri"/>
+          <w:i/>
+          <w:iCs/>
+          <w:color w:val="555555"/>
+          <w:sz w:val="18"/>
+          <w:szCs w:val="18"/>
+        </w:rPr>
+        <w:t xml:space="preserve">Figura: Tarjeta de la Certificación del POA</w:t>
+      </w:r>
+    </w:p>
+    <w:p>
+      <w:pPr>
+        <w:keepNext/>
+        <w:spacing w:after="40" w:before="80"/>
+        <w:jc w:val="center"/>
+      </w:pPr>
+      <w:r>
+        <w:drawing>
+          <wp:inline distT="0" distB="0" distL="0" distR="0">
+            <wp:extent cx="4752975" cy="3343275"/>
+            <wp:effectExtent t="0" r="0" b="0" l="0"/>
+            <wp:docPr id="1" name="45-documentos-cert-poa.png" descr="Expediente con la Certificación del POA" title="Expediente con la Certificación del POA"/>
+            <wp:cNvGraphicFramePr>
+              <a:graphicFrameLocks xmlns:a="http://schemas.openxmlformats.org/drawingml/2006/main" noChangeAspect="1"/>
+            </wp:cNvGraphicFramePr>
+            <a:graphic xmlns:a="http://schemas.openxmlformats.org/drawingml/2006/main">
+              <a:graphicData uri="http://schemas.openxmlformats.org/drawingml/2006/picture">
+                <pic:pic xmlns:pic="http://schemas.openxmlformats.org/drawingml/2006/picture">
+                  <pic:nvPicPr>
+                    <pic:cNvPr id="0" name="" descr=""/>
+                    <pic:cNvPicPr>
+                      <a:picLocks noChangeAspect="1" noChangeArrowheads="1"/>
+                    </pic:cNvPicPr>
+                  </pic:nvPicPr>
+                  <pic:blipFill>
+                    <a:blip r:embed="rId39" cstate="none"/>
+                    <a:srcRect/>
+                    <a:stretch>
+                      <a:fillRect/>
+                    </a:stretch>
+                  </pic:blipFill>
+                  <pic:spPr bwMode="auto">
+                    <a:xfrm>
+                      <a:off x="0" y="0"/>
+                      <a:ext cx="4752975" cy="3343275"/>
+                    </a:xfrm>
+                    <a:prstGeom prst="rect">
+                      <a:avLst/>
+                    </a:prstGeom>
+                  </pic:spPr>
+                </pic:pic>
+              </a:graphicData>
+            </a:graphic>
+          </wp:inline>
+        </w:drawing>
+      </w:r>
+    </w:p>
+    <w:p>
+      <w:pPr>
+        <w:spacing w:after="200"/>
+        <w:jc w:val="center"/>
+      </w:pPr>
+      <w:r>
+        <w:rPr>
+          <w:rFonts w:ascii="Calibri" w:cs="Calibri" w:eastAsia="Calibri" w:hAnsi="Calibri"/>
+          <w:i/>
+          <w:iCs/>
+          <w:color w:val="555555"/>
+          <w:sz w:val="18"/>
+          <w:szCs w:val="18"/>
+        </w:rPr>
+        <w:t xml:space="preserve">Figura: Expediente con la Certificación del POA</w:t>
+      </w:r>
+    </w:p>
+    <w:p>
+      <w:pPr>
+        <w:keepNext/>
+        <w:spacing w:after="40" w:before="80"/>
+        <w:jc w:val="center"/>
+      </w:pPr>
+      <w:r>
+        <w:drawing>
+          <wp:inline distT="0" distB="0" distL="0" distR="0">
+            <wp:extent cx="3476625" cy="4495800"/>
+            <wp:effectExtent t="0" r="0" b="0" l="0"/>
+            <wp:docPr id="1" name="pdf-poa-1.png" descr="La Certificación del POA" title="La Certificación del POA"/>
+            <wp:cNvGraphicFramePr>
+              <a:graphicFrameLocks xmlns:a="http://schemas.openxmlformats.org/drawingml/2006/main" noChangeAspect="1"/>
+            </wp:cNvGraphicFramePr>
+            <a:graphic xmlns:a="http://schemas.openxmlformats.org/drawingml/2006/main">
+              <a:graphicData uri="http://schemas.openxmlformats.org/drawingml/2006/picture">
+                <pic:pic xmlns:pic="http://schemas.openxmlformats.org/drawingml/2006/picture">
+                  <pic:nvPicPr>
+                    <pic:cNvPr id="0" name="" descr=""/>
+                    <pic:cNvPicPr>
+                      <a:picLocks noChangeAspect="1" noChangeArrowheads="1"/>
+                    </pic:cNvPicPr>
+                  </pic:nvPicPr>
+                  <pic:blipFill>
+                    <a:blip r:embed="rId40" cstate="none"/>
+                    <a:srcRect/>
+                    <a:stretch>
+                      <a:fillRect/>
+                    </a:stretch>
+                  </pic:blipFill>
+                  <pic:spPr bwMode="auto">
+                    <a:xfrm>
+                      <a:off x="0" y="0"/>
+                      <a:ext cx="3476625" cy="4495800"/>
+                    </a:xfrm>
+                    <a:prstGeom prst="rect">
+                      <a:avLst/>
+                    </a:prstGeom>
+                  </pic:spPr>
+                </pic:pic>
+              </a:graphicData>
+            </a:graphic>
+          </wp:inline>
+        </w:drawing>
+      </w:r>
+    </w:p>
+    <w:p>
+      <w:pPr>
+        <w:spacing w:after="200"/>
+        <w:jc w:val="center"/>
+      </w:pPr>
+      <w:r>
+        <w:rPr>
+          <w:rFonts w:ascii="Calibri" w:cs="Calibri" w:eastAsia="Calibri" w:hAnsi="Calibri"/>
+          <w:i/>
+          <w:iCs/>
+          <w:color w:val="555555"/>
+          <w:sz w:val="18"/>
+          <w:szCs w:val="18"/>
+        </w:rPr>
+        <w:t xml:space="preserve">Figura: La Certificación del POA</w:t>
+      </w:r>
+    </w:p>
+    <w:p>
+      <w:pPr>
+        <w:pStyle w:val="Heading2"/>
+      </w:pPr>
+      <w:r>
+        <w:rPr>
+          <w:rFonts w:ascii="Calibri" w:cs="Calibri" w:eastAsia="Calibri" w:hAnsi="Calibri"/>
+        </w:rPr>
+        <w:t xml:space="preserve">5.7 Pruebas de seguridad de las funciones nuevas</w:t>
+      </w:r>
+    </w:p>
+    <w:tbl>
+      <w:tblPr>
+        <w:tblW w:type="dxa" w:w="9360"/>
+        <w:tblBorders>
+          <w:top w:val="single" w:color="auto" w:sz="4"/>
+          <w:left w:val="single" w:color="auto" w:sz="4"/>
+          <w:bottom w:val="single" w:color="auto" w:sz="4"/>
+          <w:right w:val="single" w:color="auto" w:sz="4"/>
+          <w:insideH w:val="single" w:color="auto" w:sz="4"/>
+          <w:insideV w:val="single" w:color="auto" w:sz="4"/>
+        </w:tblBorders>
+      </w:tblPr>
+      <w:tblGrid>
+        <w:gridCol w:w="2200"/>
+        <w:gridCol w:w="4200"/>
+        <w:gridCol w:w="2960"/>
+      </w:tblGrid>
+      <w:tr>
+        <w:trPr>
+          <w:tblHeader/>
+        </w:trPr>
+        <w:tc>
+          <w:tcPr>
+            <w:tcW w:type="dxa" w:w="2200"/>
+            <w:tcBorders>
+              <w:top w:val="single" w:color="BFC8D4" w:sz="4"/>
+              <w:left w:val="single" w:color="BFC8D4" w:sz="4"/>
+              <w:bottom w:val="single" w:color="BFC8D4" w:sz="4"/>
+              <w:right w:val="single" w:color="BFC8D4" w:sz="4"/>
+            </w:tcBorders>
+            <w:shd w:fill="1F4E79" w:color="auto" w:val="clear"/>
+            <w:tcMar>
+              <w:top w:type="dxa" w:w="60"/>
+              <w:left w:type="dxa" w:w="100"/>
+              <w:bottom w:type="dxa" w:w="60"/>
+              <w:right w:type="dxa" w:w="100"/>
+            </w:tcMar>
+          </w:tcPr>
+          <w:p>
+            <w:r>
+              <w:rPr>
+                <w:rFonts w:ascii="Calibri" w:cs="Calibri" w:eastAsia="Calibri" w:hAnsi="Calibri"/>
+                <w:b/>
+                <w:bCs/>
+                <w:color w:val="FFFFFF"/>
+                <w:sz w:val="19"/>
+                <w:szCs w:val="19"/>
+              </w:rPr>
+              <w:t xml:space="preserve">Prueba</w:t>
+            </w:r>
+          </w:p>
+        </w:tc>
+        <w:tc>
+          <w:tcPr>
+            <w:tcW w:type="dxa" w:w="4200"/>
+            <w:tcBorders>
+              <w:top w:val="single" w:color="BFC8D4" w:sz="4"/>
+              <w:left w:val="single" w:color="BFC8D4" w:sz="4"/>
+              <w:bottom w:val="single" w:color="BFC8D4" w:sz="4"/>
+              <w:right w:val="single" w:color="BFC8D4" w:sz="4"/>
+            </w:tcBorders>
+            <w:shd w:fill="1F4E79" w:color="auto" w:val="clear"/>
+            <w:tcMar>
+              <w:top w:type="dxa" w:w="60"/>
+              <w:left w:type="dxa" w:w="100"/>
+              <w:bottom w:type="dxa" w:w="60"/>
+              <w:right w:type="dxa" w:w="100"/>
+            </w:tcMar>
+          </w:tcPr>
+          <w:p>
+            <w:r>
+              <w:rPr>
+                <w:rFonts w:ascii="Calibri" w:cs="Calibri" w:eastAsia="Calibri" w:hAnsi="Calibri"/>
+                <w:b/>
+                <w:bCs/>
+                <w:color w:val="FFFFFF"/>
+                <w:sz w:val="19"/>
+                <w:szCs w:val="19"/>
+              </w:rPr>
+              <w:t xml:space="preserve">Qué hacer</w:t>
+            </w:r>
+          </w:p>
+        </w:tc>
+        <w:tc>
+          <w:tcPr>
+            <w:tcW w:type="dxa" w:w="2960"/>
+            <w:tcBorders>
+              <w:top w:val="single" w:color="BFC8D4" w:sz="4"/>
+              <w:left w:val="single" w:color="BFC8D4" w:sz="4"/>
+              <w:bottom w:val="single" w:color="BFC8D4" w:sz="4"/>
+              <w:right w:val="single" w:color="BFC8D4" w:sz="4"/>
+            </w:tcBorders>
+            <w:shd w:fill="1F4E79" w:color="auto" w:val="clear"/>
+            <w:tcMar>
+              <w:top w:type="dxa" w:w="60"/>
+              <w:left w:type="dxa" w:w="100"/>
+              <w:bottom w:type="dxa" w:w="60"/>
+              <w:right w:type="dxa" w:w="100"/>
+            </w:tcMar>
+          </w:tcPr>
+          <w:p>
+            <w:r>
+              <w:rPr>
+                <w:rFonts w:ascii="Calibri" w:cs="Calibri" w:eastAsia="Calibri" w:hAnsi="Calibri"/>
+                <w:b/>
+                <w:bCs/>
+                <w:color w:val="FFFFFF"/>
+                <w:sz w:val="19"/>
+                <w:szCs w:val="19"/>
+              </w:rPr>
+              <w:t xml:space="preserve">Qué debe pasar</w:t>
+            </w:r>
+          </w:p>
+        </w:tc>
+      </w:tr>
+      <w:tr>
+        <w:trPr>
+          <w:cantSplit/>
+        </w:trPr>
+        <w:tc>
+          <w:tcPr>
+            <w:tcW w:type="dxa" w:w="2200"/>
+            <w:tcBorders>
+              <w:top w:val="single" w:color="BFC8D4" w:sz="4"/>
+              <w:left w:val="single" w:color="BFC8D4" w:sz="4"/>
+              <w:bottom w:val="single" w:color="BFC8D4" w:sz="4"/>
+              <w:right w:val="single" w:color="BFC8D4" w:sz="4"/>
+            </w:tcBorders>
+            <w:tcMar>
+              <w:top w:type="dxa" w:w="60"/>
+              <w:left w:type="dxa" w:w="100"/>
+              <w:bottom w:type="dxa" w:w="60"/>
+              <w:right w:type="dxa" w:w="100"/>
+            </w:tcMar>
+          </w:tcPr>
+          <w:p>
+            <w:r>
+              <w:rPr>
+                <w:rFonts w:ascii="Calibri" w:cs="Calibri" w:eastAsia="Calibri" w:hAnsi="Calibri"/>
+              </w:rPr>
+              <w:t xml:space="preserve">Programa sin objetivo</w:t>
+            </w:r>
+          </w:p>
+        </w:tc>
+        <w:tc>
+          <w:tcPr>
+            <w:tcW w:type="dxa" w:w="4200"/>
+            <w:tcBorders>
+              <w:top w:val="single" w:color="BFC8D4" w:sz="4"/>
+              <w:left w:val="single" w:color="BFC8D4" w:sz="4"/>
+              <w:bottom w:val="single" w:color="BFC8D4" w:sz="4"/>
+              <w:right w:val="single" w:color="BFC8D4" w:sz="4"/>
+            </w:tcBorders>
+            <w:tcMar>
+              <w:top w:type="dxa" w:w="60"/>
+              <w:left w:type="dxa" w:w="100"/>
+              <w:bottom w:type="dxa" w:w="60"/>
+              <w:right w:type="dxa" w:w="100"/>
+            </w:tcMar>
+          </w:tcPr>
+          <w:p>
+            <w:r>
+              <w:rPr>
+                <w:rFonts w:ascii="Calibri" w:cs="Calibri" w:eastAsia="Calibri" w:hAnsi="Calibri"/>
+              </w:rPr>
+              <w:t xml:space="preserve">Como </w:t>
+            </w:r>
+            <w:r>
+              <w:rPr>
+                <w:rFonts w:ascii="Consolas" w:cs="Consolas" w:eastAsia="Consolas" w:hAnsi="Consolas"/>
+                <w:color w:val="7A1F1F"/>
+                <w:sz w:val="20"/>
+                <w:szCs w:val="20"/>
+              </w:rPr>
+              <w:t xml:space="preserve">presupuesto</w:t>
+            </w:r>
+            <w:r>
+              <w:rPr>
+                <w:rFonts w:ascii="Calibri" w:cs="Calibri" w:eastAsia="Calibri" w:hAnsi="Calibri"/>
+              </w:rPr>
+              <w:t xml:space="preserve">, en </w:t>
+            </w:r>
+            <w:r>
+              <w:rPr>
+                <w:rFonts w:ascii="Calibri" w:cs="Calibri" w:eastAsia="Calibri" w:hAnsi="Calibri"/>
+                <w:b/>
+                <w:bCs/>
+              </w:rPr>
+              <w:t xml:space="preserve">Objetivos POA</w:t>
+            </w:r>
+            <w:r>
+              <w:rPr>
+                <w:rFonts w:ascii="Calibri" w:cs="Calibri" w:eastAsia="Calibri" w:hAnsi="Calibri"/>
+              </w:rPr>
+              <w:t xml:space="preserve"> elimine el objetivo de un programa y pulse </w:t>
+            </w:r>
+            <w:r>
+              <w:rPr>
+                <w:rFonts w:ascii="Calibri" w:cs="Calibri" w:eastAsia="Calibri" w:hAnsi="Calibri"/>
+                <w:b/>
+                <w:bCs/>
+              </w:rPr>
+              <w:t xml:space="preserve">Certificar presupuesto</w:t>
+            </w:r>
+            <w:r>
+              <w:rPr>
+                <w:rFonts w:ascii="Calibri" w:cs="Calibri" w:eastAsia="Calibri" w:hAnsi="Calibri"/>
+              </w:rPr>
+              <w:t xml:space="preserve"> en una solicitud de ese programa</w:t>
+            </w:r>
+          </w:p>
+        </w:tc>
+        <w:tc>
+          <w:tcPr>
+            <w:tcW w:type="dxa" w:w="2960"/>
+            <w:tcBorders>
+              <w:top w:val="single" w:color="BFC8D4" w:sz="4"/>
+              <w:left w:val="single" w:color="BFC8D4" w:sz="4"/>
+              <w:bottom w:val="single" w:color="BFC8D4" w:sz="4"/>
+              <w:right w:val="single" w:color="BFC8D4" w:sz="4"/>
+            </w:tcBorders>
+            <w:tcMar>
+              <w:top w:type="dxa" w:w="60"/>
+              <w:left w:type="dxa" w:w="100"/>
+              <w:bottom w:type="dxa" w:w="60"/>
+              <w:right w:type="dxa" w:w="100"/>
+            </w:tcMar>
+          </w:tcPr>
+          <w:p>
+            <w:r>
+              <w:rPr>
+                <w:rFonts w:ascii="Calibri" w:cs="Calibri" w:eastAsia="Calibri" w:hAnsi="Calibri"/>
+              </w:rPr>
+              <w:t xml:space="preserve">El botón está apagado y la tarjeta dice «Sin objetivo registrado»</w:t>
+            </w:r>
+          </w:p>
+        </w:tc>
+      </w:tr>
+      <w:tr>
+        <w:trPr>
+          <w:cantSplit/>
+        </w:trPr>
+        <w:tc>
+          <w:tcPr>
+            <w:tcW w:type="dxa" w:w="2200"/>
+            <w:tcBorders>
+              <w:top w:val="single" w:color="BFC8D4" w:sz="4"/>
+              <w:left w:val="single" w:color="BFC8D4" w:sz="4"/>
+              <w:bottom w:val="single" w:color="BFC8D4" w:sz="4"/>
+              <w:right w:val="single" w:color="BFC8D4" w:sz="4"/>
+            </w:tcBorders>
+            <w:tcMar>
+              <w:top w:type="dxa" w:w="60"/>
+              <w:left w:type="dxa" w:w="100"/>
+              <w:bottom w:type="dxa" w:w="60"/>
+              <w:right w:type="dxa" w:w="100"/>
+            </w:tcMar>
+          </w:tcPr>
+          <w:p>
+            <w:r>
+              <w:rPr>
+                <w:rFonts w:ascii="Calibri" w:cs="Calibri" w:eastAsia="Calibri" w:hAnsi="Calibri"/>
+              </w:rPr>
+              <w:t xml:space="preserve">Falta la justificación</w:t>
+            </w:r>
+          </w:p>
+        </w:tc>
+        <w:tc>
+          <w:tcPr>
+            <w:tcW w:type="dxa" w:w="4200"/>
+            <w:tcBorders>
+              <w:top w:val="single" w:color="BFC8D4" w:sz="4"/>
+              <w:left w:val="single" w:color="BFC8D4" w:sz="4"/>
+              <w:bottom w:val="single" w:color="BFC8D4" w:sz="4"/>
+              <w:right w:val="single" w:color="BFC8D4" w:sz="4"/>
+            </w:tcBorders>
+            <w:tcMar>
+              <w:top w:type="dxa" w:w="60"/>
+              <w:left w:type="dxa" w:w="100"/>
+              <w:bottom w:type="dxa" w:w="60"/>
+              <w:right w:type="dxa" w:w="100"/>
+            </w:tcMar>
+          </w:tcPr>
+          <w:p>
+            <w:r>
+              <w:rPr>
+                <w:rFonts w:ascii="Calibri" w:cs="Calibri" w:eastAsia="Calibri" w:hAnsi="Calibri"/>
+              </w:rPr>
+              <w:t xml:space="preserve">Borre el texto de la justificación del POA en la tarjeta y certifique</w:t>
+            </w:r>
+          </w:p>
+        </w:tc>
+        <w:tc>
+          <w:tcPr>
+            <w:tcW w:type="dxa" w:w="2960"/>
+            <w:tcBorders>
+              <w:top w:val="single" w:color="BFC8D4" w:sz="4"/>
+              <w:left w:val="single" w:color="BFC8D4" w:sz="4"/>
+              <w:bottom w:val="single" w:color="BFC8D4" w:sz="4"/>
+              <w:right w:val="single" w:color="BFC8D4" w:sz="4"/>
+            </w:tcBorders>
+            <w:tcMar>
+              <w:top w:type="dxa" w:w="60"/>
+              <w:left w:type="dxa" w:w="100"/>
+              <w:bottom w:type="dxa" w:w="60"/>
+              <w:right w:type="dxa" w:w="100"/>
+            </w:tcMar>
+          </w:tcPr>
+          <w:p>
+            <w:r>
+              <w:rPr>
+                <w:rFonts w:ascii="Calibri" w:cs="Calibri" w:eastAsia="Calibri" w:hAnsi="Calibri"/>
+              </w:rPr>
+              <w:t xml:space="preserve">Error rojo: «Justifique cómo la contratación apoya el logro del objetivo del POA»</w:t>
+            </w:r>
+          </w:p>
+        </w:tc>
+      </w:tr>
+      <w:tr>
+        <w:trPr>
+          <w:cantSplit/>
+        </w:trPr>
+        <w:tc>
+          <w:tcPr>
+            <w:tcW w:type="dxa" w:w="2200"/>
+            <w:tcBorders>
+              <w:top w:val="single" w:color="BFC8D4" w:sz="4"/>
+              <w:left w:val="single" w:color="BFC8D4" w:sz="4"/>
+              <w:bottom w:val="single" w:color="BFC8D4" w:sz="4"/>
+              <w:right w:val="single" w:color="BFC8D4" w:sz="4"/>
+            </w:tcBorders>
+            <w:tcMar>
+              <w:top w:type="dxa" w:w="60"/>
+              <w:left w:type="dxa" w:w="100"/>
+              <w:bottom w:type="dxa" w:w="60"/>
+              <w:right w:type="dxa" w:w="100"/>
+            </w:tcMar>
+          </w:tcPr>
+          <w:p>
+            <w:r>
+              <w:rPr>
+                <w:rFonts w:ascii="Calibri" w:cs="Calibri" w:eastAsia="Calibri" w:hAnsi="Calibri"/>
+              </w:rPr>
+              <w:t xml:space="preserve">Sin autoridad (MAE)</w:t>
+            </w:r>
+          </w:p>
+        </w:tc>
+        <w:tc>
+          <w:tcPr>
+            <w:tcW w:type="dxa" w:w="4200"/>
+            <w:tcBorders>
+              <w:top w:val="single" w:color="BFC8D4" w:sz="4"/>
+              <w:left w:val="single" w:color="BFC8D4" w:sz="4"/>
+              <w:bottom w:val="single" w:color="BFC8D4" w:sz="4"/>
+              <w:right w:val="single" w:color="BFC8D4" w:sz="4"/>
+            </w:tcBorders>
+            <w:tcMar>
+              <w:top w:type="dxa" w:w="60"/>
+              <w:left w:type="dxa" w:w="100"/>
+              <w:bottom w:type="dxa" w:w="60"/>
+              <w:right w:type="dxa" w:w="100"/>
+            </w:tcMar>
+          </w:tcPr>
+          <w:p>
+            <w:r>
+              <w:rPr>
+                <w:rFonts w:ascii="Calibri" w:cs="Calibri" w:eastAsia="Calibri" w:hAnsi="Calibri"/>
+              </w:rPr>
+              <w:t xml:space="preserve">Como </w:t>
+            </w:r>
+            <w:r>
+              <w:rPr>
+                <w:rFonts w:ascii="Consolas" w:cs="Consolas" w:eastAsia="Consolas" w:hAnsi="Consolas"/>
+                <w:color w:val="7A1F1F"/>
+                <w:sz w:val="20"/>
+                <w:szCs w:val="20"/>
+              </w:rPr>
+              <w:t xml:space="preserve">admin</w:t>
+            </w:r>
+            <w:r>
+              <w:rPr>
+                <w:rFonts w:ascii="Calibri" w:cs="Calibri" w:eastAsia="Calibri" w:hAnsi="Calibri"/>
+              </w:rPr>
+              <w:t xml:space="preserve"> deje </w:t>
+            </w:r>
+            <w:r>
+              <w:rPr>
+                <w:rFonts w:ascii="Consolas" w:cs="Consolas" w:eastAsia="Consolas" w:hAnsi="Consolas"/>
+                <w:color w:val="7A1F1F"/>
+                <w:sz w:val="20"/>
+                <w:szCs w:val="20"/>
+              </w:rPr>
+              <w:t xml:space="preserve">mae_nombre</w:t>
+            </w:r>
+            <w:r>
+              <w:rPr>
+                <w:rFonts w:ascii="Calibri" w:cs="Calibri" w:eastAsia="Calibri" w:hAnsi="Calibri"/>
+              </w:rPr>
+              <w:t xml:space="preserve"> vacío y, como </w:t>
+            </w:r>
+            <w:r>
+              <w:rPr>
+                <w:rFonts w:ascii="Consolas" w:cs="Consolas" w:eastAsia="Consolas" w:hAnsi="Consolas"/>
+                <w:color w:val="7A1F1F"/>
+                <w:sz w:val="20"/>
+                <w:szCs w:val="20"/>
+              </w:rPr>
+              <w:t xml:space="preserve">solicitante</w:t>
+            </w:r>
+            <w:r>
+              <w:rPr>
+                <w:rFonts w:ascii="Calibri" w:cs="Calibri" w:eastAsia="Calibri" w:hAnsi="Calibri"/>
+              </w:rPr>
+              <w:t xml:space="preserve">, envíe una solicitud de más de Bs 20.000</w:t>
+            </w:r>
+          </w:p>
+        </w:tc>
+        <w:tc>
+          <w:tcPr>
+            <w:tcW w:type="dxa" w:w="2960"/>
+            <w:tcBorders>
+              <w:top w:val="single" w:color="BFC8D4" w:sz="4"/>
+              <w:left w:val="single" w:color="BFC8D4" w:sz="4"/>
+              <w:bottom w:val="single" w:color="BFC8D4" w:sz="4"/>
+              <w:right w:val="single" w:color="BFC8D4" w:sz="4"/>
+            </w:tcBorders>
+            <w:tcMar>
+              <w:top w:type="dxa" w:w="60"/>
+              <w:left w:type="dxa" w:w="100"/>
+              <w:bottom w:type="dxa" w:w="60"/>
+              <w:right w:type="dxa" w:w="100"/>
+            </w:tcMar>
+          </w:tcPr>
+          <w:p>
+            <w:r>
+              <w:rPr>
+                <w:rFonts w:ascii="Calibri" w:cs="Calibri" w:eastAsia="Calibri" w:hAnsi="Calibri"/>
+              </w:rPr>
+              <w:t xml:space="preserve">Error: «Registre … la Máxima Autoridad Ejecutiva»</w:t>
+            </w:r>
+          </w:p>
+        </w:tc>
+      </w:tr>
+      <w:tr>
+        <w:trPr>
+          <w:cantSplit/>
+        </w:trPr>
+        <w:tc>
+          <w:tcPr>
+            <w:tcW w:type="dxa" w:w="2200"/>
+            <w:tcBorders>
+              <w:top w:val="single" w:color="BFC8D4" w:sz="4"/>
+              <w:left w:val="single" w:color="BFC8D4" w:sz="4"/>
+              <w:bottom w:val="single" w:color="BFC8D4" w:sz="4"/>
+              <w:right w:val="single" w:color="BFC8D4" w:sz="4"/>
+            </w:tcBorders>
+            <w:tcMar>
+              <w:top w:type="dxa" w:w="60"/>
+              <w:left w:type="dxa" w:w="100"/>
+              <w:bottom w:type="dxa" w:w="60"/>
+              <w:right w:type="dxa" w:w="100"/>
+            </w:tcMar>
+          </w:tcPr>
+          <w:p>
+            <w:r>
+              <w:rPr>
+                <w:rFonts w:ascii="Calibri" w:cs="Calibri" w:eastAsia="Calibri" w:hAnsi="Calibri"/>
+              </w:rPr>
+              <w:t xml:space="preserve">Compra de hasta Bs 20.000</w:t>
+            </w:r>
+          </w:p>
+        </w:tc>
+        <w:tc>
+          <w:tcPr>
+            <w:tcW w:type="dxa" w:w="4200"/>
+            <w:tcBorders>
+              <w:top w:val="single" w:color="BFC8D4" w:sz="4"/>
+              <w:left w:val="single" w:color="BFC8D4" w:sz="4"/>
+              <w:bottom w:val="single" w:color="BFC8D4" w:sz="4"/>
+              <w:right w:val="single" w:color="BFC8D4" w:sz="4"/>
+            </w:tcBorders>
+            <w:tcMar>
+              <w:top w:type="dxa" w:w="60"/>
+              <w:left w:type="dxa" w:w="100"/>
+              <w:bottom w:type="dxa" w:w="60"/>
+              <w:right w:type="dxa" w:w="100"/>
+            </w:tcMar>
+          </w:tcPr>
+          <w:p>
+            <w:r>
+              <w:rPr>
+                <w:rFonts w:ascii="Calibri" w:cs="Calibri" w:eastAsia="Calibri" w:hAnsi="Calibri"/>
+              </w:rPr>
+              <w:t xml:space="preserve">Envíe una solicitud de Bs 18.500</w:t>
+            </w:r>
+          </w:p>
+        </w:tc>
+        <w:tc>
+          <w:tcPr>
+            <w:tcW w:type="dxa" w:w="2960"/>
+            <w:tcBorders>
+              <w:top w:val="single" w:color="BFC8D4" w:sz="4"/>
+              <w:left w:val="single" w:color="BFC8D4" w:sz="4"/>
+              <w:bottom w:val="single" w:color="BFC8D4" w:sz="4"/>
+              <w:right w:val="single" w:color="BFC8D4" w:sz="4"/>
+            </w:tcBorders>
+            <w:tcMar>
+              <w:top w:type="dxa" w:w="60"/>
+              <w:left w:type="dxa" w:w="100"/>
+              <w:bottom w:type="dxa" w:w="60"/>
+              <w:right w:type="dxa" w:w="100"/>
+            </w:tcMar>
+          </w:tcPr>
+          <w:p>
+            <w:r>
+              <w:rPr>
+                <w:rFonts w:ascii="Calibri" w:cs="Calibri" w:eastAsia="Calibri" w:hAnsi="Calibri"/>
+              </w:rPr>
+              <w:t xml:space="preserve">No se genera nota PAC</w:t>
+            </w:r>
+          </w:p>
+        </w:tc>
+      </w:tr>
+      <w:tr>
+        <w:trPr>
+          <w:cantSplit/>
+        </w:trPr>
+        <w:tc>
+          <w:tcPr>
+            <w:tcW w:type="dxa" w:w="2200"/>
+            <w:tcBorders>
+              <w:top w:val="single" w:color="BFC8D4" w:sz="4"/>
+              <w:left w:val="single" w:color="BFC8D4" w:sz="4"/>
+              <w:bottom w:val="single" w:color="BFC8D4" w:sz="4"/>
+              <w:right w:val="single" w:color="BFC8D4" w:sz="4"/>
+            </w:tcBorders>
+            <w:tcMar>
+              <w:top w:type="dxa" w:w="60"/>
+              <w:left w:type="dxa" w:w="100"/>
+              <w:bottom w:type="dxa" w:w="60"/>
+              <w:right w:type="dxa" w:w="100"/>
+            </w:tcMar>
+          </w:tcPr>
+          <w:p>
+            <w:r>
+              <w:rPr>
+                <w:rFonts w:ascii="Calibri" w:cs="Calibri" w:eastAsia="Calibri" w:hAnsi="Calibri"/>
+              </w:rPr>
+              <w:t xml:space="preserve">Permisos</w:t>
+            </w:r>
+          </w:p>
+        </w:tc>
+        <w:tc>
+          <w:tcPr>
+            <w:tcW w:type="dxa" w:w="4200"/>
+            <w:tcBorders>
+              <w:top w:val="single" w:color="BFC8D4" w:sz="4"/>
+              <w:left w:val="single" w:color="BFC8D4" w:sz="4"/>
+              <w:bottom w:val="single" w:color="BFC8D4" w:sz="4"/>
+              <w:right w:val="single" w:color="BFC8D4" w:sz="4"/>
+            </w:tcBorders>
+            <w:tcMar>
+              <w:top w:type="dxa" w:w="60"/>
+              <w:left w:type="dxa" w:w="100"/>
+              <w:bottom w:type="dxa" w:w="60"/>
+              <w:right w:type="dxa" w:w="100"/>
+            </w:tcMar>
+          </w:tcPr>
+          <w:p>
+            <w:r>
+              <w:rPr>
+                <w:rFonts w:ascii="Calibri" w:cs="Calibri" w:eastAsia="Calibri" w:hAnsi="Calibri"/>
+              </w:rPr>
+              <w:t xml:space="preserve">Como </w:t>
+            </w:r>
+            <w:r>
+              <w:rPr>
+                <w:rFonts w:ascii="Consolas" w:cs="Consolas" w:eastAsia="Consolas" w:hAnsi="Consolas"/>
+                <w:color w:val="7A1F1F"/>
+                <w:sz w:val="20"/>
+                <w:szCs w:val="20"/>
+              </w:rPr>
+              <w:t xml:space="preserve">solicitante</w:t>
+            </w:r>
+            <w:r>
+              <w:rPr>
+                <w:rFonts w:ascii="Calibri" w:cs="Calibri" w:eastAsia="Calibri" w:hAnsi="Calibri"/>
+              </w:rPr>
+              <w:t xml:space="preserve">, abra el menú: no aparece «Objetivos POA»</w:t>
+            </w:r>
+          </w:p>
+        </w:tc>
+        <w:tc>
+          <w:tcPr>
+            <w:tcW w:type="dxa" w:w="2960"/>
+            <w:tcBorders>
+              <w:top w:val="single" w:color="BFC8D4" w:sz="4"/>
+              <w:left w:val="single" w:color="BFC8D4" w:sz="4"/>
+              <w:bottom w:val="single" w:color="BFC8D4" w:sz="4"/>
+              <w:right w:val="single" w:color="BFC8D4" w:sz="4"/>
+            </w:tcBorders>
+            <w:tcMar>
+              <w:top w:type="dxa" w:w="60"/>
+              <w:left w:type="dxa" w:w="100"/>
+              <w:bottom w:type="dxa" w:w="60"/>
+              <w:right w:type="dxa" w:w="100"/>
+            </w:tcMar>
+          </w:tcPr>
+          <w:p>
+            <w:r>
+              <w:rPr>
+                <w:rFonts w:ascii="Calibri" w:cs="Calibri" w:eastAsia="Calibri" w:hAnsi="Calibri"/>
+              </w:rPr>
+              <w:t xml:space="preserve">Solo Presupuesto y Administrador lo ven</w:t>
+            </w:r>
+          </w:p>
+        </w:tc>
+      </w:tr>
+    </w:tbl>
+    <w:p>
+      <w:pPr>
+        <w:spacing w:after="160"/>
+      </w:pPr>
     </w:p>
     <w:p>
       <w:pPr>
@@ -16531,6 +20692,54 @@
       </w:pPr>
     </w:lvl>
   </w:abstractNum>
+  <w:abstractNum w:abstractNumId="7" w15:restartNumberingAfterBreak="0">
+    <w:multiLevelType w:val="hybridMultilevel"/>
+    <w:lvl w:ilvl="0" w15:tentative="1">
+      <w:start w:val="1"/>
+      <w:numFmt w:val="decimal"/>
+      <w:lvlText w:val="%1."/>
+      <w:lvlJc w:val="left"/>
+      <w:pPr>
+        <w:ind w:left="540" w:hanging="360"/>
+      </w:pPr>
+    </w:lvl>
+  </w:abstractNum>
+  <w:abstractNum w:abstractNumId="8" w15:restartNumberingAfterBreak="0">
+    <w:multiLevelType w:val="hybridMultilevel"/>
+    <w:lvl w:ilvl="0" w15:tentative="1">
+      <w:start w:val="1"/>
+      <w:numFmt w:val="decimal"/>
+      <w:lvlText w:val="%1."/>
+      <w:lvlJc w:val="left"/>
+      <w:pPr>
+        <w:ind w:left="540" w:hanging="360"/>
+      </w:pPr>
+    </w:lvl>
+  </w:abstractNum>
+  <w:abstractNum w:abstractNumId="9" w15:restartNumberingAfterBreak="0">
+    <w:multiLevelType w:val="hybridMultilevel"/>
+    <w:lvl w:ilvl="0" w15:tentative="1">
+      <w:start w:val="1"/>
+      <w:numFmt w:val="decimal"/>
+      <w:lvlText w:val="%1."/>
+      <w:lvlJc w:val="left"/>
+      <w:pPr>
+        <w:ind w:left="540" w:hanging="360"/>
+      </w:pPr>
+    </w:lvl>
+  </w:abstractNum>
+  <w:abstractNum w:abstractNumId="10" w15:restartNumberingAfterBreak="0">
+    <w:multiLevelType w:val="hybridMultilevel"/>
+    <w:lvl w:ilvl="0" w15:tentative="1">
+      <w:start w:val="1"/>
+      <w:numFmt w:val="decimal"/>
+      <w:lvlText w:val="%1."/>
+      <w:lvlJc w:val="left"/>
+      <w:pPr>
+        <w:ind w:left="540" w:hanging="360"/>
+      </w:pPr>
+    </w:lvl>
+  </w:abstractNum>
   <w:num w:numId="1">
     <w:abstractNumId w:val="1"/>
     <w:lvlOverride w:ilvl="0">
@@ -16563,6 +20772,30 @@
   </w:num>
   <w:num w:numId="6">
     <w:abstractNumId w:val="6"/>
+    <w:lvlOverride w:ilvl="0">
+      <w:startOverride w:val="1"/>
+    </w:lvlOverride>
+  </w:num>
+  <w:num w:numId="7">
+    <w:abstractNumId w:val="7"/>
+    <w:lvlOverride w:ilvl="0">
+      <w:startOverride w:val="1"/>
+    </w:lvlOverride>
+  </w:num>
+  <w:num w:numId="8">
+    <w:abstractNumId w:val="8"/>
+    <w:lvlOverride w:ilvl="0">
+      <w:startOverride w:val="1"/>
+    </w:lvlOverride>
+  </w:num>
+  <w:num w:numId="9">
+    <w:abstractNumId w:val="9"/>
+    <w:lvlOverride w:ilvl="0">
+      <w:startOverride w:val="1"/>
+    </w:lvlOverride>
+  </w:num>
+  <w:num w:numId="10">
+    <w:abstractNumId w:val="10"/>
     <w:lvlOverride w:ilvl="0">
       <w:startOverride w:val="1"/>
     </w:lvlOverride>

</xml_diff>